<commit_message>
start to prepare interview content
</commit_message>
<xml_diff>
--- a/interview/招聘调研报告/ChatGPT专题培训内容.docx
+++ b/interview/招聘调研报告/ChatGPT专题培训内容.docx
@@ -63,7 +63,6 @@
           <w:numId w:val="1"/>
         </w:numPr>
         <w:rPr>
-          <w:rFonts w:hint="eastAsia"/>
           <w:strike/>
         </w:rPr>
       </w:pPr>
@@ -468,11 +467,6 @@
       </w:r>
     </w:p>
     <w:p>
-      <w:pPr>
-        <w:rPr>
-          <w:rFonts w:hint="eastAsia"/>
-        </w:rPr>
-      </w:pPr>
       <w:r>
         <w:rPr>
           <w:rFonts w:hint="eastAsia"/>
@@ -492,11 +486,6 @@
       </w:r>
     </w:p>
     <w:p>
-      <w:pPr>
-        <w:rPr>
-          <w:rFonts w:hint="eastAsia"/>
-        </w:rPr>
-      </w:pPr>
       <w:r>
         <w:rPr>
           <w:rFonts w:hint="eastAsia"/>
@@ -516,11 +505,6 @@
       </w:r>
     </w:p>
     <w:p>
-      <w:pPr>
-        <w:rPr>
-          <w:rFonts w:hint="eastAsia"/>
-        </w:rPr>
-      </w:pPr>
       <w:r>
         <w:rPr>
           <w:rFonts w:hint="eastAsia"/>
@@ -540,11 +524,6 @@
       </w:r>
     </w:p>
     <w:p>
-      <w:pPr>
-        <w:rPr>
-          <w:rFonts w:hint="eastAsia"/>
-        </w:rPr>
-      </w:pPr>
       <w:r>
         <w:rPr>
           <w:rFonts w:hint="eastAsia"/>
@@ -564,11 +543,6 @@
       </w:r>
     </w:p>
     <w:p>
-      <w:pPr>
-        <w:rPr>
-          <w:rFonts w:hint="eastAsia"/>
-        </w:rPr>
-      </w:pPr>
       <w:r>
         <w:rPr>
           <w:rFonts w:hint="eastAsia"/>
@@ -588,11 +562,6 @@
       </w:r>
     </w:p>
     <w:p>
-      <w:pPr>
-        <w:rPr>
-          <w:rFonts w:hint="eastAsia"/>
-        </w:rPr>
-      </w:pPr>
       <w:r>
         <w:rPr>
           <w:rFonts w:hint="eastAsia"/>
@@ -612,11 +581,6 @@
       </w:r>
     </w:p>
     <w:p>
-      <w:pPr>
-        <w:rPr>
-          <w:rFonts w:hint="eastAsia"/>
-        </w:rPr>
-      </w:pPr>
       <w:r>
         <w:rPr>
           <w:rFonts w:hint="eastAsia"/>
@@ -638,11 +602,6 @@
     <w:p/>
     <w:p/>
     <w:p>
-      <w:pPr>
-        <w:rPr>
-          <w:rFonts w:hint="eastAsia"/>
-        </w:rPr>
-      </w:pPr>
       <w:r>
         <w:rPr>
           <w:rFonts w:hint="eastAsia"/>
@@ -826,7 +785,6 @@
           <w:numId w:val="2"/>
         </w:numPr>
         <w:rPr>
-          <w:rFonts w:hint="eastAsia"/>
           <w:highlight w:val="yellow"/>
         </w:rPr>
       </w:pPr>
@@ -1137,9 +1095,6 @@
       <w:pPr>
         <w:pStyle w:val="ListParagraph"/>
         <w:ind w:left="1080" w:firstLine="360"/>
-        <w:rPr>
-          <w:rFonts w:hint="eastAsia"/>
-        </w:rPr>
       </w:pPr>
       <w:r>
         <w:rPr>
@@ -1572,6 +1527,9 @@
           <w:ilvl w:val="0"/>
           <w:numId w:val="3"/>
         </w:numPr>
+        <w:rPr>
+          <w:strike/>
+        </w:rPr>
       </w:pPr>
       <w:r>
         <w:rPr>
@@ -1665,41 +1623,72 @@
         <w:rPr>
           <w:rFonts w:hint="eastAsia"/>
         </w:rPr>
+        <w:t>动态调用某个</w:t>
+      </w:r>
+      <w:r>
+        <w:rPr>
+          <w:rFonts w:hint="eastAsia"/>
+        </w:rPr>
+        <w:t>Node</w:t>
+      </w:r>
+      <w:r>
+        <w:rPr>
+          <w:rFonts w:hint="eastAsia"/>
+        </w:rPr>
+        <w:t>，并为每个执行实例提供自定义输入</w:t>
+      </w:r>
+      <w:r>
+        <w:rPr>
+          <w:rFonts w:hint="eastAsia"/>
+        </w:rPr>
+        <w:t xml:space="preserve"> </w:t>
+      </w:r>
+      <w:r>
+        <w:rPr>
+          <w:rFonts w:hint="eastAsia"/>
+          <w:strike/>
+        </w:rPr>
         <w:t>可以是</w:t>
       </w:r>
       <w:r>
         <w:rPr>
           <w:rFonts w:hint="eastAsia"/>
+          <w:strike/>
         </w:rPr>
         <w:t>N</w:t>
       </w:r>
       <w:r>
         <w:rPr>
           <w:rFonts w:hint="eastAsia"/>
+          <w:strike/>
         </w:rPr>
         <w:t>个</w:t>
       </w:r>
       <w:r>
         <w:rPr>
           <w:rFonts w:hint="eastAsia"/>
+          <w:strike/>
         </w:rPr>
         <w:t>Node</w:t>
       </w:r>
       <w:r>
         <w:rPr>
           <w:rFonts w:hint="eastAsia"/>
+          <w:strike/>
         </w:rPr>
         <w:t>以及</w:t>
       </w:r>
       <w:r>
         <w:rPr>
           <w:rFonts w:hint="eastAsia"/>
+          <w:strike/>
         </w:rPr>
         <w:t>N</w:t>
       </w:r>
       <w:r>
         <w:rPr>
           <w:rFonts w:hint="eastAsia"/>
+          <w:strike/>
         </w:rPr>
         <w:t>条边</w:t>
       </w:r>
@@ -1711,9 +1700,6 @@
           <w:ilvl w:val="0"/>
           <w:numId w:val="3"/>
         </w:numPr>
-        <w:rPr>
-          <w:rFonts w:hint="eastAsia"/>
-        </w:rPr>
       </w:pPr>
       <w:r>
         <w:rPr>
@@ -1827,7 +1813,55 @@
         <w:rPr>
           <w:rFonts w:hint="eastAsia"/>
         </w:rPr>
-        <w:t>Fan-out; LLM-&gt;Reducer</w:t>
+        <w:t xml:space="preserve">Fan-out; </w:t>
+      </w:r>
+      <w:r>
+        <w:rPr>
+          <w:rFonts w:hint="eastAsia"/>
+        </w:rPr>
+        <w:t>A</w:t>
+      </w:r>
+      <w:r>
+        <w:rPr>
+          <w:rFonts w:hint="eastAsia"/>
+        </w:rPr>
+        <w:t>、</w:t>
+      </w:r>
+      <w:r>
+        <w:rPr>
+          <w:rFonts w:hint="eastAsia"/>
+        </w:rPr>
+        <w:t>B</w:t>
+      </w:r>
+      <w:r>
+        <w:rPr>
+          <w:rFonts w:hint="eastAsia"/>
+        </w:rPr>
+        <w:t>、</w:t>
+      </w:r>
+      <w:r>
+        <w:rPr>
+          <w:rFonts w:hint="eastAsia"/>
+        </w:rPr>
+        <w:t>C</w:t>
+      </w:r>
+      <w:r>
+        <w:rPr>
+          <w:rFonts w:hint="eastAsia"/>
+        </w:rPr>
+        <w:t>的</w:t>
+      </w:r>
+      <w:r>
+        <w:rPr>
+          <w:rFonts w:hint="eastAsia"/>
+        </w:rPr>
+        <w:t>Result</w:t>
+      </w:r>
+      <w:r>
+        <w:rPr>
+          <w:rFonts w:hint="eastAsia"/>
+        </w:rPr>
+        <w:t>-&gt;Reducer</w:t>
       </w:r>
       <w:r>
         <w:rPr>
@@ -1857,31 +1891,2437 @@
         <w:rPr>
           <w:rFonts w:hint="eastAsia"/>
         </w:rPr>
+        <w:t>负责合并数据</w:t>
+      </w:r>
+      <w:r>
+        <w:rPr>
+          <w:rFonts w:hint="eastAsia"/>
+        </w:rPr>
+        <w:t xml:space="preserve"> </w:t>
+      </w:r>
+      <w:r>
+        <w:rPr>
+          <w:rFonts w:hint="eastAsia"/>
+          <w:strike/>
+        </w:rPr>
         <w:t>实现把控制权收回到</w:t>
       </w:r>
       <w:r>
         <w:rPr>
           <w:rFonts w:hint="eastAsia"/>
+          <w:strike/>
         </w:rPr>
         <w:t>supervisor</w:t>
       </w:r>
       <w:r>
         <w:rPr>
           <w:rFonts w:hint="eastAsia"/>
+          <w:strike/>
         </w:rPr>
         <w:t>的问题</w:t>
       </w:r>
     </w:p>
-    <w:p>
-      <w:pPr>
-        <w:rPr>
-          <w:rFonts w:hint="eastAsia"/>
-        </w:rPr>
-      </w:pPr>
+    <w:p/>
+    <w:p/>
+    <w:p>
+      <w:r>
+        <w:rPr>
+          <w:rFonts w:hint="eastAsia"/>
+        </w:rPr>
+        <w:lastRenderedPageBreak/>
+        <w:t>第</w:t>
+      </w:r>
+      <w:r>
+        <w:rPr>
+          <w:rFonts w:hint="eastAsia"/>
+        </w:rPr>
+        <w:t>12</w:t>
+      </w:r>
+      <w:r>
+        <w:rPr>
+          <w:rFonts w:hint="eastAsia"/>
+        </w:rPr>
+        <w:t>课考试：</w:t>
+      </w:r>
+    </w:p>
+    <w:p>
+      <w:pPr>
+        <w:pStyle w:val="ListParagraph"/>
+        <w:numPr>
+          <w:ilvl w:val="0"/>
+          <w:numId w:val="5"/>
+        </w:numPr>
+      </w:pPr>
+      <w:r>
+        <w:rPr>
+          <w:rFonts w:hint="eastAsia"/>
+        </w:rPr>
+        <w:t>因为</w:t>
+      </w:r>
+      <w:r>
+        <w:rPr>
+          <w:rFonts w:hint="eastAsia"/>
+        </w:rPr>
+        <w:t>LLM</w:t>
+      </w:r>
+      <w:r>
+        <w:rPr>
+          <w:rFonts w:hint="eastAsia"/>
+        </w:rPr>
+        <w:t>可能需要多次调用工具来逐步收敛答案，只要</w:t>
+      </w:r>
+      <w:r>
+        <w:rPr>
+          <w:rFonts w:hint="eastAsia"/>
+        </w:rPr>
+        <w:t>args</w:t>
+      </w:r>
+      <w:r>
+        <w:rPr>
+          <w:rFonts w:hint="eastAsia"/>
+        </w:rPr>
+        <w:t>和</w:t>
+      </w:r>
+      <w:r>
+        <w:rPr>
+          <w:rFonts w:hint="eastAsia"/>
+        </w:rPr>
+        <w:t>toolmessage</w:t>
+      </w:r>
+      <w:r>
+        <w:rPr>
+          <w:rFonts w:hint="eastAsia"/>
+        </w:rPr>
+        <w:t>每次都是一样的，就可以认为是死循环</w:t>
+      </w:r>
+    </w:p>
+    <w:p>
+      <w:pPr>
+        <w:pStyle w:val="ListParagraph"/>
+        <w:numPr>
+          <w:ilvl w:val="0"/>
+          <w:numId w:val="5"/>
+        </w:numPr>
+      </w:pPr>
+      <w:r>
+        <w:rPr>
+          <w:rFonts w:hint="eastAsia"/>
+        </w:rPr>
+        <w:t>如果错误不涉及</w:t>
+      </w:r>
+      <w:r>
+        <w:rPr>
+          <w:rFonts w:hint="eastAsia"/>
+        </w:rPr>
+        <w:t>LLM</w:t>
+      </w:r>
+      <w:r>
+        <w:rPr>
+          <w:rFonts w:hint="eastAsia"/>
+        </w:rPr>
+        <w:t>重新决策，例如网络超时，</w:t>
+      </w:r>
+      <w:r>
+        <w:rPr>
+          <w:rFonts w:hint="eastAsia"/>
+        </w:rPr>
+        <w:t>llm</w:t>
+      </w:r>
+      <w:r>
+        <w:rPr>
+          <w:rFonts w:hint="eastAsia"/>
+        </w:rPr>
+        <w:t>返回内容不符合要的数据格式，可以用</w:t>
+      </w:r>
+      <w:r>
+        <w:rPr>
+          <w:rFonts w:hint="eastAsia"/>
+        </w:rPr>
+        <w:t>retry_policy</w:t>
+      </w:r>
+      <w:r>
+        <w:rPr>
+          <w:rFonts w:hint="eastAsia"/>
+        </w:rPr>
+        <w:t>；如果是</w:t>
+      </w:r>
+      <w:r>
+        <w:rPr>
+          <w:rFonts w:hint="eastAsia"/>
+        </w:rPr>
+        <w:t>tool</w:t>
+      </w:r>
+      <w:r>
+        <w:rPr>
+          <w:rFonts w:hint="eastAsia"/>
+        </w:rPr>
+        <w:t>的参数不正确，则应该让</w:t>
+      </w:r>
+      <w:r>
+        <w:rPr>
+          <w:rFonts w:hint="eastAsia"/>
+        </w:rPr>
+        <w:t>LLM</w:t>
+      </w:r>
+      <w:r>
+        <w:rPr>
+          <w:rFonts w:hint="eastAsia"/>
+        </w:rPr>
+        <w:t>介入，纠正参数</w:t>
+      </w:r>
+    </w:p>
+    <w:p>
+      <w:pPr>
+        <w:pStyle w:val="ListParagraph"/>
+        <w:numPr>
+          <w:ilvl w:val="0"/>
+          <w:numId w:val="5"/>
+        </w:numPr>
+      </w:pPr>
+      <w:r>
+        <w:t>A</w:t>
+      </w:r>
+      <w:r>
+        <w:rPr>
+          <w:rFonts w:hint="eastAsia"/>
+        </w:rPr>
+        <w:t>ction_signature = (tool_name, normalized_tool_args)</w:t>
+      </w:r>
+      <w:r>
+        <w:rPr>
+          <w:rFonts w:hint="eastAsia"/>
+        </w:rPr>
+        <w:t>增加</w:t>
+      </w:r>
+      <w:r>
+        <w:rPr>
+          <w:rFonts w:hint="eastAsia"/>
+        </w:rPr>
+        <w:t>tool_result</w:t>
+      </w:r>
+      <w:r>
+        <w:rPr>
+          <w:rFonts w:hint="eastAsia"/>
+        </w:rPr>
+        <w:t>，</w:t>
+      </w:r>
+      <w:r>
+        <w:rPr>
+          <w:rFonts w:hint="eastAsia"/>
+        </w:rPr>
+        <w:t>tool_args</w:t>
+      </w:r>
+      <w:r>
+        <w:rPr>
+          <w:rFonts w:hint="eastAsia"/>
+        </w:rPr>
+        <w:t>，</w:t>
+      </w:r>
+      <w:r>
+        <w:t>same_action_count</w:t>
+      </w:r>
+      <w:r>
+        <w:rPr>
+          <w:rFonts w:hint="eastAsia"/>
+          <w:strike/>
+        </w:rPr>
+        <w:t>duplicate_time</w:t>
+      </w:r>
+      <w:r>
+        <w:rPr>
+          <w:rFonts w:hint="eastAsia"/>
+        </w:rPr>
+        <w:t>来主动阻断，只要</w:t>
+      </w:r>
+      <w:r>
+        <w:rPr>
+          <w:rFonts w:hint="eastAsia"/>
+        </w:rPr>
+        <w:t>result</w:t>
+      </w:r>
+      <w:r>
+        <w:rPr>
+          <w:rFonts w:hint="eastAsia"/>
+        </w:rPr>
+        <w:t>和</w:t>
+      </w:r>
+      <w:r>
+        <w:rPr>
+          <w:rFonts w:hint="eastAsia"/>
+        </w:rPr>
+        <w:t>tool_args</w:t>
+      </w:r>
+      <w:r>
+        <w:rPr>
+          <w:rFonts w:hint="eastAsia"/>
+        </w:rPr>
+        <w:t>相同，并且达到指定重复调用次数，就主动阻断循环</w:t>
+      </w:r>
+    </w:p>
+    <w:p>
+      <w:pPr>
+        <w:pStyle w:val="ListParagraph"/>
+        <w:numPr>
+          <w:ilvl w:val="0"/>
+          <w:numId w:val="5"/>
+        </w:numPr>
+      </w:pPr>
+      <w:r>
+        <w:t>R</w:t>
+      </w:r>
+      <w:r>
+        <w:rPr>
+          <w:rFonts w:hint="eastAsia"/>
+        </w:rPr>
+        <w:t>etry_count</w:t>
+      </w:r>
+      <w:r>
+        <w:rPr>
+          <w:rFonts w:hint="eastAsia"/>
+        </w:rPr>
+        <w:t>更多用于错误重试，不涉及</w:t>
+      </w:r>
+      <w:r>
+        <w:rPr>
+          <w:rFonts w:hint="eastAsia"/>
+        </w:rPr>
+        <w:t>LLM</w:t>
+      </w:r>
+      <w:r>
+        <w:rPr>
+          <w:rFonts w:hint="eastAsia"/>
+        </w:rPr>
+        <w:t>重新生成</w:t>
+      </w:r>
+      <w:r>
+        <w:rPr>
+          <w:rFonts w:hint="eastAsia"/>
+        </w:rPr>
+        <w:t>Message</w:t>
+      </w:r>
+      <w:r>
+        <w:rPr>
+          <w:rFonts w:hint="eastAsia"/>
+        </w:rPr>
+        <w:t>；</w:t>
+      </w:r>
+      <w:r>
+        <w:rPr>
+          <w:rFonts w:hint="eastAsia"/>
+          <w:strike/>
+        </w:rPr>
+        <w:t>recursion_limit</w:t>
+      </w:r>
+      <w:r>
+        <w:rPr>
+          <w:rFonts w:hint="eastAsia"/>
+          <w:strike/>
+        </w:rPr>
+        <w:t>涉及</w:t>
+      </w:r>
+      <w:r>
+        <w:rPr>
+          <w:rFonts w:hint="eastAsia"/>
+          <w:strike/>
+        </w:rPr>
+        <w:t>Agent Loop</w:t>
+      </w:r>
+      <w:r>
+        <w:rPr>
+          <w:rFonts w:hint="eastAsia"/>
+          <w:strike/>
+        </w:rPr>
+        <w:t>调用次数，即</w:t>
+      </w:r>
+      <w:r>
+        <w:rPr>
+          <w:rFonts w:hint="eastAsia"/>
+          <w:strike/>
+        </w:rPr>
+        <w:t>LLM</w:t>
+      </w:r>
+      <w:r>
+        <w:rPr>
+          <w:rFonts w:hint="eastAsia"/>
+          <w:strike/>
+        </w:rPr>
+        <w:t>重新生成</w:t>
+      </w:r>
+      <w:r>
+        <w:rPr>
+          <w:rFonts w:hint="eastAsia"/>
+          <w:strike/>
+        </w:rPr>
+        <w:t>Message</w:t>
+      </w:r>
+      <w:r>
+        <w:rPr>
+          <w:rFonts w:hint="eastAsia"/>
+          <w:strike/>
+        </w:rPr>
+        <w:t>次数</w:t>
+      </w:r>
+      <w:r>
+        <w:rPr>
+          <w:rFonts w:hint="eastAsia"/>
+          <w:strike/>
+        </w:rPr>
+        <w:t xml:space="preserve">  </w:t>
+      </w:r>
+      <w:r>
+        <w:rPr>
+          <w:rFonts w:hint="eastAsia"/>
+        </w:rPr>
+        <w:t>recursion_limit</w:t>
+      </w:r>
+      <w:r>
+        <w:rPr>
+          <w:rFonts w:hint="eastAsia"/>
+        </w:rPr>
+        <w:t>限制</w:t>
+      </w:r>
+      <w:r>
+        <w:rPr>
+          <w:rFonts w:hint="eastAsia"/>
+        </w:rPr>
+        <w:t>Graph Run</w:t>
+      </w:r>
+      <w:r>
+        <w:rPr>
+          <w:rFonts w:hint="eastAsia"/>
+        </w:rPr>
+        <w:t>的最大</w:t>
+      </w:r>
+      <w:r>
+        <w:rPr>
+          <w:rFonts w:hint="eastAsia"/>
+        </w:rPr>
+        <w:t>step</w:t>
+      </w:r>
+      <w:r>
+        <w:rPr>
+          <w:rFonts w:hint="eastAsia"/>
+        </w:rPr>
+        <w:t>数</w:t>
+      </w:r>
+    </w:p>
+    <w:p>
+      <w:pPr>
+        <w:pStyle w:val="ListParagraph"/>
+        <w:numPr>
+          <w:ilvl w:val="0"/>
+          <w:numId w:val="5"/>
+        </w:numPr>
+      </w:pPr>
+      <w:r>
+        <w:rPr>
+          <w:rFonts w:hint="eastAsia"/>
+        </w:rPr>
+        <w:t>设置</w:t>
+      </w:r>
+      <w:r>
+        <w:rPr>
+          <w:rFonts w:hint="eastAsia"/>
+        </w:rPr>
+        <w:t>tool</w:t>
+      </w:r>
+      <w:r>
+        <w:rPr>
+          <w:rFonts w:hint="eastAsia"/>
+        </w:rPr>
+        <w:t>的</w:t>
+      </w:r>
+      <w:r>
+        <w:rPr>
+          <w:rFonts w:hint="eastAsia"/>
+        </w:rPr>
+        <w:t>timeout</w:t>
+      </w:r>
+      <w:r>
+        <w:rPr>
+          <w:rFonts w:hint="eastAsia"/>
+        </w:rPr>
+        <w:t>时间，如果超时还未返回就算调用失败</w:t>
+      </w:r>
+    </w:p>
+    <w:p>
+      <w:pPr>
+        <w:pStyle w:val="ListParagraph"/>
+        <w:numPr>
+          <w:ilvl w:val="0"/>
+          <w:numId w:val="5"/>
+        </w:numPr>
+      </w:pPr>
+      <w:r>
+        <w:rPr>
+          <w:rFonts w:hint="eastAsia"/>
+        </w:rPr>
+        <w:t>不一定；</w:t>
+      </w:r>
+      <w:r>
+        <w:rPr>
+          <w:rFonts w:hint="eastAsia"/>
+        </w:rPr>
+        <w:t>Tool Args+Tool Result+State Progress+Loop Count+Task Goal</w:t>
+      </w:r>
+      <w:r>
+        <w:rPr>
+          <w:rFonts w:hint="eastAsia"/>
+        </w:rPr>
+        <w:t>，</w:t>
+      </w:r>
+    </w:p>
+    <w:p>
+      <w:pPr>
+        <w:pStyle w:val="ListParagraph"/>
+        <w:numPr>
+          <w:ilvl w:val="0"/>
+          <w:numId w:val="5"/>
+        </w:numPr>
+      </w:pPr>
+      <w:r>
+        <w:rPr>
+          <w:rFonts w:hint="eastAsia"/>
+        </w:rPr>
+        <w:t>调用</w:t>
+      </w:r>
+      <w:r>
+        <w:rPr>
+          <w:rFonts w:hint="eastAsia"/>
+        </w:rPr>
+        <w:t>LLM</w:t>
+      </w:r>
+      <w:r>
+        <w:rPr>
+          <w:rFonts w:hint="eastAsia"/>
+        </w:rPr>
+        <w:t>我会用</w:t>
+      </w:r>
+      <w:r>
+        <w:rPr>
+          <w:rFonts w:hint="eastAsia"/>
+        </w:rPr>
+        <w:t>Retry</w:t>
+      </w:r>
+      <w:r>
+        <w:rPr>
+          <w:rFonts w:hint="eastAsia"/>
+        </w:rPr>
+        <w:t>来处理</w:t>
+      </w:r>
+      <w:r>
+        <w:rPr>
+          <w:rFonts w:hint="eastAsia"/>
+        </w:rPr>
+        <w:t>timeout</w:t>
+      </w:r>
+      <w:r>
+        <w:rPr>
+          <w:rFonts w:hint="eastAsia"/>
+        </w:rPr>
+        <w:t>；</w:t>
+      </w:r>
+      <w:r>
+        <w:rPr>
+          <w:rFonts w:hint="eastAsia"/>
+        </w:rPr>
+        <w:t>Loop</w:t>
+      </w:r>
+      <w:r>
+        <w:rPr>
+          <w:rFonts w:hint="eastAsia"/>
+        </w:rPr>
+        <w:t>上我会限制</w:t>
+      </w:r>
+      <w:r>
+        <w:rPr>
+          <w:rFonts w:hint="eastAsia"/>
+        </w:rPr>
+        <w:t>args</w:t>
+      </w:r>
+      <w:r>
+        <w:rPr>
+          <w:rFonts w:hint="eastAsia"/>
+        </w:rPr>
+        <w:t>和</w:t>
+      </w:r>
+      <w:r>
+        <w:rPr>
+          <w:rFonts w:hint="eastAsia"/>
+        </w:rPr>
+        <w:t>result</w:t>
+      </w:r>
+      <w:r>
+        <w:rPr>
+          <w:rFonts w:hint="eastAsia"/>
+        </w:rPr>
+        <w:t>重复次数；</w:t>
+      </w:r>
+      <w:r>
+        <w:rPr>
+          <w:rFonts w:hint="eastAsia"/>
+        </w:rPr>
+        <w:t>graph</w:t>
+      </w:r>
+      <w:r>
+        <w:rPr>
+          <w:rFonts w:hint="eastAsia"/>
+        </w:rPr>
+        <w:t>指定</w:t>
+      </w:r>
+      <w:r>
+        <w:rPr>
+          <w:rFonts w:hint="eastAsia"/>
+        </w:rPr>
+        <w:t>recursion_limit</w:t>
+      </w:r>
+      <w:r>
+        <w:rPr>
+          <w:rFonts w:hint="eastAsia"/>
+        </w:rPr>
+        <w:t>来限制循环；</w:t>
+      </w:r>
+      <w:r>
+        <w:rPr>
+          <w:rFonts w:hint="eastAsia"/>
+          <w:strike/>
+        </w:rPr>
+        <w:t>达到</w:t>
+      </w:r>
+      <w:r>
+        <w:rPr>
+          <w:rFonts w:hint="eastAsia"/>
+          <w:strike/>
+        </w:rPr>
+        <w:t>Retry</w:t>
+      </w:r>
+      <w:r>
+        <w:rPr>
+          <w:rFonts w:hint="eastAsia"/>
+          <w:strike/>
+        </w:rPr>
+        <w:t>次数上限不再交给</w:t>
+      </w:r>
+      <w:r>
+        <w:rPr>
+          <w:rFonts w:hint="eastAsia"/>
+          <w:strike/>
+        </w:rPr>
+        <w:t>LLM</w:t>
+      </w:r>
+      <w:r>
+        <w:rPr>
+          <w:rFonts w:hint="eastAsia"/>
+          <w:strike/>
+        </w:rPr>
+        <w:t>处理，采用人工介入</w:t>
+      </w:r>
+      <w:r>
+        <w:rPr>
+          <w:rFonts w:hint="eastAsia"/>
+          <w:strike/>
+        </w:rPr>
+        <w:t xml:space="preserve">   </w:t>
+      </w:r>
+    </w:p>
+    <w:p>
+      <w:pPr>
+        <w:pStyle w:val="ListParagraph"/>
+        <w:ind w:left="1080"/>
+      </w:pPr>
+      <w:r>
+        <w:rPr>
+          <w:rFonts w:hint="eastAsia"/>
+        </w:rPr>
+        <w:t>Network Timeout -&gt; Retry -&gt;</w:t>
+      </w:r>
+      <w:r>
+        <w:rPr>
+          <w:rFonts w:hint="eastAsia"/>
+        </w:rPr>
+        <w:t>仍失败</w:t>
+      </w:r>
+      <w:r>
+        <w:rPr>
+          <w:rFonts w:hint="eastAsia"/>
+        </w:rPr>
+        <w:t>-&gt;Fallback/Error/Human</w:t>
+      </w:r>
+    </w:p>
+    <w:p>
+      <w:pPr>
+        <w:pStyle w:val="ListParagraph"/>
+        <w:ind w:left="1080"/>
+      </w:pPr>
+      <w:r>
+        <w:rPr>
+          <w:rFonts w:hint="eastAsia"/>
+        </w:rPr>
+        <w:t>Tool</w:t>
+      </w:r>
+      <w:r>
+        <w:rPr>
+          <w:rFonts w:hint="eastAsia"/>
+        </w:rPr>
+        <w:t>参数错误</w:t>
+      </w:r>
+      <w:r>
+        <w:rPr>
+          <w:rFonts w:hint="eastAsia"/>
+        </w:rPr>
+        <w:t xml:space="preserve">-&gt; ToolMessage(error) -&gt; LLM -&gt; </w:t>
+      </w:r>
+      <w:r>
+        <w:rPr>
+          <w:rFonts w:hint="eastAsia"/>
+        </w:rPr>
+        <w:t>修正参数</w:t>
+      </w:r>
+    </w:p>
+    <w:p>
+      <w:pPr>
+        <w:pStyle w:val="ListParagraph"/>
+        <w:ind w:left="1080"/>
+      </w:pPr>
+    </w:p>
+    <w:p>
+      <w:r>
+        <w:rPr>
+          <w:rFonts w:hint="eastAsia"/>
+        </w:rPr>
+        <w:t>第十四课考试：</w:t>
+      </w:r>
+    </w:p>
+    <w:p>
       <w:r>
         <w:tab/>
       </w:r>
-    </w:p>
+      <w:r>
+        <w:rPr>
+          <w:rFonts w:hint="eastAsia"/>
+        </w:rPr>
+        <w:t>(1)</w:t>
+      </w:r>
+      <w:r>
+        <w:rPr>
+          <w:rFonts w:hint="eastAsia"/>
+        </w:rPr>
+        <w:t>我会设计成</w:t>
+      </w:r>
+      <w:r>
+        <w:rPr>
+          <w:rFonts w:hint="eastAsia"/>
+        </w:rPr>
+        <w:t>1</w:t>
+      </w:r>
+      <w:r>
+        <w:rPr>
+          <w:rFonts w:hint="eastAsia"/>
+        </w:rPr>
+        <w:t>，把</w:t>
+      </w:r>
+      <w:r>
+        <w:rPr>
+          <w:rFonts w:hint="eastAsia"/>
+        </w:rPr>
+        <w:t>api</w:t>
+      </w:r>
+      <w:r>
+        <w:rPr>
+          <w:rFonts w:hint="eastAsia"/>
+        </w:rPr>
+        <w:t>调用趋势交给</w:t>
+      </w:r>
+      <w:r>
+        <w:rPr>
+          <w:rFonts w:hint="eastAsia"/>
+        </w:rPr>
+        <w:t>api usage agent</w:t>
+      </w:r>
+      <w:r>
+        <w:rPr>
+          <w:rFonts w:hint="eastAsia"/>
+        </w:rPr>
+        <w:t>，与</w:t>
+      </w:r>
+      <w:r>
+        <w:rPr>
+          <w:rFonts w:hint="eastAsia"/>
+        </w:rPr>
+        <w:t>supervisor</w:t>
+      </w:r>
+      <w:r>
+        <w:rPr>
+          <w:rFonts w:hint="eastAsia"/>
+        </w:rPr>
+        <w:t>解耦，</w:t>
+      </w:r>
+      <w:r>
+        <w:rPr>
+          <w:rFonts w:hint="eastAsia"/>
+        </w:rPr>
+        <w:t>supervisor</w:t>
+      </w:r>
+      <w:r>
+        <w:rPr>
+          <w:rFonts w:hint="eastAsia"/>
+        </w:rPr>
+        <w:t>负责拆分任务和调度工具或者</w:t>
+      </w:r>
+      <w:r>
+        <w:rPr>
+          <w:rFonts w:hint="eastAsia"/>
+        </w:rPr>
+        <w:t>sub-agent</w:t>
+      </w:r>
+      <w:r>
+        <w:rPr>
+          <w:rFonts w:hint="eastAsia"/>
+        </w:rPr>
+        <w:t>；如果只是通过</w:t>
+      </w:r>
+      <w:r>
+        <w:rPr>
+          <w:rFonts w:hint="eastAsia"/>
+        </w:rPr>
+        <w:t>sql tool</w:t>
+      </w:r>
+      <w:r>
+        <w:rPr>
+          <w:rFonts w:hint="eastAsia"/>
+        </w:rPr>
+        <w:t>获取</w:t>
+      </w:r>
+      <w:r>
+        <w:rPr>
+          <w:rFonts w:hint="eastAsia"/>
+        </w:rPr>
+        <w:t xml:space="preserve">api </w:t>
+      </w:r>
+      <w:r>
+        <w:rPr>
+          <w:rFonts w:hint="eastAsia"/>
+        </w:rPr>
+        <w:t>使用记录，</w:t>
+      </w:r>
+      <w:r>
+        <w:rPr>
+          <w:rFonts w:hint="eastAsia"/>
+        </w:rPr>
+        <w:t>supervisor</w:t>
+      </w:r>
+      <w:r>
+        <w:rPr>
+          <w:rFonts w:hint="eastAsia"/>
+        </w:rPr>
+        <w:t>负责分析使用趋势，选择后者</w:t>
+      </w:r>
+    </w:p>
+    <w:p>
+      <w:r>
+        <w:tab/>
+      </w:r>
+      <w:r>
+        <w:rPr>
+          <w:rFonts w:hint="eastAsia"/>
+        </w:rPr>
+        <w:t>(2)</w:t>
+      </w:r>
+      <w:r>
+        <w:rPr>
+          <w:rFonts w:hint="eastAsia"/>
+        </w:rPr>
+        <w:t>因为</w:t>
+      </w:r>
+      <w:r>
+        <w:rPr>
+          <w:rFonts w:hint="eastAsia"/>
+        </w:rPr>
+        <w:t>API Usage Agent</w:t>
+      </w:r>
+      <w:r>
+        <w:rPr>
+          <w:rFonts w:hint="eastAsia"/>
+        </w:rPr>
+        <w:t>中带</w:t>
+      </w:r>
+      <w:r>
+        <w:rPr>
+          <w:rFonts w:hint="eastAsia"/>
+        </w:rPr>
+        <w:t>ReAct</w:t>
+      </w:r>
+      <w:r>
+        <w:rPr>
+          <w:rFonts w:hint="eastAsia"/>
+        </w:rPr>
+        <w:t>循环，用户的问题可以完全交给</w:t>
+      </w:r>
+      <w:r>
+        <w:rPr>
+          <w:rFonts w:hint="eastAsia"/>
+        </w:rPr>
+        <w:t>SubGraph</w:t>
+      </w:r>
+      <w:r>
+        <w:rPr>
+          <w:rFonts w:hint="eastAsia"/>
+        </w:rPr>
+        <w:t>或者</w:t>
+      </w:r>
+      <w:r>
+        <w:rPr>
+          <w:rFonts w:hint="eastAsia"/>
+        </w:rPr>
+        <w:t>Agent</w:t>
+      </w:r>
+    </w:p>
+    <w:p>
+      <w:r>
+        <w:tab/>
+      </w:r>
+      <w:r>
+        <w:rPr>
+          <w:rFonts w:hint="eastAsia"/>
+        </w:rPr>
+        <w:t>(3)</w:t>
+      </w:r>
+      <w:r>
+        <w:rPr>
+          <w:rFonts w:hint="eastAsia"/>
+        </w:rPr>
+        <w:t>会导致</w:t>
+      </w:r>
+      <w:r>
+        <w:rPr>
+          <w:rFonts w:hint="eastAsia"/>
+        </w:rPr>
+        <w:t>Supervisor</w:t>
+      </w:r>
+      <w:r>
+        <w:rPr>
+          <w:rFonts w:hint="eastAsia"/>
+        </w:rPr>
+        <w:t>看到过多信息导致决策困难</w:t>
+      </w:r>
+    </w:p>
+    <w:p>
+      <w:r>
+        <w:tab/>
+      </w:r>
+      <w:r>
+        <w:rPr>
+          <w:rFonts w:hint="eastAsia"/>
+        </w:rPr>
+        <w:t xml:space="preserve">(4)State: </w:t>
+      </w:r>
+      <w:r>
+        <w:rPr>
+          <w:rFonts w:hint="eastAsia"/>
+        </w:rPr>
+        <w:t xml:space="preserve">uesr_query, messages, api_result </w:t>
+      </w:r>
+      <w:r>
+        <w:rPr>
+          <w:rFonts w:hint="eastAsia"/>
+        </w:rPr>
+        <w:t>Context:</w:t>
+      </w:r>
+      <w:r>
+        <w:rPr>
+          <w:rFonts w:hint="eastAsia"/>
+        </w:rPr>
+        <w:t xml:space="preserve"> tenant_id, user_id, session_id</w:t>
+      </w:r>
+      <w:r>
+        <w:rPr>
+          <w:rFonts w:hint="eastAsia"/>
+        </w:rPr>
+        <w:t xml:space="preserve"> Tool Args:</w:t>
+      </w:r>
+      <w:r>
+        <w:rPr>
+          <w:rFonts w:hint="eastAsia"/>
+        </w:rPr>
+        <w:t>start_date, end_date</w:t>
+      </w:r>
+    </w:p>
+    <w:p>
+      <w:r>
+        <w:lastRenderedPageBreak/>
+        <w:tab/>
+      </w:r>
+      <w:r>
+        <w:rPr>
+          <w:rFonts w:hint="eastAsia"/>
+        </w:rPr>
+        <w:t>(5)</w:t>
+      </w:r>
+      <w:r>
+        <w:rPr>
+          <w:rFonts w:hint="eastAsia"/>
+          <w:strike/>
+        </w:rPr>
+        <w:t>Reducer</w:t>
+      </w:r>
+      <w:r>
+        <w:rPr>
+          <w:rFonts w:hint="eastAsia"/>
+          <w:strike/>
+        </w:rPr>
+        <w:t>负责保存各个</w:t>
+      </w:r>
+      <w:r>
+        <w:rPr>
+          <w:rFonts w:hint="eastAsia"/>
+          <w:strike/>
+        </w:rPr>
+        <w:t>agent</w:t>
+      </w:r>
+      <w:r>
+        <w:rPr>
+          <w:rFonts w:hint="eastAsia"/>
+          <w:strike/>
+        </w:rPr>
+        <w:t>返回的结果；我会选择方案</w:t>
+      </w:r>
+      <w:r>
+        <w:rPr>
+          <w:rFonts w:hint="eastAsia"/>
+          <w:strike/>
+        </w:rPr>
+        <w:t>C</w:t>
+      </w:r>
+      <w:r>
+        <w:rPr>
+          <w:rFonts w:hint="eastAsia"/>
+          <w:strike/>
+        </w:rPr>
+        <w:t>，因为能用一个</w:t>
+      </w:r>
+      <w:r>
+        <w:rPr>
+          <w:rFonts w:hint="eastAsia"/>
+          <w:strike/>
+        </w:rPr>
+        <w:t>results</w:t>
+      </w:r>
+      <w:r>
+        <w:rPr>
+          <w:rFonts w:hint="eastAsia"/>
+          <w:strike/>
+        </w:rPr>
+        <w:t>字段保存各个</w:t>
+      </w:r>
+      <w:r>
+        <w:rPr>
+          <w:rFonts w:hint="eastAsia"/>
+          <w:strike/>
+        </w:rPr>
+        <w:t>agent</w:t>
+      </w:r>
+      <w:r>
+        <w:rPr>
+          <w:rFonts w:hint="eastAsia"/>
+          <w:strike/>
+        </w:rPr>
+        <w:t>返回结果，更加简洁</w:t>
+      </w:r>
+      <w:r>
+        <w:rPr>
+          <w:rFonts w:hint="eastAsia"/>
+          <w:strike/>
+        </w:rPr>
+        <w:t xml:space="preserve"> </w:t>
+      </w:r>
+      <w:r>
+        <w:rPr>
+          <w:rFonts w:hint="eastAsia"/>
+        </w:rPr>
+        <w:t xml:space="preserve"> </w:t>
+      </w:r>
+      <w:r>
+        <w:rPr>
+          <w:rFonts w:hint="eastAsia"/>
+        </w:rPr>
+        <w:t>固定业务流程，倾向于使用清晰的独立字段；如果是动态数量的并行</w:t>
+      </w:r>
+      <w:r>
+        <w:rPr>
+          <w:rFonts w:hint="eastAsia"/>
+        </w:rPr>
+        <w:t>worker</w:t>
+      </w:r>
+      <w:r>
+        <w:rPr>
+          <w:rFonts w:hint="eastAsia"/>
+        </w:rPr>
+        <w:t>，使用统一的</w:t>
+      </w:r>
+      <w:r>
+        <w:rPr>
+          <w:rFonts w:hint="eastAsia"/>
+        </w:rPr>
+        <w:t>results</w:t>
+      </w:r>
+      <w:r>
+        <w:rPr>
+          <w:rFonts w:hint="eastAsia"/>
+        </w:rPr>
+        <w:t>列表会更加灵活</w:t>
+      </w:r>
+    </w:p>
+    <w:p>
+      <w:r>
+        <w:tab/>
+      </w:r>
+      <w:r>
+        <w:rPr>
+          <w:rFonts w:hint="eastAsia"/>
+        </w:rPr>
+        <w:t>(6)</w:t>
+      </w:r>
+      <w:r>
+        <w:rPr>
+          <w:rFonts w:hint="eastAsia"/>
+        </w:rPr>
+        <w:t>如果</w:t>
+      </w:r>
+      <w:r>
+        <w:rPr>
+          <w:rFonts w:hint="eastAsia"/>
+        </w:rPr>
+        <w:t>agent</w:t>
+      </w:r>
+      <w:r>
+        <w:rPr>
+          <w:rFonts w:hint="eastAsia"/>
+        </w:rPr>
+        <w:t>流程不需要回到</w:t>
+      </w:r>
+      <w:r>
+        <w:rPr>
+          <w:rFonts w:hint="eastAsia"/>
+        </w:rPr>
+        <w:t>supervisor</w:t>
+      </w:r>
+      <w:r>
+        <w:rPr>
+          <w:rFonts w:hint="eastAsia"/>
+        </w:rPr>
+        <w:t>，使用</w:t>
+      </w:r>
+      <w:r>
+        <w:rPr>
+          <w:rFonts w:hint="eastAsia"/>
+        </w:rPr>
+        <w:t>Handoff</w:t>
+      </w:r>
+      <w:r>
+        <w:rPr>
+          <w:rFonts w:hint="eastAsia"/>
+        </w:rPr>
+        <w:t>；如果需要处理的问题专业性很强，需要专门的</w:t>
+      </w:r>
+      <w:r>
+        <w:rPr>
+          <w:rFonts w:hint="eastAsia"/>
+        </w:rPr>
+        <w:t>agent</w:t>
+      </w:r>
+      <w:r>
+        <w:rPr>
+          <w:rFonts w:hint="eastAsia"/>
+        </w:rPr>
+        <w:t>，并且流程需要返回</w:t>
+      </w:r>
+      <w:r>
+        <w:rPr>
+          <w:rFonts w:hint="eastAsia"/>
+        </w:rPr>
+        <w:t>supervisor</w:t>
+      </w:r>
+      <w:r>
+        <w:rPr>
+          <w:rFonts w:hint="eastAsia"/>
+        </w:rPr>
+        <w:t>继续调用，我会选择</w:t>
+      </w:r>
+      <w:r>
+        <w:rPr>
+          <w:rFonts w:hint="eastAsia"/>
+        </w:rPr>
+        <w:t>subagent-as-tool</w:t>
+      </w:r>
+      <w:r>
+        <w:rPr>
+          <w:rFonts w:hint="eastAsia"/>
+        </w:rPr>
+        <w:t>，控制权返回到</w:t>
+      </w:r>
+      <w:r>
+        <w:rPr>
+          <w:rFonts w:hint="eastAsia"/>
+        </w:rPr>
+        <w:t>supervisor</w:t>
+      </w:r>
+    </w:p>
+    <w:p>
+      <w:pPr>
+        <w:rPr>
+          <w:rFonts w:hint="eastAsia"/>
+        </w:rPr>
+      </w:pPr>
+      <w:r>
+        <w:tab/>
+      </w:r>
+      <w:r>
+        <w:rPr>
+          <w:rFonts w:hint="eastAsia"/>
+        </w:rPr>
+        <w:t xml:space="preserve">SubAgent-as-Tool: </w:t>
+      </w:r>
+      <w:r>
+        <w:rPr>
+          <w:rFonts w:hint="eastAsia"/>
+        </w:rPr>
+        <w:t>主</w:t>
+      </w:r>
+      <w:r>
+        <w:rPr>
+          <w:rFonts w:hint="eastAsia"/>
+        </w:rPr>
+        <w:t>Agent</w:t>
+      </w:r>
+      <w:r>
+        <w:rPr>
+          <w:rFonts w:hint="eastAsia"/>
+        </w:rPr>
+        <w:t>始终负责总体编排</w:t>
+      </w:r>
+    </w:p>
+    <w:p>
+      <w:pPr>
+        <w:rPr>
+          <w:rFonts w:hint="eastAsia"/>
+        </w:rPr>
+      </w:pPr>
+      <w:r>
+        <w:tab/>
+      </w:r>
+      <w:r>
+        <w:rPr>
+          <w:rFonts w:hint="eastAsia"/>
+        </w:rPr>
+        <w:t xml:space="preserve">Handoff: </w:t>
+      </w:r>
+      <w:r>
+        <w:rPr>
+          <w:rFonts w:hint="eastAsia"/>
+        </w:rPr>
+        <w:t>当前任务的处理主体发生切换</w:t>
+      </w:r>
+    </w:p>
+    <w:p>
+      <w:r>
+        <w:tab/>
+      </w:r>
+      <w:r>
+        <w:rPr>
+          <w:rFonts w:hint="eastAsia"/>
+        </w:rPr>
+        <w:t>(7)</w:t>
+      </w:r>
+      <w:r>
+        <w:rPr>
+          <w:rFonts w:hint="eastAsia"/>
+        </w:rPr>
+        <w:t>有</w:t>
+      </w:r>
+      <w:r>
+        <w:rPr>
+          <w:rFonts w:hint="eastAsia"/>
+        </w:rPr>
+        <w:t>2</w:t>
+      </w:r>
+      <w:r>
+        <w:rPr>
+          <w:rFonts w:hint="eastAsia"/>
+        </w:rPr>
+        <w:t>层控制流，有</w:t>
+      </w:r>
+      <w:r>
+        <w:rPr>
+          <w:rFonts w:hint="eastAsia"/>
+        </w:rPr>
+        <w:t>4</w:t>
+      </w:r>
+      <w:r>
+        <w:rPr>
+          <w:rFonts w:hint="eastAsia"/>
+        </w:rPr>
+        <w:t>层</w:t>
+      </w:r>
+      <w:r>
+        <w:rPr>
+          <w:rFonts w:hint="eastAsia"/>
+        </w:rPr>
+        <w:t>Agent loop</w:t>
+      </w:r>
+      <w:r>
+        <w:rPr>
+          <w:rFonts w:hint="eastAsia"/>
+        </w:rPr>
+        <w:t>；</w:t>
+      </w:r>
+      <w:r>
+        <w:rPr>
+          <w:rFonts w:hint="eastAsia"/>
+        </w:rPr>
+        <w:t>send</w:t>
+      </w:r>
+      <w:r>
+        <w:rPr>
+          <w:rFonts w:hint="eastAsia"/>
+        </w:rPr>
+        <w:t>解决将不同任务内容发送给不同的</w:t>
+      </w:r>
+      <w:r>
+        <w:rPr>
+          <w:rFonts w:hint="eastAsia"/>
+        </w:rPr>
+        <w:t>agent</w:t>
+      </w:r>
+      <w:r>
+        <w:rPr>
+          <w:rFonts w:hint="eastAsia"/>
+        </w:rPr>
+        <w:t>；</w:t>
+      </w:r>
+      <w:r>
+        <w:rPr>
+          <w:rFonts w:hint="eastAsia"/>
+          <w:strike/>
+        </w:rPr>
+        <w:t>reducer</w:t>
+      </w:r>
+      <w:r>
+        <w:rPr>
+          <w:rFonts w:hint="eastAsia"/>
+          <w:strike/>
+        </w:rPr>
+        <w:t>解决控制权还给</w:t>
+      </w:r>
+      <w:r>
+        <w:rPr>
+          <w:rFonts w:hint="eastAsia"/>
+          <w:strike/>
+        </w:rPr>
+        <w:t>supervisor</w:t>
+      </w:r>
+      <w:r>
+        <w:rPr>
+          <w:rFonts w:hint="eastAsia"/>
+          <w:strike/>
+        </w:rPr>
+        <w:t>的问题；需要</w:t>
+      </w:r>
+      <w:r>
+        <w:rPr>
+          <w:rFonts w:hint="eastAsia"/>
+          <w:strike/>
+        </w:rPr>
+        <w:t>supervisor</w:t>
+      </w:r>
+      <w:r>
+        <w:rPr>
+          <w:rFonts w:hint="eastAsia"/>
+          <w:strike/>
+        </w:rPr>
+        <w:t>进行最终的答案汇总</w:t>
+      </w:r>
+    </w:p>
+    <w:p>
+      <w:r>
+        <w:tab/>
+      </w:r>
+      <w:r>
+        <w:rPr>
+          <w:rFonts w:hint="eastAsia"/>
+        </w:rPr>
+        <w:t>Send</w:t>
+      </w:r>
+      <w:r>
+        <w:rPr>
+          <w:rFonts w:hint="eastAsia"/>
+        </w:rPr>
+        <w:t>：动态创建</w:t>
+      </w:r>
+      <w:r>
+        <w:rPr>
+          <w:rFonts w:hint="eastAsia"/>
+        </w:rPr>
+        <w:t>Worker</w:t>
+      </w:r>
+      <w:r>
+        <w:rPr>
+          <w:rFonts w:hint="eastAsia"/>
+        </w:rPr>
+        <w:t>执行任务</w:t>
+      </w:r>
+    </w:p>
+    <w:p>
+      <w:pPr>
+        <w:rPr>
+          <w:rFonts w:hint="eastAsia"/>
+        </w:rPr>
+      </w:pPr>
+      <w:r>
+        <w:tab/>
+      </w:r>
+      <w:r>
+        <w:rPr>
+          <w:rFonts w:hint="eastAsia"/>
+        </w:rPr>
+        <w:t xml:space="preserve">Reducer: </w:t>
+      </w:r>
+      <w:r>
+        <w:rPr>
+          <w:rFonts w:hint="eastAsia"/>
+        </w:rPr>
+        <w:t>合并多个</w:t>
+      </w:r>
+      <w:r>
+        <w:rPr>
+          <w:rFonts w:hint="eastAsia"/>
+        </w:rPr>
+        <w:t>Worker</w:t>
+      </w:r>
+      <w:r>
+        <w:rPr>
+          <w:rFonts w:hint="eastAsia"/>
+        </w:rPr>
+        <w:t>的状态更新</w:t>
+      </w:r>
+    </w:p>
+    <w:p>
+      <w:pPr>
+        <w:ind w:left="720" w:hanging="720"/>
+      </w:pPr>
+      <w:r>
+        <w:tab/>
+      </w:r>
+      <w:r>
+        <w:rPr>
+          <w:rFonts w:hint="eastAsia"/>
+        </w:rPr>
+        <w:t>(8)</w:t>
+      </w:r>
+    </w:p>
+    <w:p>
+      <w:pPr>
+        <w:tabs>
+          <w:tab w:val="left" w:pos="916"/>
+          <w:tab w:val="left" w:pos="1832"/>
+          <w:tab w:val="left" w:pos="2748"/>
+          <w:tab w:val="left" w:pos="3664"/>
+          <w:tab w:val="left" w:pos="4580"/>
+          <w:tab w:val="left" w:pos="5496"/>
+          <w:tab w:val="left" w:pos="6412"/>
+          <w:tab w:val="left" w:pos="7328"/>
+          <w:tab w:val="left" w:pos="8244"/>
+          <w:tab w:val="left" w:pos="9160"/>
+          <w:tab w:val="left" w:pos="10076"/>
+          <w:tab w:val="left" w:pos="10992"/>
+          <w:tab w:val="left" w:pos="11908"/>
+          <w:tab w:val="left" w:pos="12824"/>
+          <w:tab w:val="left" w:pos="13740"/>
+          <w:tab w:val="left" w:pos="14656"/>
+        </w:tabs>
+        <w:spacing w:after="0" w:line="240" w:lineRule="auto"/>
+        <w:rPr>
+          <w:rFonts w:ascii="Courier New" w:eastAsia="Times New Roman" w:hAnsi="Courier New" w:cs="Courier New" w:hint="eastAsia"/>
+          <w:kern w:val="0"/>
+          <w:sz w:val="20"/>
+          <w:szCs w:val="20"/>
+          <w14:ligatures w14:val="none"/>
+        </w:rPr>
+      </w:pPr>
+      <w:r>
+        <w:rPr>
+          <w:rFonts w:ascii="Cambria Math" w:eastAsia="Times New Roman" w:hAnsi="Cambria Math" w:cs="Cambria Math"/>
+          <w:kern w:val="0"/>
+          <w:sz w:val="20"/>
+          <w:szCs w:val="20"/>
+          <w14:ligatures w14:val="none"/>
+        </w:rPr>
+        <w:t>①</w:t>
+      </w:r>
+      <w:r>
+        <w:rPr>
+          <w:rFonts w:ascii="Courier New" w:eastAsia="Times New Roman" w:hAnsi="Courier New" w:cs="Courier New"/>
+          <w:kern w:val="0"/>
+          <w:sz w:val="20"/>
+          <w:szCs w:val="20"/>
+          <w14:ligatures w14:val="none"/>
+        </w:rPr>
+        <w:t xml:space="preserve"> Supervisor</w:t>
+      </w:r>
+      <w:r>
+        <w:rPr>
+          <w:rFonts w:ascii="Courier New" w:eastAsia="Times New Roman" w:hAnsi="Courier New" w:cs="Courier New" w:hint="eastAsia"/>
+          <w:kern w:val="0"/>
+          <w:sz w:val="20"/>
+          <w:szCs w:val="20"/>
+          <w14:ligatures w14:val="none"/>
+        </w:rPr>
+        <w:t xml:space="preserve"> </w:t>
+      </w:r>
+      <w:r>
+        <w:rPr>
+          <w:rFonts w:ascii="SimSun" w:eastAsia="SimSun" w:hAnsi="SimSun" w:cs="SimSun" w:hint="eastAsia"/>
+          <w:kern w:val="0"/>
+          <w:sz w:val="20"/>
+          <w:szCs w:val="20"/>
+          <w14:ligatures w14:val="none"/>
+        </w:rPr>
+        <w:t>用，拆分任务</w:t>
+      </w:r>
+    </w:p>
+    <w:p>
+      <w:pPr>
+        <w:tabs>
+          <w:tab w:val="left" w:pos="916"/>
+          <w:tab w:val="left" w:pos="1832"/>
+          <w:tab w:val="left" w:pos="2748"/>
+          <w:tab w:val="left" w:pos="3664"/>
+          <w:tab w:val="left" w:pos="4580"/>
+          <w:tab w:val="left" w:pos="5496"/>
+          <w:tab w:val="left" w:pos="6412"/>
+          <w:tab w:val="left" w:pos="7328"/>
+          <w:tab w:val="left" w:pos="8244"/>
+          <w:tab w:val="left" w:pos="9160"/>
+          <w:tab w:val="left" w:pos="10076"/>
+          <w:tab w:val="left" w:pos="10992"/>
+          <w:tab w:val="left" w:pos="11908"/>
+          <w:tab w:val="left" w:pos="12824"/>
+          <w:tab w:val="left" w:pos="13740"/>
+          <w:tab w:val="left" w:pos="14656"/>
+        </w:tabs>
+        <w:spacing w:after="0" w:line="240" w:lineRule="auto"/>
+        <w:rPr>
+          <w:rFonts w:ascii="Courier New" w:eastAsia="Times New Roman" w:hAnsi="Courier New" w:cs="Courier New" w:hint="eastAsia"/>
+          <w:kern w:val="0"/>
+          <w:sz w:val="20"/>
+          <w:szCs w:val="20"/>
+          <w14:ligatures w14:val="none"/>
+        </w:rPr>
+      </w:pPr>
+      <w:r>
+        <w:rPr>
+          <w:rFonts w:ascii="Cambria Math" w:eastAsia="Times New Roman" w:hAnsi="Cambria Math" w:cs="Cambria Math"/>
+          <w:kern w:val="0"/>
+          <w:sz w:val="20"/>
+          <w:szCs w:val="20"/>
+          <w14:ligatures w14:val="none"/>
+        </w:rPr>
+        <w:t>②</w:t>
+      </w:r>
+      <w:r>
+        <w:rPr>
+          <w:rFonts w:ascii="Courier New" w:eastAsia="Times New Roman" w:hAnsi="Courier New" w:cs="Courier New"/>
+          <w:kern w:val="0"/>
+          <w:sz w:val="20"/>
+          <w:szCs w:val="20"/>
+          <w14:ligatures w14:val="none"/>
+        </w:rPr>
+        <w:t xml:space="preserve"> </w:t>
+      </w:r>
+      <w:r>
+        <w:rPr>
+          <w:rFonts w:ascii="Microsoft YaHei" w:eastAsia="Microsoft YaHei" w:hAnsi="Microsoft YaHei" w:cs="Microsoft YaHei" w:hint="eastAsia"/>
+          <w:kern w:val="0"/>
+          <w:sz w:val="20"/>
+          <w:szCs w:val="20"/>
+          <w14:ligatures w14:val="none"/>
+        </w:rPr>
+        <w:t>普通</w:t>
+      </w:r>
+      <w:r>
+        <w:rPr>
+          <w:rFonts w:ascii="Courier New" w:eastAsia="Times New Roman" w:hAnsi="Courier New" w:cs="Courier New"/>
+          <w:kern w:val="0"/>
+          <w:sz w:val="20"/>
+          <w:szCs w:val="20"/>
+          <w14:ligatures w14:val="none"/>
+        </w:rPr>
+        <w:t xml:space="preserve"> Tool</w:t>
+      </w:r>
+      <w:r>
+        <w:rPr>
+          <w:rFonts w:ascii="Courier New" w:eastAsia="Times New Roman" w:hAnsi="Courier New" w:cs="Courier New" w:hint="eastAsia"/>
+          <w:kern w:val="0"/>
+          <w:sz w:val="20"/>
+          <w:szCs w:val="20"/>
+          <w14:ligatures w14:val="none"/>
+        </w:rPr>
+        <w:t xml:space="preserve"> </w:t>
+      </w:r>
+      <w:r>
+        <w:rPr>
+          <w:rFonts w:ascii="SimSun" w:eastAsia="SimSun" w:hAnsi="SimSun" w:cs="SimSun" w:hint="eastAsia"/>
+          <w:kern w:val="0"/>
+          <w:sz w:val="20"/>
+          <w:szCs w:val="20"/>
+          <w14:ligatures w14:val="none"/>
+        </w:rPr>
+        <w:t>用，调用</w:t>
+      </w:r>
+    </w:p>
+    <w:p>
+      <w:pPr>
+        <w:tabs>
+          <w:tab w:val="left" w:pos="916"/>
+          <w:tab w:val="left" w:pos="1832"/>
+          <w:tab w:val="left" w:pos="2748"/>
+          <w:tab w:val="left" w:pos="3664"/>
+          <w:tab w:val="left" w:pos="4580"/>
+          <w:tab w:val="left" w:pos="5496"/>
+          <w:tab w:val="left" w:pos="6412"/>
+          <w:tab w:val="left" w:pos="7328"/>
+          <w:tab w:val="left" w:pos="8244"/>
+          <w:tab w:val="left" w:pos="9160"/>
+          <w:tab w:val="left" w:pos="10076"/>
+          <w:tab w:val="left" w:pos="10992"/>
+          <w:tab w:val="left" w:pos="11908"/>
+          <w:tab w:val="left" w:pos="12824"/>
+          <w:tab w:val="left" w:pos="13740"/>
+          <w:tab w:val="left" w:pos="14656"/>
+        </w:tabs>
+        <w:spacing w:after="0" w:line="240" w:lineRule="auto"/>
+        <w:rPr>
+          <w:rFonts w:ascii="Courier New" w:eastAsia="Times New Roman" w:hAnsi="Courier New" w:cs="Courier New" w:hint="eastAsia"/>
+          <w:kern w:val="0"/>
+          <w:sz w:val="20"/>
+          <w:szCs w:val="20"/>
+          <w14:ligatures w14:val="none"/>
+        </w:rPr>
+      </w:pPr>
+      <w:r>
+        <w:rPr>
+          <w:rFonts w:ascii="Cambria Math" w:eastAsia="Times New Roman" w:hAnsi="Cambria Math" w:cs="Cambria Math"/>
+          <w:kern w:val="0"/>
+          <w:sz w:val="20"/>
+          <w:szCs w:val="20"/>
+          <w14:ligatures w14:val="none"/>
+        </w:rPr>
+        <w:t>③</w:t>
+      </w:r>
+      <w:r>
+        <w:rPr>
+          <w:rFonts w:ascii="Courier New" w:eastAsia="Times New Roman" w:hAnsi="Courier New" w:cs="Courier New"/>
+          <w:kern w:val="0"/>
+          <w:sz w:val="20"/>
+          <w:szCs w:val="20"/>
+          <w14:ligatures w14:val="none"/>
+        </w:rPr>
+        <w:t xml:space="preserve"> Agent</w:t>
+      </w:r>
+      <w:r>
+        <w:rPr>
+          <w:rFonts w:ascii="Courier New" w:eastAsia="Times New Roman" w:hAnsi="Courier New" w:cs="Courier New" w:hint="eastAsia"/>
+          <w:kern w:val="0"/>
+          <w:sz w:val="20"/>
+          <w:szCs w:val="20"/>
+          <w14:ligatures w14:val="none"/>
+        </w:rPr>
+        <w:t xml:space="preserve"> </w:t>
+      </w:r>
+      <w:r>
+        <w:rPr>
+          <w:rFonts w:ascii="SimSun" w:eastAsia="SimSun" w:hAnsi="SimSun" w:cs="SimSun" w:hint="eastAsia"/>
+          <w:kern w:val="0"/>
+          <w:sz w:val="20"/>
+          <w:szCs w:val="20"/>
+          <w14:ligatures w14:val="none"/>
+        </w:rPr>
+        <w:t>用，API Usage构建一个Agent</w:t>
+      </w:r>
+    </w:p>
+    <w:p>
+      <w:pPr>
+        <w:tabs>
+          <w:tab w:val="left" w:pos="916"/>
+          <w:tab w:val="left" w:pos="1832"/>
+          <w:tab w:val="left" w:pos="2748"/>
+          <w:tab w:val="left" w:pos="3664"/>
+          <w:tab w:val="left" w:pos="4580"/>
+          <w:tab w:val="left" w:pos="5496"/>
+          <w:tab w:val="left" w:pos="6412"/>
+          <w:tab w:val="left" w:pos="7328"/>
+          <w:tab w:val="left" w:pos="8244"/>
+          <w:tab w:val="left" w:pos="9160"/>
+          <w:tab w:val="left" w:pos="10076"/>
+          <w:tab w:val="left" w:pos="10992"/>
+          <w:tab w:val="left" w:pos="11908"/>
+          <w:tab w:val="left" w:pos="12824"/>
+          <w:tab w:val="left" w:pos="13740"/>
+          <w:tab w:val="left" w:pos="14656"/>
+        </w:tabs>
+        <w:spacing w:after="0" w:line="240" w:lineRule="auto"/>
+        <w:rPr>
+          <w:rFonts w:ascii="SimSun" w:eastAsia="SimSun" w:hAnsi="SimSun" w:cs="SimSun" w:hint="eastAsia"/>
+          <w:kern w:val="0"/>
+          <w:sz w:val="20"/>
+          <w:szCs w:val="20"/>
+          <w14:ligatures w14:val="none"/>
+        </w:rPr>
+      </w:pPr>
+      <w:r>
+        <w:rPr>
+          <w:rFonts w:ascii="Cambria Math" w:eastAsia="Times New Roman" w:hAnsi="Cambria Math" w:cs="Cambria Math"/>
+          <w:kern w:val="0"/>
+          <w:sz w:val="20"/>
+          <w:szCs w:val="20"/>
+          <w14:ligatures w14:val="none"/>
+        </w:rPr>
+        <w:t>④</w:t>
+      </w:r>
+      <w:r>
+        <w:rPr>
+          <w:rFonts w:ascii="Courier New" w:eastAsia="Times New Roman" w:hAnsi="Courier New" w:cs="Courier New"/>
+          <w:kern w:val="0"/>
+          <w:sz w:val="20"/>
+          <w:szCs w:val="20"/>
+          <w14:ligatures w14:val="none"/>
+        </w:rPr>
+        <w:t xml:space="preserve"> SubGraph</w:t>
+      </w:r>
+      <w:r>
+        <w:rPr>
+          <w:rFonts w:ascii="SimSun" w:eastAsia="SimSun" w:hAnsi="SimSun" w:cs="SimSun" w:hint="eastAsia"/>
+          <w:kern w:val="0"/>
+          <w:sz w:val="20"/>
+          <w:szCs w:val="20"/>
+          <w14:ligatures w14:val="none"/>
+        </w:rPr>
+        <w:t>，不用，控制权不交给SubGraph，最终由Supervisor输出简洁总结</w:t>
+      </w:r>
+    </w:p>
+    <w:p>
+      <w:pPr>
+        <w:tabs>
+          <w:tab w:val="left" w:pos="916"/>
+          <w:tab w:val="left" w:pos="1832"/>
+          <w:tab w:val="left" w:pos="2748"/>
+          <w:tab w:val="left" w:pos="3664"/>
+          <w:tab w:val="left" w:pos="4580"/>
+          <w:tab w:val="left" w:pos="5496"/>
+          <w:tab w:val="left" w:pos="6412"/>
+          <w:tab w:val="left" w:pos="7328"/>
+          <w:tab w:val="left" w:pos="8244"/>
+          <w:tab w:val="left" w:pos="9160"/>
+          <w:tab w:val="left" w:pos="10076"/>
+          <w:tab w:val="left" w:pos="10992"/>
+          <w:tab w:val="left" w:pos="11908"/>
+          <w:tab w:val="left" w:pos="12824"/>
+          <w:tab w:val="left" w:pos="13740"/>
+          <w:tab w:val="left" w:pos="14656"/>
+        </w:tabs>
+        <w:spacing w:after="0" w:line="240" w:lineRule="auto"/>
+        <w:rPr>
+          <w:rFonts w:ascii="Courier New" w:eastAsia="Times New Roman" w:hAnsi="Courier New" w:cs="Courier New"/>
+          <w:kern w:val="0"/>
+          <w:sz w:val="20"/>
+          <w:szCs w:val="20"/>
+          <w14:ligatures w14:val="none"/>
+        </w:rPr>
+      </w:pPr>
+      <w:r>
+        <w:rPr>
+          <w:rFonts w:ascii="Cambria Math" w:eastAsia="Times New Roman" w:hAnsi="Cambria Math" w:cs="Cambria Math"/>
+          <w:kern w:val="0"/>
+          <w:sz w:val="20"/>
+          <w:szCs w:val="20"/>
+          <w14:ligatures w14:val="none"/>
+        </w:rPr>
+        <w:t>⑤</w:t>
+      </w:r>
+      <w:r>
+        <w:rPr>
+          <w:rFonts w:ascii="Courier New" w:eastAsia="Times New Roman" w:hAnsi="Courier New" w:cs="Courier New"/>
+          <w:kern w:val="0"/>
+          <w:sz w:val="20"/>
+          <w:szCs w:val="20"/>
+          <w14:ligatures w14:val="none"/>
+        </w:rPr>
+        <w:t xml:space="preserve"> SubAgent-as-Tool</w:t>
+      </w:r>
+    </w:p>
+    <w:p>
+      <w:pPr>
+        <w:tabs>
+          <w:tab w:val="left" w:pos="916"/>
+          <w:tab w:val="left" w:pos="1832"/>
+          <w:tab w:val="left" w:pos="2748"/>
+          <w:tab w:val="left" w:pos="3664"/>
+          <w:tab w:val="left" w:pos="4580"/>
+          <w:tab w:val="left" w:pos="5496"/>
+          <w:tab w:val="left" w:pos="6412"/>
+          <w:tab w:val="left" w:pos="7328"/>
+          <w:tab w:val="left" w:pos="8244"/>
+          <w:tab w:val="left" w:pos="9160"/>
+          <w:tab w:val="left" w:pos="10076"/>
+          <w:tab w:val="left" w:pos="10992"/>
+          <w:tab w:val="left" w:pos="11908"/>
+          <w:tab w:val="left" w:pos="12824"/>
+          <w:tab w:val="left" w:pos="13740"/>
+          <w:tab w:val="left" w:pos="14656"/>
+        </w:tabs>
+        <w:spacing w:after="0" w:line="240" w:lineRule="auto"/>
+        <w:rPr>
+          <w:rFonts w:ascii="SimSun" w:eastAsia="SimSun" w:hAnsi="SimSun" w:cs="SimSun" w:hint="eastAsia"/>
+          <w:kern w:val="0"/>
+          <w:sz w:val="20"/>
+          <w:szCs w:val="20"/>
+          <w14:ligatures w14:val="none"/>
+        </w:rPr>
+      </w:pPr>
+      <w:r>
+        <w:rPr>
+          <w:rFonts w:ascii="Cambria Math" w:eastAsia="Times New Roman" w:hAnsi="Cambria Math" w:cs="Cambria Math"/>
+          <w:kern w:val="0"/>
+          <w:sz w:val="20"/>
+          <w:szCs w:val="20"/>
+          <w14:ligatures w14:val="none"/>
+        </w:rPr>
+        <w:t>⑥</w:t>
+      </w:r>
+      <w:r>
+        <w:rPr>
+          <w:rFonts w:ascii="Courier New" w:eastAsia="Times New Roman" w:hAnsi="Courier New" w:cs="Courier New"/>
+          <w:kern w:val="0"/>
+          <w:sz w:val="20"/>
+          <w:szCs w:val="20"/>
+          <w14:ligatures w14:val="none"/>
+        </w:rPr>
+        <w:t xml:space="preserve"> Handoff</w:t>
+      </w:r>
+      <w:r>
+        <w:rPr>
+          <w:rFonts w:ascii="SimSun" w:eastAsia="SimSun" w:hAnsi="SimSun" w:cs="SimSun" w:hint="eastAsia"/>
+          <w:kern w:val="0"/>
+          <w:sz w:val="20"/>
+          <w:szCs w:val="20"/>
+          <w14:ligatures w14:val="none"/>
+        </w:rPr>
+        <w:t>：不用， 没有交出控制权</w:t>
+      </w:r>
+    </w:p>
+    <w:p>
+      <w:pPr>
+        <w:tabs>
+          <w:tab w:val="left" w:pos="916"/>
+          <w:tab w:val="left" w:pos="1832"/>
+          <w:tab w:val="left" w:pos="2748"/>
+          <w:tab w:val="left" w:pos="3664"/>
+          <w:tab w:val="left" w:pos="4580"/>
+          <w:tab w:val="left" w:pos="5496"/>
+          <w:tab w:val="left" w:pos="6412"/>
+          <w:tab w:val="left" w:pos="7328"/>
+          <w:tab w:val="left" w:pos="8244"/>
+          <w:tab w:val="left" w:pos="9160"/>
+          <w:tab w:val="left" w:pos="10076"/>
+          <w:tab w:val="left" w:pos="10992"/>
+          <w:tab w:val="left" w:pos="11908"/>
+          <w:tab w:val="left" w:pos="12824"/>
+          <w:tab w:val="left" w:pos="13740"/>
+          <w:tab w:val="left" w:pos="14656"/>
+        </w:tabs>
+        <w:spacing w:after="0" w:line="240" w:lineRule="auto"/>
+        <w:rPr>
+          <w:rFonts w:ascii="SimSun" w:eastAsia="SimSun" w:hAnsi="SimSun" w:cs="SimSun" w:hint="eastAsia"/>
+          <w:kern w:val="0"/>
+          <w:sz w:val="20"/>
+          <w:szCs w:val="20"/>
+          <w14:ligatures w14:val="none"/>
+        </w:rPr>
+      </w:pPr>
+      <w:r>
+        <w:rPr>
+          <w:rFonts w:ascii="Cambria Math" w:eastAsia="Times New Roman" w:hAnsi="Cambria Math" w:cs="Cambria Math"/>
+          <w:kern w:val="0"/>
+          <w:sz w:val="20"/>
+          <w:szCs w:val="20"/>
+          <w14:ligatures w14:val="none"/>
+        </w:rPr>
+        <w:t>⑦</w:t>
+      </w:r>
+      <w:r>
+        <w:rPr>
+          <w:rFonts w:ascii="Courier New" w:eastAsia="Times New Roman" w:hAnsi="Courier New" w:cs="Courier New"/>
+          <w:kern w:val="0"/>
+          <w:sz w:val="20"/>
+          <w:szCs w:val="20"/>
+          <w14:ligatures w14:val="none"/>
+        </w:rPr>
+        <w:t xml:space="preserve"> Send</w:t>
+      </w:r>
+      <w:r>
+        <w:rPr>
+          <w:rFonts w:ascii="SimSun" w:eastAsia="SimSun" w:hAnsi="SimSun" w:cs="SimSun" w:hint="eastAsia"/>
+          <w:kern w:val="0"/>
+          <w:sz w:val="20"/>
+          <w:szCs w:val="20"/>
+          <w14:ligatures w14:val="none"/>
+        </w:rPr>
+        <w:t>：</w:t>
+      </w:r>
+      <w:r>
+        <w:rPr>
+          <w:rFonts w:ascii="SimSun" w:eastAsia="SimSun" w:hAnsi="SimSun" w:cs="SimSun" w:hint="eastAsia"/>
+          <w:kern w:val="0"/>
+          <w:sz w:val="20"/>
+          <w:szCs w:val="20"/>
+          <w14:ligatures w14:val="none"/>
+        </w:rPr>
+        <w:t>不用， 没有拆分不同任务给不同Agent</w:t>
+      </w:r>
+    </w:p>
+    <w:p>
+      <w:pPr>
+        <w:tabs>
+          <w:tab w:val="left" w:pos="916"/>
+          <w:tab w:val="left" w:pos="1832"/>
+          <w:tab w:val="left" w:pos="2748"/>
+          <w:tab w:val="left" w:pos="3664"/>
+          <w:tab w:val="left" w:pos="4580"/>
+          <w:tab w:val="left" w:pos="5496"/>
+          <w:tab w:val="left" w:pos="6412"/>
+          <w:tab w:val="left" w:pos="7328"/>
+          <w:tab w:val="left" w:pos="8244"/>
+          <w:tab w:val="left" w:pos="9160"/>
+          <w:tab w:val="left" w:pos="10076"/>
+          <w:tab w:val="left" w:pos="10992"/>
+          <w:tab w:val="left" w:pos="11908"/>
+          <w:tab w:val="left" w:pos="12824"/>
+          <w:tab w:val="left" w:pos="13740"/>
+          <w:tab w:val="left" w:pos="14656"/>
+        </w:tabs>
+        <w:spacing w:after="0" w:line="240" w:lineRule="auto"/>
+        <w:rPr>
+          <w:rFonts w:ascii="SimSun" w:eastAsia="SimSun" w:hAnsi="SimSun" w:cs="SimSun" w:hint="eastAsia"/>
+          <w:kern w:val="0"/>
+          <w:sz w:val="20"/>
+          <w:szCs w:val="20"/>
+          <w14:ligatures w14:val="none"/>
+        </w:rPr>
+      </w:pPr>
+      <w:r>
+        <w:rPr>
+          <w:rFonts w:ascii="Cambria Math" w:eastAsia="Times New Roman" w:hAnsi="Cambria Math" w:cs="Cambria Math"/>
+          <w:kern w:val="0"/>
+          <w:sz w:val="20"/>
+          <w:szCs w:val="20"/>
+          <w14:ligatures w14:val="none"/>
+        </w:rPr>
+        <w:t>⑧</w:t>
+      </w:r>
+      <w:r>
+        <w:rPr>
+          <w:rFonts w:ascii="Courier New" w:eastAsia="Times New Roman" w:hAnsi="Courier New" w:cs="Courier New"/>
+          <w:kern w:val="0"/>
+          <w:sz w:val="20"/>
+          <w:szCs w:val="20"/>
+          <w14:ligatures w14:val="none"/>
+        </w:rPr>
+        <w:t xml:space="preserve"> Reducer</w:t>
+      </w:r>
+      <w:r>
+        <w:rPr>
+          <w:rFonts w:ascii="SimSun" w:eastAsia="SimSun" w:hAnsi="SimSun" w:cs="SimSun" w:hint="eastAsia"/>
+          <w:kern w:val="0"/>
+          <w:sz w:val="20"/>
+          <w:szCs w:val="20"/>
+          <w14:ligatures w14:val="none"/>
+        </w:rPr>
+        <w:t>：不用，没有从不同Agent收集任务</w:t>
+      </w:r>
+    </w:p>
+    <w:p>
+      <w:pPr>
+        <w:tabs>
+          <w:tab w:val="left" w:pos="916"/>
+          <w:tab w:val="left" w:pos="1832"/>
+          <w:tab w:val="left" w:pos="2748"/>
+          <w:tab w:val="left" w:pos="3664"/>
+          <w:tab w:val="left" w:pos="4580"/>
+          <w:tab w:val="left" w:pos="5496"/>
+          <w:tab w:val="left" w:pos="6412"/>
+          <w:tab w:val="left" w:pos="7328"/>
+          <w:tab w:val="left" w:pos="8244"/>
+          <w:tab w:val="left" w:pos="9160"/>
+          <w:tab w:val="left" w:pos="10076"/>
+          <w:tab w:val="left" w:pos="10992"/>
+          <w:tab w:val="left" w:pos="11908"/>
+          <w:tab w:val="left" w:pos="12824"/>
+          <w:tab w:val="left" w:pos="13740"/>
+          <w:tab w:val="left" w:pos="14656"/>
+        </w:tabs>
+        <w:spacing w:after="0" w:line="240" w:lineRule="auto"/>
+        <w:rPr>
+          <w:rFonts w:ascii="SimSun" w:eastAsia="SimSun" w:hAnsi="SimSun" w:cs="SimSun" w:hint="eastAsia"/>
+          <w:kern w:val="0"/>
+          <w:sz w:val="20"/>
+          <w:szCs w:val="20"/>
+          <w14:ligatures w14:val="none"/>
+        </w:rPr>
+      </w:pPr>
+      <w:r>
+        <w:rPr>
+          <w:rFonts w:ascii="Cambria Math" w:eastAsia="Times New Roman" w:hAnsi="Cambria Math" w:cs="Cambria Math"/>
+          <w:kern w:val="0"/>
+          <w:sz w:val="20"/>
+          <w:szCs w:val="20"/>
+          <w14:ligatures w14:val="none"/>
+        </w:rPr>
+        <w:t>⑨</w:t>
+      </w:r>
+      <w:r>
+        <w:rPr>
+          <w:rFonts w:ascii="Courier New" w:eastAsia="Times New Roman" w:hAnsi="Courier New" w:cs="Courier New"/>
+          <w:kern w:val="0"/>
+          <w:sz w:val="20"/>
+          <w:szCs w:val="20"/>
+          <w14:ligatures w14:val="none"/>
+        </w:rPr>
+        <w:t xml:space="preserve"> State</w:t>
+      </w:r>
+      <w:r>
+        <w:rPr>
+          <w:rFonts w:ascii="SimSun" w:eastAsia="SimSun" w:hAnsi="SimSun" w:cs="SimSun" w:hint="eastAsia"/>
+          <w:kern w:val="0"/>
+          <w:sz w:val="20"/>
+          <w:szCs w:val="20"/>
+          <w14:ligatures w14:val="none"/>
+        </w:rPr>
+        <w:t>：用，保存Agent的result</w:t>
+      </w:r>
+    </w:p>
+    <w:p>
+      <w:pPr>
+        <w:tabs>
+          <w:tab w:val="left" w:pos="916"/>
+          <w:tab w:val="left" w:pos="1832"/>
+          <w:tab w:val="left" w:pos="2748"/>
+          <w:tab w:val="left" w:pos="3664"/>
+          <w:tab w:val="left" w:pos="4580"/>
+          <w:tab w:val="left" w:pos="5496"/>
+          <w:tab w:val="left" w:pos="6412"/>
+          <w:tab w:val="left" w:pos="7328"/>
+          <w:tab w:val="left" w:pos="8244"/>
+          <w:tab w:val="left" w:pos="9160"/>
+          <w:tab w:val="left" w:pos="10076"/>
+          <w:tab w:val="left" w:pos="10992"/>
+          <w:tab w:val="left" w:pos="11908"/>
+          <w:tab w:val="left" w:pos="12824"/>
+          <w:tab w:val="left" w:pos="13740"/>
+          <w:tab w:val="left" w:pos="14656"/>
+        </w:tabs>
+        <w:spacing w:after="0" w:line="240" w:lineRule="auto"/>
+        <w:rPr>
+          <w:rFonts w:ascii="SimSun" w:eastAsia="SimSun" w:hAnsi="SimSun" w:cs="SimSun"/>
+          <w:kern w:val="0"/>
+          <w:sz w:val="20"/>
+          <w:szCs w:val="20"/>
+          <w14:ligatures w14:val="none"/>
+        </w:rPr>
+      </w:pPr>
+      <w:r>
+        <w:rPr>
+          <w:rFonts w:ascii="Cambria Math" w:eastAsia="Times New Roman" w:hAnsi="Cambria Math" w:cs="Cambria Math"/>
+          <w:kern w:val="0"/>
+          <w:sz w:val="20"/>
+          <w:szCs w:val="20"/>
+          <w14:ligatures w14:val="none"/>
+        </w:rPr>
+        <w:t>⑩</w:t>
+      </w:r>
+      <w:r>
+        <w:rPr>
+          <w:rFonts w:ascii="Courier New" w:eastAsia="Times New Roman" w:hAnsi="Courier New" w:cs="Courier New"/>
+          <w:kern w:val="0"/>
+          <w:sz w:val="20"/>
+          <w:szCs w:val="20"/>
+          <w14:ligatures w14:val="none"/>
+        </w:rPr>
+        <w:t xml:space="preserve"> Context</w:t>
+      </w:r>
+      <w:r>
+        <w:rPr>
+          <w:rFonts w:ascii="SimSun" w:eastAsia="SimSun" w:hAnsi="SimSun" w:cs="SimSun" w:hint="eastAsia"/>
+          <w:kern w:val="0"/>
+          <w:sz w:val="20"/>
+          <w:szCs w:val="20"/>
+          <w14:ligatures w14:val="none"/>
+        </w:rPr>
+        <w:t>：用，保存用户id、请求的api usage开始、结束日期</w:t>
+      </w:r>
+    </w:p>
+    <w:p>
+      <w:pPr>
+        <w:tabs>
+          <w:tab w:val="left" w:pos="916"/>
+          <w:tab w:val="left" w:pos="1832"/>
+          <w:tab w:val="left" w:pos="2748"/>
+          <w:tab w:val="left" w:pos="3664"/>
+          <w:tab w:val="left" w:pos="4580"/>
+          <w:tab w:val="left" w:pos="5496"/>
+          <w:tab w:val="left" w:pos="6412"/>
+          <w:tab w:val="left" w:pos="7328"/>
+          <w:tab w:val="left" w:pos="8244"/>
+          <w:tab w:val="left" w:pos="9160"/>
+          <w:tab w:val="left" w:pos="10076"/>
+          <w:tab w:val="left" w:pos="10992"/>
+          <w:tab w:val="left" w:pos="11908"/>
+          <w:tab w:val="left" w:pos="12824"/>
+          <w:tab w:val="left" w:pos="13740"/>
+          <w:tab w:val="left" w:pos="14656"/>
+        </w:tabs>
+        <w:spacing w:after="0" w:line="240" w:lineRule="auto"/>
+        <w:rPr>
+          <w:rFonts w:ascii="SimSun" w:eastAsia="SimSun" w:hAnsi="SimSun" w:cs="SimSun"/>
+          <w:kern w:val="0"/>
+          <w:sz w:val="20"/>
+          <w:szCs w:val="20"/>
+          <w14:ligatures w14:val="none"/>
+        </w:rPr>
+      </w:pPr>
+    </w:p>
+    <w:p>
+      <w:pPr>
+        <w:tabs>
+          <w:tab w:val="left" w:pos="916"/>
+          <w:tab w:val="left" w:pos="1832"/>
+          <w:tab w:val="left" w:pos="2748"/>
+          <w:tab w:val="left" w:pos="3664"/>
+          <w:tab w:val="left" w:pos="4580"/>
+          <w:tab w:val="left" w:pos="5496"/>
+          <w:tab w:val="left" w:pos="6412"/>
+          <w:tab w:val="left" w:pos="7328"/>
+          <w:tab w:val="left" w:pos="8244"/>
+          <w:tab w:val="left" w:pos="9160"/>
+          <w:tab w:val="left" w:pos="10076"/>
+          <w:tab w:val="left" w:pos="10992"/>
+          <w:tab w:val="left" w:pos="11908"/>
+          <w:tab w:val="left" w:pos="12824"/>
+          <w:tab w:val="left" w:pos="13740"/>
+          <w:tab w:val="left" w:pos="14656"/>
+        </w:tabs>
+        <w:spacing w:after="0" w:line="240" w:lineRule="auto"/>
+        <w:rPr>
+          <w:rFonts w:ascii="SimSun" w:eastAsia="SimSun" w:hAnsi="SimSun" w:cs="SimSun"/>
+          <w:kern w:val="0"/>
+          <w:sz w:val="20"/>
+          <w:szCs w:val="20"/>
+          <w:lang w:val="en-US"/>
+          <w14:ligatures w14:val="none"/>
+        </w:rPr>
+      </w:pPr>
+      <w:r>
+        <w:rPr>
+          <w:rFonts w:ascii="SimSun" w:eastAsia="SimSun" w:hAnsi="SimSun" w:cs="SimSun" w:hint="eastAsia"/>
+          <w:kern w:val="0"/>
+          <w:sz w:val="20"/>
+          <w:szCs w:val="20"/>
+          <w14:ligatures w14:val="none"/>
+        </w:rPr>
+        <w:t>第十五课</w:t>
+      </w:r>
+      <w:r>
+        <w:rPr>
+          <w:rFonts w:ascii="SimSun" w:eastAsia="SimSun" w:hAnsi="SimSun" w:cs="SimSun" w:hint="eastAsia"/>
+          <w:kern w:val="0"/>
+          <w:sz w:val="20"/>
+          <w:szCs w:val="20"/>
+          <w14:ligatures w14:val="none"/>
+        </w:rPr>
+        <w:t>作业：</w:t>
+      </w:r>
+    </w:p>
+    <w:p>
+      <w:pPr>
+        <w:tabs>
+          <w:tab w:val="left" w:pos="916"/>
+          <w:tab w:val="left" w:pos="1832"/>
+          <w:tab w:val="left" w:pos="2748"/>
+          <w:tab w:val="left" w:pos="3664"/>
+          <w:tab w:val="left" w:pos="4580"/>
+          <w:tab w:val="left" w:pos="5496"/>
+          <w:tab w:val="left" w:pos="6412"/>
+          <w:tab w:val="left" w:pos="7328"/>
+          <w:tab w:val="left" w:pos="8244"/>
+          <w:tab w:val="left" w:pos="9160"/>
+          <w:tab w:val="left" w:pos="10076"/>
+          <w:tab w:val="left" w:pos="10992"/>
+          <w:tab w:val="left" w:pos="11908"/>
+          <w:tab w:val="left" w:pos="12824"/>
+          <w:tab w:val="left" w:pos="13740"/>
+          <w:tab w:val="left" w:pos="14656"/>
+        </w:tabs>
+        <w:spacing w:after="0" w:line="240" w:lineRule="auto"/>
+        <w:rPr>
+          <w:rFonts w:ascii="SimSun" w:eastAsia="SimSun" w:hAnsi="SimSun" w:cs="SimSun"/>
+          <w:kern w:val="0"/>
+          <w:sz w:val="20"/>
+          <w:szCs w:val="20"/>
+          <w:lang w:val="en-US"/>
+          <w14:ligatures w14:val="none"/>
+        </w:rPr>
+      </w:pPr>
+      <w:r>
+        <w:rPr>
+          <w:rFonts w:ascii="SimSun" w:eastAsia="SimSun" w:hAnsi="SimSun" w:cs="SimSun"/>
+          <w:kern w:val="0"/>
+          <w:sz w:val="20"/>
+          <w:szCs w:val="20"/>
+          <w:lang w:val="en-US"/>
+          <w14:ligatures w14:val="none"/>
+        </w:rPr>
+        <w:tab/>
+      </w:r>
+    </w:p>
+    <w:p>
+      <w:pPr>
+        <w:tabs>
+          <w:tab w:val="left" w:pos="916"/>
+          <w:tab w:val="left" w:pos="1832"/>
+          <w:tab w:val="left" w:pos="2748"/>
+          <w:tab w:val="left" w:pos="3664"/>
+          <w:tab w:val="left" w:pos="4580"/>
+          <w:tab w:val="left" w:pos="5496"/>
+          <w:tab w:val="left" w:pos="6412"/>
+          <w:tab w:val="left" w:pos="7328"/>
+          <w:tab w:val="left" w:pos="8244"/>
+          <w:tab w:val="left" w:pos="9160"/>
+          <w:tab w:val="left" w:pos="10076"/>
+          <w:tab w:val="left" w:pos="10992"/>
+          <w:tab w:val="left" w:pos="11908"/>
+          <w:tab w:val="left" w:pos="12824"/>
+          <w:tab w:val="left" w:pos="13740"/>
+          <w:tab w:val="left" w:pos="14656"/>
+        </w:tabs>
+        <w:spacing w:after="0" w:line="240" w:lineRule="auto"/>
+        <w:rPr>
+          <w:rFonts w:ascii="SimSun" w:eastAsia="SimSun" w:hAnsi="SimSun" w:cs="SimSun"/>
+          <w:kern w:val="0"/>
+          <w:sz w:val="20"/>
+          <w:szCs w:val="20"/>
+          <w:lang w:val="en-US"/>
+          <w14:ligatures w14:val="none"/>
+        </w:rPr>
+      </w:pPr>
+      <w:r>
+        <w:rPr>
+          <w:rFonts w:ascii="SimSun" w:eastAsia="SimSun" w:hAnsi="SimSun" w:cs="SimSun" w:hint="eastAsia"/>
+          <w:kern w:val="0"/>
+          <w:sz w:val="20"/>
+          <w:szCs w:val="20"/>
+          <w:lang w:val="en-US"/>
+          <w14:ligatures w14:val="none"/>
+        </w:rPr>
+        <w:t>(1).设计解耦，</w:t>
+      </w:r>
+      <w:proofErr w:type="spellStart"/>
+      <w:r>
+        <w:rPr>
+          <w:rFonts w:ascii="SimSun" w:eastAsia="SimSun" w:hAnsi="SimSun" w:cs="SimSun" w:hint="eastAsia"/>
+          <w:kern w:val="0"/>
+          <w:sz w:val="20"/>
+          <w:szCs w:val="20"/>
+          <w:lang w:val="en-US"/>
+          <w14:ligatures w14:val="none"/>
+        </w:rPr>
+        <w:t>history_result</w:t>
+      </w:r>
+      <w:proofErr w:type="spellEnd"/>
+      <w:r>
+        <w:rPr>
+          <w:rFonts w:ascii="SimSun" w:eastAsia="SimSun" w:hAnsi="SimSun" w:cs="SimSun" w:hint="eastAsia"/>
+          <w:kern w:val="0"/>
+          <w:sz w:val="20"/>
+          <w:szCs w:val="20"/>
+          <w:lang w:val="en-US"/>
+          <w14:ligatures w14:val="none"/>
+        </w:rPr>
+        <w:t>和</w:t>
+      </w:r>
+      <w:proofErr w:type="spellStart"/>
+      <w:r>
+        <w:rPr>
+          <w:rFonts w:ascii="SimSun" w:eastAsia="SimSun" w:hAnsi="SimSun" w:cs="SimSun" w:hint="eastAsia"/>
+          <w:kern w:val="0"/>
+          <w:sz w:val="20"/>
+          <w:szCs w:val="20"/>
+          <w:lang w:val="en-US"/>
+          <w14:ligatures w14:val="none"/>
+        </w:rPr>
+        <w:t>rag_result</w:t>
+      </w:r>
+      <w:proofErr w:type="spellEnd"/>
+      <w:r>
+        <w:rPr>
+          <w:rFonts w:ascii="SimSun" w:eastAsia="SimSun" w:hAnsi="SimSun" w:cs="SimSun" w:hint="eastAsia"/>
+          <w:kern w:val="0"/>
+          <w:sz w:val="20"/>
+          <w:szCs w:val="20"/>
+          <w:lang w:val="en-US"/>
+          <w14:ligatures w14:val="none"/>
+        </w:rPr>
+        <w:t>是子图运行过程中间产生的内容，仅子图自己用，所以不需要给父图；但是</w:t>
+      </w:r>
+      <w:proofErr w:type="spellStart"/>
+      <w:r>
+        <w:rPr>
+          <w:rFonts w:ascii="SimSun" w:eastAsia="SimSun" w:hAnsi="SimSun" w:cs="SimSun" w:hint="eastAsia"/>
+          <w:kern w:val="0"/>
+          <w:sz w:val="20"/>
+          <w:szCs w:val="20"/>
+          <w:lang w:val="en-US"/>
+          <w14:ligatures w14:val="none"/>
+        </w:rPr>
+        <w:t>possible_causes</w:t>
+      </w:r>
+      <w:proofErr w:type="spellEnd"/>
+      <w:r>
+        <w:rPr>
+          <w:rFonts w:ascii="SimSun" w:eastAsia="SimSun" w:hAnsi="SimSun" w:cs="SimSun" w:hint="eastAsia"/>
+          <w:kern w:val="0"/>
+          <w:sz w:val="20"/>
+          <w:szCs w:val="20"/>
+          <w:lang w:val="en-US"/>
+          <w14:ligatures w14:val="none"/>
+        </w:rPr>
+        <w:t>是父图在写报告中需要用到的内容，因此选择接收</w:t>
+      </w:r>
+    </w:p>
+    <w:p>
+      <w:pPr>
+        <w:tabs>
+          <w:tab w:val="left" w:pos="916"/>
+          <w:tab w:val="left" w:pos="1832"/>
+          <w:tab w:val="left" w:pos="2748"/>
+          <w:tab w:val="left" w:pos="3664"/>
+          <w:tab w:val="left" w:pos="4580"/>
+          <w:tab w:val="left" w:pos="5496"/>
+          <w:tab w:val="left" w:pos="6412"/>
+          <w:tab w:val="left" w:pos="7328"/>
+          <w:tab w:val="left" w:pos="8244"/>
+          <w:tab w:val="left" w:pos="9160"/>
+          <w:tab w:val="left" w:pos="10076"/>
+          <w:tab w:val="left" w:pos="10992"/>
+          <w:tab w:val="left" w:pos="11908"/>
+          <w:tab w:val="left" w:pos="12824"/>
+          <w:tab w:val="left" w:pos="13740"/>
+          <w:tab w:val="left" w:pos="14656"/>
+        </w:tabs>
+        <w:spacing w:after="0" w:line="240" w:lineRule="auto"/>
+        <w:rPr>
+          <w:rFonts w:ascii="SimSun" w:eastAsia="SimSun" w:hAnsi="SimSun" w:cs="SimSun"/>
+          <w:kern w:val="0"/>
+          <w:sz w:val="20"/>
+          <w:szCs w:val="20"/>
+          <w:lang w:val="en-US"/>
+          <w14:ligatures w14:val="none"/>
+        </w:rPr>
+      </w:pPr>
+      <w:r>
+        <w:rPr>
+          <w:rFonts w:ascii="SimSun" w:eastAsia="SimSun" w:hAnsi="SimSun" w:cs="SimSun" w:hint="eastAsia"/>
+          <w:kern w:val="0"/>
+          <w:sz w:val="20"/>
+          <w:szCs w:val="20"/>
+          <w:lang w:val="en-US"/>
+          <w14:ligatures w14:val="none"/>
+        </w:rPr>
+        <w:t>(2).</w:t>
+      </w:r>
+    </w:p>
+    <w:p>
+      <w:pPr>
+        <w:tabs>
+          <w:tab w:val="left" w:pos="916"/>
+          <w:tab w:val="left" w:pos="1832"/>
+          <w:tab w:val="left" w:pos="2748"/>
+          <w:tab w:val="left" w:pos="3664"/>
+          <w:tab w:val="left" w:pos="4580"/>
+          <w:tab w:val="left" w:pos="5496"/>
+          <w:tab w:val="left" w:pos="6412"/>
+          <w:tab w:val="left" w:pos="7328"/>
+          <w:tab w:val="left" w:pos="8244"/>
+          <w:tab w:val="left" w:pos="9160"/>
+          <w:tab w:val="left" w:pos="10076"/>
+          <w:tab w:val="left" w:pos="10992"/>
+          <w:tab w:val="left" w:pos="11908"/>
+          <w:tab w:val="left" w:pos="12824"/>
+          <w:tab w:val="left" w:pos="13740"/>
+          <w:tab w:val="left" w:pos="14656"/>
+        </w:tabs>
+        <w:spacing w:after="0" w:line="240" w:lineRule="auto"/>
+        <w:rPr>
+          <w:rFonts w:ascii="SimSun" w:eastAsia="SimSun" w:hAnsi="SimSun" w:cs="SimSun" w:hint="eastAsia"/>
+          <w:kern w:val="0"/>
+          <w:sz w:val="20"/>
+          <w:szCs w:val="20"/>
+          <w:lang w:val="en-US"/>
+          <w14:ligatures w14:val="none"/>
+        </w:rPr>
+      </w:pPr>
+      <w:r>
+        <w:rPr>
+          <w:rFonts w:ascii="SimSun" w:eastAsia="SimSun" w:hAnsi="SimSun" w:cs="SimSun" w:hint="eastAsia"/>
+          <w:kern w:val="0"/>
+          <w:sz w:val="20"/>
+          <w:szCs w:val="20"/>
+          <w:lang w:val="en-US"/>
+          <w14:ligatures w14:val="none"/>
+        </w:rPr>
+        <w:t>(3).替换</w:t>
+      </w:r>
+      <w:proofErr w:type="spellStart"/>
+      <w:r>
+        <w:rPr>
+          <w:rFonts w:ascii="SimSun" w:eastAsia="SimSun" w:hAnsi="SimSun" w:cs="SimSun"/>
+          <w:kern w:val="0"/>
+          <w:sz w:val="20"/>
+          <w:szCs w:val="20"/>
+          <w:lang w:val="en-US"/>
+          <w14:ligatures w14:val="none"/>
+        </w:rPr>
+        <w:t>analyze_causes</w:t>
+      </w:r>
+      <w:proofErr w:type="spellEnd"/>
+      <w:r>
+        <w:rPr>
+          <w:rFonts w:ascii="SimSun" w:eastAsia="SimSun" w:hAnsi="SimSun" w:cs="SimSun" w:hint="eastAsia"/>
+          <w:kern w:val="0"/>
+          <w:sz w:val="20"/>
+          <w:szCs w:val="20"/>
+          <w:lang w:val="en-US"/>
+          <w14:ligatures w14:val="none"/>
+        </w:rPr>
+        <w:t>的实现，父图不需要重写</w:t>
+      </w:r>
+    </w:p>
+    <w:p>
+      <w:pPr>
+        <w:ind w:left="720" w:hanging="720"/>
+        <w:rPr>
+          <w:rFonts w:hint="eastAsia"/>
+        </w:rPr>
+      </w:pPr>
+    </w:p>
+    <w:p/>
     <w:sectPr>
       <w:pgSz w:w="12240" w:h="15840"/>
       <w:pgMar w:top="1440" w:right="1440" w:bottom="1440" w:left="1440" w:header="708" w:footer="708" w:gutter="0"/>
@@ -1984,10 +4424,10 @@
     </w:lvl>
   </w:abstractNum>
   <w:abstractNum w:abstractNumId="1" w15:restartNumberingAfterBreak="0">
-    <w:nsid w:val="421F71C3"/>
+    <w:nsid w:val="3CD1689B"/>
     <w:multiLevelType w:val="hybridMultilevel"/>
-    <w:tmpl w:val="45B0DC04"/>
-    <w:lvl w:ilvl="0" w:tplc="3E444A5E">
+    <w:tmpl w:val="56463592"/>
+    <w:lvl w:ilvl="0" w:tplc="783E78A2">
       <w:start w:val="1"/>
       <w:numFmt w:val="decimal"/>
       <w:lvlText w:val="（%1）"/>
@@ -2073,16 +4513,16 @@
     </w:lvl>
   </w:abstractNum>
   <w:abstractNum w:abstractNumId="2" w15:restartNumberingAfterBreak="0">
-    <w:nsid w:val="52C461F9"/>
+    <w:nsid w:val="421F71C3"/>
     <w:multiLevelType w:val="hybridMultilevel"/>
-    <w:tmpl w:val="0D7481E8"/>
-    <w:lvl w:ilvl="0" w:tplc="AEB019FA">
+    <w:tmpl w:val="45B0DC04"/>
+    <w:lvl w:ilvl="0" w:tplc="3E444A5E">
       <w:start w:val="1"/>
       <w:numFmt w:val="decimal"/>
       <w:lvlText w:val="（%1）"/>
       <w:lvlJc w:val="left"/>
       <w:pPr>
-        <w:ind w:left="1080" w:hanging="720"/>
+        <w:ind w:left="1040" w:hanging="720"/>
       </w:pPr>
       <w:rPr>
         <w:rFonts w:hint="default"/>
@@ -2094,7 +4534,7 @@
       <w:lvlText w:val="%2."/>
       <w:lvlJc w:val="left"/>
       <w:pPr>
-        <w:ind w:left="1440" w:hanging="360"/>
+        <w:ind w:left="1400" w:hanging="360"/>
       </w:pPr>
     </w:lvl>
     <w:lvl w:ilvl="2" w:tplc="0409001B" w:tentative="1">
@@ -2103,7 +4543,7 @@
       <w:lvlText w:val="%3."/>
       <w:lvlJc w:val="right"/>
       <w:pPr>
-        <w:ind w:left="2160" w:hanging="180"/>
+        <w:ind w:left="2120" w:hanging="180"/>
       </w:pPr>
     </w:lvl>
     <w:lvl w:ilvl="3" w:tplc="0409000F" w:tentative="1">
@@ -2112,7 +4552,7 @@
       <w:lvlText w:val="%4."/>
       <w:lvlJc w:val="left"/>
       <w:pPr>
-        <w:ind w:left="2880" w:hanging="360"/>
+        <w:ind w:left="2840" w:hanging="360"/>
       </w:pPr>
     </w:lvl>
     <w:lvl w:ilvl="4" w:tplc="04090019" w:tentative="1">
@@ -2121,7 +4561,7 @@
       <w:lvlText w:val="%5."/>
       <w:lvlJc w:val="left"/>
       <w:pPr>
-        <w:ind w:left="3600" w:hanging="360"/>
+        <w:ind w:left="3560" w:hanging="360"/>
       </w:pPr>
     </w:lvl>
     <w:lvl w:ilvl="5" w:tplc="0409001B" w:tentative="1">
@@ -2130,7 +4570,7 @@
       <w:lvlText w:val="%6."/>
       <w:lvlJc w:val="right"/>
       <w:pPr>
-        <w:ind w:left="4320" w:hanging="180"/>
+        <w:ind w:left="4280" w:hanging="180"/>
       </w:pPr>
     </w:lvl>
     <w:lvl w:ilvl="6" w:tplc="0409000F" w:tentative="1">
@@ -2139,7 +4579,7 @@
       <w:lvlText w:val="%7."/>
       <w:lvlJc w:val="left"/>
       <w:pPr>
-        <w:ind w:left="5040" w:hanging="360"/>
+        <w:ind w:left="5000" w:hanging="360"/>
       </w:pPr>
     </w:lvl>
     <w:lvl w:ilvl="7" w:tplc="04090019" w:tentative="1">
@@ -2148,7 +4588,7 @@
       <w:lvlText w:val="%8."/>
       <w:lvlJc w:val="left"/>
       <w:pPr>
-        <w:ind w:left="5760" w:hanging="360"/>
+        <w:ind w:left="5720" w:hanging="360"/>
       </w:pPr>
     </w:lvl>
     <w:lvl w:ilvl="8" w:tplc="0409001B" w:tentative="1">
@@ -2157,18 +4597,202 @@
       <w:lvlText w:val="%9."/>
       <w:lvlJc w:val="right"/>
       <w:pPr>
+        <w:ind w:left="6440" w:hanging="180"/>
+      </w:pPr>
+    </w:lvl>
+  </w:abstractNum>
+  <w:abstractNum w:abstractNumId="3" w15:restartNumberingAfterBreak="0">
+    <w:nsid w:val="52C461F9"/>
+    <w:multiLevelType w:val="hybridMultilevel"/>
+    <w:tmpl w:val="0D7481E8"/>
+    <w:lvl w:ilvl="0" w:tplc="AEB019FA">
+      <w:start w:val="1"/>
+      <w:numFmt w:val="decimal"/>
+      <w:lvlText w:val="（%1）"/>
+      <w:lvlJc w:val="left"/>
+      <w:pPr>
+        <w:ind w:left="1080" w:hanging="720"/>
+      </w:pPr>
+      <w:rPr>
+        <w:rFonts w:hint="default"/>
+      </w:rPr>
+    </w:lvl>
+    <w:lvl w:ilvl="1" w:tplc="04090019" w:tentative="1">
+      <w:start w:val="1"/>
+      <w:numFmt w:val="lowerLetter"/>
+      <w:lvlText w:val="%2."/>
+      <w:lvlJc w:val="left"/>
+      <w:pPr>
+        <w:ind w:left="1440" w:hanging="360"/>
+      </w:pPr>
+    </w:lvl>
+    <w:lvl w:ilvl="2" w:tplc="0409001B" w:tentative="1">
+      <w:start w:val="1"/>
+      <w:numFmt w:val="lowerRoman"/>
+      <w:lvlText w:val="%3."/>
+      <w:lvlJc w:val="right"/>
+      <w:pPr>
+        <w:ind w:left="2160" w:hanging="180"/>
+      </w:pPr>
+    </w:lvl>
+    <w:lvl w:ilvl="3" w:tplc="0409000F" w:tentative="1">
+      <w:start w:val="1"/>
+      <w:numFmt w:val="decimal"/>
+      <w:lvlText w:val="%4."/>
+      <w:lvlJc w:val="left"/>
+      <w:pPr>
+        <w:ind w:left="2880" w:hanging="360"/>
+      </w:pPr>
+    </w:lvl>
+    <w:lvl w:ilvl="4" w:tplc="04090019" w:tentative="1">
+      <w:start w:val="1"/>
+      <w:numFmt w:val="lowerLetter"/>
+      <w:lvlText w:val="%5."/>
+      <w:lvlJc w:val="left"/>
+      <w:pPr>
+        <w:ind w:left="3600" w:hanging="360"/>
+      </w:pPr>
+    </w:lvl>
+    <w:lvl w:ilvl="5" w:tplc="0409001B" w:tentative="1">
+      <w:start w:val="1"/>
+      <w:numFmt w:val="lowerRoman"/>
+      <w:lvlText w:val="%6."/>
+      <w:lvlJc w:val="right"/>
+      <w:pPr>
+        <w:ind w:left="4320" w:hanging="180"/>
+      </w:pPr>
+    </w:lvl>
+    <w:lvl w:ilvl="6" w:tplc="0409000F" w:tentative="1">
+      <w:start w:val="1"/>
+      <w:numFmt w:val="decimal"/>
+      <w:lvlText w:val="%7."/>
+      <w:lvlJc w:val="left"/>
+      <w:pPr>
+        <w:ind w:left="5040" w:hanging="360"/>
+      </w:pPr>
+    </w:lvl>
+    <w:lvl w:ilvl="7" w:tplc="04090019" w:tentative="1">
+      <w:start w:val="1"/>
+      <w:numFmt w:val="lowerLetter"/>
+      <w:lvlText w:val="%8."/>
+      <w:lvlJc w:val="left"/>
+      <w:pPr>
+        <w:ind w:left="5760" w:hanging="360"/>
+      </w:pPr>
+    </w:lvl>
+    <w:lvl w:ilvl="8" w:tplc="0409001B" w:tentative="1">
+      <w:start w:val="1"/>
+      <w:numFmt w:val="lowerRoman"/>
+      <w:lvlText w:val="%9."/>
+      <w:lvlJc w:val="right"/>
+      <w:pPr>
+        <w:ind w:left="6480" w:hanging="180"/>
+      </w:pPr>
+    </w:lvl>
+  </w:abstractNum>
+  <w:abstractNum w:abstractNumId="4" w15:restartNumberingAfterBreak="0">
+    <w:nsid w:val="7E055483"/>
+    <w:multiLevelType w:val="hybridMultilevel"/>
+    <w:tmpl w:val="B3229DB8"/>
+    <w:lvl w:ilvl="0" w:tplc="A1DE4DCA">
+      <w:start w:val="1"/>
+      <w:numFmt w:val="decimal"/>
+      <w:lvlText w:val="（%1）"/>
+      <w:lvlJc w:val="left"/>
+      <w:pPr>
+        <w:ind w:left="1080" w:hanging="720"/>
+      </w:pPr>
+      <w:rPr>
+        <w:rFonts w:hint="default"/>
+      </w:rPr>
+    </w:lvl>
+    <w:lvl w:ilvl="1" w:tplc="04090019" w:tentative="1">
+      <w:start w:val="1"/>
+      <w:numFmt w:val="lowerLetter"/>
+      <w:lvlText w:val="%2."/>
+      <w:lvlJc w:val="left"/>
+      <w:pPr>
+        <w:ind w:left="1440" w:hanging="360"/>
+      </w:pPr>
+    </w:lvl>
+    <w:lvl w:ilvl="2" w:tplc="0409001B" w:tentative="1">
+      <w:start w:val="1"/>
+      <w:numFmt w:val="lowerRoman"/>
+      <w:lvlText w:val="%3."/>
+      <w:lvlJc w:val="right"/>
+      <w:pPr>
+        <w:ind w:left="2160" w:hanging="180"/>
+      </w:pPr>
+    </w:lvl>
+    <w:lvl w:ilvl="3" w:tplc="0409000F" w:tentative="1">
+      <w:start w:val="1"/>
+      <w:numFmt w:val="decimal"/>
+      <w:lvlText w:val="%4."/>
+      <w:lvlJc w:val="left"/>
+      <w:pPr>
+        <w:ind w:left="2880" w:hanging="360"/>
+      </w:pPr>
+    </w:lvl>
+    <w:lvl w:ilvl="4" w:tplc="04090019" w:tentative="1">
+      <w:start w:val="1"/>
+      <w:numFmt w:val="lowerLetter"/>
+      <w:lvlText w:val="%5."/>
+      <w:lvlJc w:val="left"/>
+      <w:pPr>
+        <w:ind w:left="3600" w:hanging="360"/>
+      </w:pPr>
+    </w:lvl>
+    <w:lvl w:ilvl="5" w:tplc="0409001B" w:tentative="1">
+      <w:start w:val="1"/>
+      <w:numFmt w:val="lowerRoman"/>
+      <w:lvlText w:val="%6."/>
+      <w:lvlJc w:val="right"/>
+      <w:pPr>
+        <w:ind w:left="4320" w:hanging="180"/>
+      </w:pPr>
+    </w:lvl>
+    <w:lvl w:ilvl="6" w:tplc="0409000F" w:tentative="1">
+      <w:start w:val="1"/>
+      <w:numFmt w:val="decimal"/>
+      <w:lvlText w:val="%7."/>
+      <w:lvlJc w:val="left"/>
+      <w:pPr>
+        <w:ind w:left="5040" w:hanging="360"/>
+      </w:pPr>
+    </w:lvl>
+    <w:lvl w:ilvl="7" w:tplc="04090019" w:tentative="1">
+      <w:start w:val="1"/>
+      <w:numFmt w:val="lowerLetter"/>
+      <w:lvlText w:val="%8."/>
+      <w:lvlJc w:val="left"/>
+      <w:pPr>
+        <w:ind w:left="5760" w:hanging="360"/>
+      </w:pPr>
+    </w:lvl>
+    <w:lvl w:ilvl="8" w:tplc="0409001B" w:tentative="1">
+      <w:start w:val="1"/>
+      <w:numFmt w:val="lowerRoman"/>
+      <w:lvlText w:val="%9."/>
+      <w:lvlJc w:val="right"/>
+      <w:pPr>
         <w:ind w:left="6480" w:hanging="180"/>
       </w:pPr>
     </w:lvl>
   </w:abstractNum>
   <w:num w:numId="1" w16cid:durableId="206189966">
-    <w:abstractNumId w:val="2"/>
+    <w:abstractNumId w:val="3"/>
   </w:num>
   <w:num w:numId="2" w16cid:durableId="1237786314">
     <w:abstractNumId w:val="0"/>
   </w:num>
   <w:num w:numId="3" w16cid:durableId="31077529">
+    <w:abstractNumId w:val="2"/>
+  </w:num>
+  <w:num w:numId="4" w16cid:durableId="494956119">
     <w:abstractNumId w:val="1"/>
+  </w:num>
+  <w:num w:numId="5" w16cid:durableId="931207271">
+    <w:abstractNumId w:val="4"/>
   </w:num>
 </w:numbering>
 </file>
@@ -3090,6 +5714,71 @@
       <w:spacing w:val="5"/>
     </w:rPr>
   </w:style>
+  <w:style w:type="paragraph" w:styleId="HTMLPreformatted">
+    <w:name w:val="HTML Preformatted"/>
+    <w:basedOn w:val="Normal"/>
+    <w:link w:val="HTMLPreformattedChar"/>
+    <w:uiPriority w:val="99"/>
+    <w:semiHidden/>
+    <w:unhideWhenUsed/>
+    <w:rsid w:val="00AF20CA"/>
+    <w:pPr>
+      <w:tabs>
+        <w:tab w:val="left" w:pos="916"/>
+        <w:tab w:val="left" w:pos="1832"/>
+        <w:tab w:val="left" w:pos="2748"/>
+        <w:tab w:val="left" w:pos="3664"/>
+        <w:tab w:val="left" w:pos="4580"/>
+        <w:tab w:val="left" w:pos="5496"/>
+        <w:tab w:val="left" w:pos="6412"/>
+        <w:tab w:val="left" w:pos="7328"/>
+        <w:tab w:val="left" w:pos="8244"/>
+        <w:tab w:val="left" w:pos="9160"/>
+        <w:tab w:val="left" w:pos="10076"/>
+        <w:tab w:val="left" w:pos="10992"/>
+        <w:tab w:val="left" w:pos="11908"/>
+        <w:tab w:val="left" w:pos="12824"/>
+        <w:tab w:val="left" w:pos="13740"/>
+        <w:tab w:val="left" w:pos="14656"/>
+      </w:tabs>
+      <w:spacing w:after="0" w:line="240" w:lineRule="auto"/>
+    </w:pPr>
+    <w:rPr>
+      <w:rFonts w:ascii="Courier New" w:eastAsia="Times New Roman" w:hAnsi="Courier New" w:cs="Courier New"/>
+      <w:kern w:val="0"/>
+      <w:sz w:val="20"/>
+      <w:szCs w:val="20"/>
+      <w14:ligatures w14:val="none"/>
+    </w:rPr>
+  </w:style>
+  <w:style w:type="character" w:customStyle="1" w:styleId="HTMLPreformattedChar">
+    <w:name w:val="HTML Preformatted Char"/>
+    <w:basedOn w:val="DefaultParagraphFont"/>
+    <w:link w:val="HTMLPreformatted"/>
+    <w:uiPriority w:val="99"/>
+    <w:semiHidden/>
+    <w:rsid w:val="00AF20CA"/>
+    <w:rPr>
+      <w:rFonts w:ascii="Courier New" w:eastAsia="Times New Roman" w:hAnsi="Courier New" w:cs="Courier New"/>
+      <w:kern w:val="0"/>
+      <w:sz w:val="20"/>
+      <w:szCs w:val="20"/>
+      <w14:ligatures w14:val="none"/>
+    </w:rPr>
+  </w:style>
+  <w:style w:type="character" w:styleId="HTMLCode">
+    <w:name w:val="HTML Code"/>
+    <w:basedOn w:val="DefaultParagraphFont"/>
+    <w:uiPriority w:val="99"/>
+    <w:semiHidden/>
+    <w:unhideWhenUsed/>
+    <w:rsid w:val="00AF20CA"/>
+    <w:rPr>
+      <w:rFonts w:ascii="Courier New" w:eastAsia="Times New Roman" w:hAnsi="Courier New" w:cs="Courier New"/>
+      <w:sz w:val="20"/>
+      <w:szCs w:val="20"/>
+    </w:rPr>
+  </w:style>
 </w:styles>
 </file>
 

</xml_diff>

<commit_message>
deep learn exception deal in subagent
</commit_message>
<xml_diff>
--- a/interview/招聘调研报告/ChatGPT专题培训内容.docx
+++ b/interview/招聘调研报告/ChatGPT专题培训内容.docx
@@ -4227,16 +4227,6 @@
         </w:tabs>
         <w:spacing w:after="0" w:line="240" w:lineRule="auto"/>
         <w:rPr>
-          <w:rFonts w:ascii="SimSun" w:eastAsia="SimSun" w:hAnsi="SimSun" w:cs="SimSun"/>
-          <w:kern w:val="0"/>
-          <w:sz w:val="20"/>
-          <w:szCs w:val="20"/>
-          <w:lang w:val="en-US"/>
-          <w14:ligatures w14:val="none"/>
-        </w:rPr>
-      </w:pPr>
-      <w:r>
-        <w:rPr>
           <w:rFonts w:ascii="SimSun" w:eastAsia="SimSun" w:hAnsi="SimSun" w:cs="SimSun" w:hint="eastAsia"/>
           <w:kern w:val="0"/>
           <w:sz w:val="20"/>
@@ -4244,7 +4234,52 @@
           <w:lang w:val="en-US"/>
           <w14:ligatures w14:val="none"/>
         </w:rPr>
+      </w:pPr>
+      <w:r>
+        <w:rPr>
+          <w:rFonts w:ascii="SimSun" w:eastAsia="SimSun" w:hAnsi="SimSun" w:cs="SimSun" w:hint="eastAsia"/>
+          <w:kern w:val="0"/>
+          <w:sz w:val="20"/>
+          <w:szCs w:val="20"/>
+          <w:lang w:val="en-US"/>
+          <w14:ligatures w14:val="none"/>
+        </w:rPr>
         <w:t>(2).</w:t>
+      </w:r>
+      <w:r>
+        <w:rPr>
+          <w:rFonts w:ascii="SimSun" w:eastAsia="SimSun" w:hAnsi="SimSun" w:cs="SimSun" w:hint="eastAsia"/>
+          <w:kern w:val="0"/>
+          <w:sz w:val="20"/>
+          <w:szCs w:val="20"/>
+          <w:lang w:val="en-US"/>
+          <w14:ligatures w14:val="none"/>
+        </w:rPr>
+        <w:t>会执行summarize，父图会总结近7天的</w:t>
+      </w:r>
+      <w:proofErr w:type="spellStart"/>
+      <w:r>
+        <w:rPr>
+          <w:rFonts w:ascii="SimSun" w:eastAsia="SimSun" w:hAnsi="SimSun" w:cs="SimSun" w:hint="eastAsia"/>
+          <w:kern w:val="0"/>
+          <w:sz w:val="20"/>
+          <w:szCs w:val="20"/>
+          <w:lang w:val="en-US"/>
+          <w14:ligatures w14:val="none"/>
+        </w:rPr>
+        <w:t>api</w:t>
+      </w:r>
+      <w:proofErr w:type="spellEnd"/>
+      <w:r>
+        <w:rPr>
+          <w:rFonts w:ascii="SimSun" w:eastAsia="SimSun" w:hAnsi="SimSun" w:cs="SimSun" w:hint="eastAsia"/>
+          <w:kern w:val="0"/>
+          <w:sz w:val="20"/>
+          <w:szCs w:val="20"/>
+          <w:lang w:val="en-US"/>
+          <w14:ligatures w14:val="none"/>
+        </w:rPr>
+        <w:t>调用量，并报告没有异常发生</w:t>
       </w:r>
     </w:p>
     <w:p>
@@ -4321,7 +4356,1078 @@
         </w:rPr>
       </w:pPr>
     </w:p>
+    <w:p>
+      <w:r>
+        <w:rPr>
+          <w:rFonts w:hint="eastAsia"/>
+        </w:rPr>
+        <w:t>第十六课作业：</w:t>
+      </w:r>
+    </w:p>
+    <w:p>
+      <w:pPr>
+        <w:pStyle w:val="ListParagraph"/>
+        <w:numPr>
+          <w:ilvl w:val="0"/>
+          <w:numId w:val="6"/>
+        </w:numPr>
+        <w:rPr>
+          <w:rStyle w:val="HTMLCode"/>
+          <w:rFonts w:eastAsiaTheme="minorEastAsia"/>
+        </w:rPr>
+      </w:pPr>
+      <w:r>
+        <w:rPr>
+          <w:rFonts w:hint="eastAsia"/>
+        </w:rPr>
+        <w:t>如果</w:t>
+      </w:r>
+      <w:r>
+        <w:rPr>
+          <w:rStyle w:val="HTMLCode"/>
+          <w:rFonts w:eastAsiaTheme="minorEastAsia"/>
+        </w:rPr>
+        <w:t>investigator_llm #1</w:t>
+      </w:r>
+      <w:r>
+        <w:t xml:space="preserve"> </w:t>
+      </w:r>
+      <w:r>
+        <w:t>同时产生两个</w:t>
+      </w:r>
+      <w:r>
+        <w:t xml:space="preserve"> </w:t>
+      </w:r>
+      <w:r>
+        <w:rPr>
+          <w:rStyle w:val="HTMLCode"/>
+          <w:rFonts w:eastAsiaTheme="minorEastAsia"/>
+        </w:rPr>
+        <w:t>tool_calls</w:t>
+      </w:r>
+      <w:r>
+        <w:rPr>
+          <w:rStyle w:val="HTMLCode"/>
+          <w:rFonts w:eastAsiaTheme="minorEastAsia" w:hint="eastAsia"/>
+        </w:rPr>
+        <w:t>，</w:t>
+      </w:r>
+      <w:r>
+        <w:rPr>
+          <w:rStyle w:val="HTMLCode"/>
+          <w:rFonts w:eastAsiaTheme="minorEastAsia" w:hint="eastAsia"/>
+        </w:rPr>
+        <w:t>ToolNode</w:t>
+      </w:r>
+      <w:r>
+        <w:rPr>
+          <w:rStyle w:val="HTMLCode"/>
+          <w:rFonts w:eastAsiaTheme="minorEastAsia" w:hint="eastAsia"/>
+        </w:rPr>
+        <w:t>执行一次，</w:t>
+      </w:r>
+      <w:r>
+        <w:rPr>
+          <w:rStyle w:val="HTMLCode"/>
+          <w:rFonts w:eastAsiaTheme="minorEastAsia" w:hint="eastAsia"/>
+        </w:rPr>
+        <w:t>ToolNode</w:t>
+      </w:r>
+      <w:r>
+        <w:rPr>
+          <w:rStyle w:val="HTMLCode"/>
+          <w:rFonts w:eastAsiaTheme="minorEastAsia" w:hint="eastAsia"/>
+        </w:rPr>
+        <w:t>内部会调用</w:t>
+      </w:r>
+      <w:r>
+        <w:rPr>
+          <w:rStyle w:val="HTMLCode"/>
+          <w:rFonts w:eastAsiaTheme="minorEastAsia" w:hint="eastAsia"/>
+        </w:rPr>
+        <w:t>lookup_history</w:t>
+      </w:r>
+      <w:r>
+        <w:rPr>
+          <w:rStyle w:val="HTMLCode"/>
+          <w:rFonts w:eastAsiaTheme="minorEastAsia" w:hint="eastAsia"/>
+        </w:rPr>
+        <w:t>和</w:t>
+      </w:r>
+      <w:r>
+        <w:rPr>
+          <w:rStyle w:val="HTMLCode"/>
+          <w:rFonts w:eastAsiaTheme="minorEastAsia" w:hint="eastAsia"/>
+        </w:rPr>
+        <w:t>retrieve_rag</w:t>
+      </w:r>
+    </w:p>
+    <w:p>
+      <w:pPr>
+        <w:pStyle w:val="ListParagraph"/>
+        <w:numPr>
+          <w:ilvl w:val="0"/>
+          <w:numId w:val="6"/>
+        </w:numPr>
+        <w:rPr>
+          <w:rFonts w:hint="eastAsia"/>
+          <w:strike/>
+        </w:rPr>
+      </w:pPr>
+      <w:r>
+        <w:rPr>
+          <w:rFonts w:hint="eastAsia"/>
+          <w:strike/>
+        </w:rPr>
+        <w:lastRenderedPageBreak/>
+        <w:t>LLM</w:t>
+      </w:r>
+      <w:r>
+        <w:rPr>
+          <w:rFonts w:hint="eastAsia"/>
+          <w:strike/>
+        </w:rPr>
+        <w:t>无法根据历史消息进行观察和反思，</w:t>
+      </w:r>
+      <w:r>
+        <w:rPr>
+          <w:rFonts w:hint="eastAsia"/>
+          <w:strike/>
+        </w:rPr>
+        <w:t>因为没有调用</w:t>
+      </w:r>
+      <w:r>
+        <w:rPr>
+          <w:rFonts w:hint="eastAsia"/>
+          <w:strike/>
+        </w:rPr>
+        <w:t>rag</w:t>
+      </w:r>
+      <w:r>
+        <w:rPr>
+          <w:rFonts w:hint="eastAsia"/>
+          <w:strike/>
+        </w:rPr>
+        <w:t>和历史日志来分析异常原因，所以</w:t>
+      </w:r>
+      <w:r>
+        <w:rPr>
+          <w:rFonts w:hint="eastAsia"/>
+          <w:strike/>
+        </w:rPr>
+        <w:t>LLM</w:t>
+      </w:r>
+      <w:r>
+        <w:rPr>
+          <w:rFonts w:hint="eastAsia"/>
+          <w:strike/>
+        </w:rPr>
+        <w:t>没有分析</w:t>
+      </w:r>
+      <w:r>
+        <w:rPr>
+          <w:rFonts w:hint="eastAsia"/>
+          <w:strike/>
+        </w:rPr>
+        <w:t>possible causes</w:t>
+      </w:r>
+      <w:r>
+        <w:rPr>
+          <w:rFonts w:hint="eastAsia"/>
+          <w:strike/>
+        </w:rPr>
+        <w:t xml:space="preserve">  </w:t>
+      </w:r>
+      <w:r>
+        <w:rPr>
+          <w:rFonts w:hint="eastAsia"/>
+        </w:rPr>
+        <w:t>缺少</w:t>
+      </w:r>
+      <w:r>
+        <w:rPr>
+          <w:rFonts w:hint="eastAsia"/>
+        </w:rPr>
+        <w:t>ToolNode</w:t>
+      </w:r>
+      <w:r>
+        <w:rPr>
+          <w:rFonts w:hint="eastAsia"/>
+        </w:rPr>
+        <w:t>执行后重新进入</w:t>
+      </w:r>
+      <w:r>
+        <w:rPr>
+          <w:rFonts w:hint="eastAsia"/>
+        </w:rPr>
+        <w:t>LLM</w:t>
+      </w:r>
+      <w:r>
+        <w:rPr>
+          <w:rFonts w:hint="eastAsia"/>
+        </w:rPr>
+        <w:t>的控制流</w:t>
+      </w:r>
+      <w:r>
+        <w:rPr>
+          <w:rFonts w:hint="eastAsia"/>
+        </w:rPr>
+        <w:t xml:space="preserve">, </w:t>
+      </w:r>
+      <w:r>
+        <w:rPr>
+          <w:rFonts w:hint="eastAsia"/>
+        </w:rPr>
+        <w:t>无法让</w:t>
+      </w:r>
+      <w:r>
+        <w:rPr>
+          <w:rFonts w:hint="eastAsia"/>
+        </w:rPr>
+        <w:t>LLM</w:t>
+      </w:r>
+      <w:r>
+        <w:rPr>
+          <w:rFonts w:hint="eastAsia"/>
+        </w:rPr>
+        <w:t>读取新生成的</w:t>
+      </w:r>
+      <w:r>
+        <w:rPr>
+          <w:rFonts w:hint="eastAsia"/>
+        </w:rPr>
+        <w:t>ToolMessage</w:t>
+      </w:r>
+    </w:p>
+    <w:p>
+      <w:pPr>
+        <w:pStyle w:val="ListParagraph"/>
+        <w:numPr>
+          <w:ilvl w:val="0"/>
+          <w:numId w:val="6"/>
+        </w:numPr>
+      </w:pPr>
+      <w:proofErr w:type="spellStart"/>
+      <w:r>
+        <w:rPr>
+          <w:lang w:val="en-US"/>
+        </w:rPr>
+        <w:t>Q</w:t>
+      </w:r>
+      <w:r>
+        <w:rPr>
+          <w:rFonts w:hint="eastAsia"/>
+          <w:lang w:val="en-US"/>
+        </w:rPr>
+        <w:t>uery_api_usage</w:t>
+      </w:r>
+      <w:proofErr w:type="spellEnd"/>
+      <w:r>
+        <w:rPr>
+          <w:rFonts w:hint="eastAsia"/>
+          <w:lang w:val="en-US"/>
+        </w:rPr>
+        <w:t>，</w:t>
+      </w:r>
+      <w:proofErr w:type="spellStart"/>
+      <w:r>
+        <w:rPr>
+          <w:rFonts w:hint="eastAsia"/>
+          <w:lang w:val="en-US"/>
+        </w:rPr>
+        <w:t>detect_anomaly</w:t>
+      </w:r>
+      <w:proofErr w:type="spellEnd"/>
+      <w:r>
+        <w:rPr>
+          <w:rFonts w:hint="eastAsia"/>
+          <w:lang w:val="en-US"/>
+        </w:rPr>
+        <w:t>,</w:t>
+      </w:r>
+      <w:r>
+        <w:rPr>
+          <w:rFonts w:hint="eastAsia"/>
+          <w:lang w:val="en-US"/>
+        </w:rPr>
+        <w:t xml:space="preserve"> </w:t>
+      </w:r>
+      <w:proofErr w:type="spellStart"/>
+      <w:r>
+        <w:rPr>
+          <w:rFonts w:hint="eastAsia"/>
+          <w:lang w:val="en-US"/>
+        </w:rPr>
+        <w:t>prepare_investigation</w:t>
+      </w:r>
+      <w:proofErr w:type="spellEnd"/>
+      <w:r>
+        <w:rPr>
+          <w:rFonts w:hint="eastAsia"/>
+          <w:lang w:val="en-US"/>
+        </w:rPr>
+        <w:t xml:space="preserve">, </w:t>
+      </w:r>
+      <w:proofErr w:type="spellStart"/>
+      <w:r>
+        <w:rPr>
+          <w:rFonts w:hint="eastAsia"/>
+          <w:lang w:val="en-US"/>
+        </w:rPr>
+        <w:t>investigate_llm,</w:t>
+      </w:r>
+      <w:r>
+        <w:rPr>
+          <w:rFonts w:hint="eastAsia"/>
+          <w:strike/>
+          <w:lang w:val="en-US"/>
+        </w:rPr>
+        <w:t>route_investigation</w:t>
+      </w:r>
+      <w:proofErr w:type="spellEnd"/>
+      <w:r>
+        <w:rPr>
+          <w:rFonts w:hint="eastAsia"/>
+          <w:strike/>
+          <w:lang w:val="en-US"/>
+        </w:rPr>
+        <w:t>,</w:t>
+      </w:r>
+      <w:r>
+        <w:rPr>
+          <w:rFonts w:hint="eastAsia"/>
+          <w:lang w:val="en-US"/>
+        </w:rPr>
+        <w:t>以及</w:t>
+      </w:r>
+      <w:proofErr w:type="spellStart"/>
+      <w:r>
+        <w:rPr>
+          <w:rFonts w:hint="eastAsia"/>
+          <w:lang w:val="en-US"/>
+        </w:rPr>
+        <w:t>investigator_finish</w:t>
+      </w:r>
+      <w:proofErr w:type="spellEnd"/>
+      <w:r>
+        <w:rPr>
+          <w:rFonts w:hint="eastAsia"/>
+          <w:lang w:val="en-US"/>
+        </w:rPr>
+        <w:t>；</w:t>
+      </w:r>
+    </w:p>
+    <w:p>
+      <w:pPr>
+        <w:pStyle w:val="ListParagraph"/>
+        <w:numPr>
+          <w:ilvl w:val="0"/>
+          <w:numId w:val="6"/>
+        </w:numPr>
+      </w:pPr>
+      <w:r>
+        <w:rPr>
+          <w:rFonts w:hint="eastAsia"/>
+          <w:lang w:val="en-US"/>
+        </w:rPr>
+        <w:t>结构上已经实现了结构，子图的</w:t>
+      </w:r>
+      <w:r>
+        <w:rPr>
+          <w:rFonts w:hint="eastAsia"/>
+          <w:lang w:val="en-US"/>
+        </w:rPr>
+        <w:t>Agent Loop</w:t>
+      </w:r>
+      <w:r>
+        <w:rPr>
+          <w:rFonts w:hint="eastAsia"/>
+          <w:lang w:val="en-US"/>
+        </w:rPr>
+        <w:t>不影响父图</w:t>
+      </w:r>
+    </w:p>
+    <w:p>
+      <w:pPr>
+        <w:pStyle w:val="ListParagraph"/>
+        <w:numPr>
+          <w:ilvl w:val="0"/>
+          <w:numId w:val="6"/>
+        </w:numPr>
+      </w:pPr>
+      <w:r>
+        <w:rPr>
+          <w:rFonts w:hint="eastAsia"/>
+          <w:lang w:val="en-US"/>
+        </w:rPr>
+        <w:t>循环保护放在子图的</w:t>
+      </w:r>
+      <w:proofErr w:type="spellStart"/>
+      <w:r>
+        <w:rPr>
+          <w:rFonts w:hint="eastAsia"/>
+          <w:lang w:val="en-US"/>
+        </w:rPr>
+        <w:t>investigate_llm</w:t>
+      </w:r>
+      <w:proofErr w:type="spellEnd"/>
+      <w:r>
+        <w:rPr>
+          <w:rFonts w:hint="eastAsia"/>
+          <w:lang w:val="en-US"/>
+        </w:rPr>
+        <w:t>节点，</w:t>
+      </w:r>
+      <w:r>
+        <w:rPr>
+          <w:rFonts w:hint="eastAsia"/>
+          <w:lang w:val="en-US"/>
+        </w:rPr>
+        <w:t>state</w:t>
+      </w:r>
+      <w:r>
+        <w:rPr>
+          <w:rFonts w:hint="eastAsia"/>
+          <w:lang w:val="en-US"/>
+        </w:rPr>
+        <w:t>至少要记录当前循环次数</w:t>
+      </w:r>
+    </w:p>
+    <w:p>
+      <w:r>
+        <w:rPr>
+          <w:rFonts w:hint="eastAsia"/>
+        </w:rPr>
+        <w:t>第十七课作业：</w:t>
+      </w:r>
+    </w:p>
+    <w:p>
+      <w:pPr>
+        <w:rPr>
+          <w:rFonts w:hint="eastAsia"/>
+        </w:rPr>
+      </w:pPr>
+      <w:r>
+        <w:rPr>
+          <w:rFonts w:hint="eastAsia"/>
+        </w:rPr>
+        <w:t>(1)</w:t>
+      </w:r>
+      <w:r>
+        <w:rPr>
+          <w:rFonts w:hint="eastAsia"/>
+        </w:rPr>
+        <w:t>我认为主要是权责分离，</w:t>
+      </w:r>
+      <w:r>
+        <w:rPr>
+          <w:rFonts w:hint="eastAsia"/>
+        </w:rPr>
+        <w:t>LLM</w:t>
+      </w:r>
+      <w:r>
+        <w:rPr>
+          <w:rFonts w:hint="eastAsia"/>
+        </w:rPr>
+        <w:t>节点根据提示词专心处理</w:t>
+      </w:r>
+      <w:r>
+        <w:rPr>
+          <w:rFonts w:hint="eastAsia"/>
+        </w:rPr>
+        <w:t>messages</w:t>
+      </w:r>
+      <w:r>
+        <w:rPr>
+          <w:rFonts w:hint="eastAsia"/>
+        </w:rPr>
+        <w:t>；</w:t>
+      </w:r>
+      <w:r>
+        <w:rPr>
+          <w:rFonts w:hint="eastAsia"/>
+        </w:rPr>
+        <w:t xml:space="preserve"> LLM</w:t>
+      </w:r>
+      <w:r>
+        <w:rPr>
+          <w:rFonts w:hint="eastAsia"/>
+          <w:b/>
+          <w:bCs/>
+        </w:rPr>
+        <w:t>负责理解上下文、决策、生成工具调用</w:t>
+      </w:r>
+      <w:r>
+        <w:rPr>
+          <w:rFonts w:hint="eastAsia"/>
+        </w:rPr>
+        <w:t>；</w:t>
+      </w:r>
+      <w:r>
+        <w:rPr>
+          <w:rFonts w:hint="eastAsia"/>
+          <w:b/>
+          <w:bCs/>
+        </w:rPr>
+        <w:t>Loop Guard</w:t>
+      </w:r>
+      <w:r>
+        <w:rPr>
+          <w:rFonts w:hint="eastAsia"/>
+          <w:b/>
+          <w:bCs/>
+        </w:rPr>
+        <w:t>：负责检查重复动作、执行次数和停止条件；</w:t>
+      </w:r>
+      <w:r>
+        <w:rPr>
+          <w:rFonts w:hint="eastAsia"/>
+          <w:b/>
+          <w:bCs/>
+        </w:rPr>
+        <w:t>ToolNode</w:t>
+      </w:r>
+      <w:r>
+        <w:rPr>
+          <w:rFonts w:hint="eastAsia"/>
+          <w:b/>
+          <w:bCs/>
+        </w:rPr>
+        <w:t>：负责真正执行工具</w:t>
+      </w:r>
+    </w:p>
+    <w:p>
+      <w:pPr>
+        <w:rPr>
+          <w:rFonts w:hint="eastAsia"/>
+          <w:lang w:val="en-US"/>
+        </w:rPr>
+      </w:pPr>
+      <w:r>
+        <w:rPr>
+          <w:rFonts w:hint="eastAsia"/>
+        </w:rPr>
+        <w:t>(2)</w:t>
+      </w:r>
+      <w:r>
+        <w:rPr>
+          <w:rFonts w:hint="eastAsia"/>
+        </w:rPr>
+        <w:t>不能，</w:t>
+      </w:r>
+      <w:r>
+        <w:rPr>
+          <w:rFonts w:hint="eastAsia"/>
+        </w:rPr>
+        <w:t>LLM</w:t>
+      </w:r>
+      <w:r>
+        <w:rPr>
+          <w:rFonts w:hint="eastAsia"/>
+        </w:rPr>
+        <w:t>可能认为还需要调用一部分</w:t>
+      </w:r>
+      <w:r>
+        <w:rPr>
+          <w:rFonts w:hint="eastAsia"/>
+        </w:rPr>
+        <w:t>lookup</w:t>
+      </w:r>
+      <w:r>
+        <w:rPr>
+          <w:rFonts w:hint="eastAsia"/>
+        </w:rPr>
+        <w:t>日志而去调用</w:t>
+      </w:r>
+      <w:r>
+        <w:rPr>
+          <w:rFonts w:hint="eastAsia"/>
+        </w:rPr>
+        <w:t>lookup_history</w:t>
+      </w:r>
+    </w:p>
+    <w:p>
+      <w:r>
+        <w:rPr>
+          <w:rFonts w:hint="eastAsia"/>
+        </w:rPr>
+        <w:t>(3)</w:t>
+      </w:r>
+      <w:r>
+        <w:rPr>
+          <w:rFonts w:hint="eastAsia"/>
+        </w:rPr>
+        <w:t>我不会直接阻断，我不清楚还需要记录什么信息，来更合理判断在推进</w:t>
+      </w:r>
+    </w:p>
     <w:p/>
+    <w:p>
+      <w:r>
+        <w:rPr>
+          <w:rFonts w:hint="eastAsia"/>
+        </w:rPr>
+        <w:t>第十八课作业：</w:t>
+      </w:r>
+    </w:p>
+    <w:p>
+      <w:pPr>
+        <w:pStyle w:val="ListParagraph"/>
+        <w:numPr>
+          <w:ilvl w:val="0"/>
+          <w:numId w:val="7"/>
+        </w:numPr>
+        <w:rPr>
+          <w:rFonts w:hint="eastAsia"/>
+        </w:rPr>
+      </w:pPr>
+      <w:r>
+        <w:rPr>
+          <w:rFonts w:hint="eastAsia"/>
+        </w:rPr>
+        <w:t>我会返回</w:t>
+      </w:r>
+      <w:r>
+        <w:t>{"status": "failed", "anomaly_detected": None}</w:t>
+      </w:r>
+      <w:r>
+        <w:rPr>
+          <w:rFonts w:hint="eastAsia"/>
+        </w:rPr>
+        <w:t>，</w:t>
+      </w:r>
+      <w:r>
+        <w:rPr>
+          <w:rFonts w:hint="eastAsia"/>
+        </w:rPr>
+        <w:t>sql</w:t>
+      </w:r>
+      <w:r>
+        <w:rPr>
+          <w:rFonts w:hint="eastAsia"/>
+        </w:rPr>
+        <w:t>查询失败可以视为</w:t>
+      </w:r>
+      <w:r>
+        <w:rPr>
+          <w:rFonts w:hint="eastAsia"/>
+        </w:rPr>
+        <w:t>api usage</w:t>
+      </w:r>
+      <w:r>
+        <w:rPr>
+          <w:rFonts w:hint="eastAsia"/>
+        </w:rPr>
+        <w:t>这个子</w:t>
+      </w:r>
+      <w:r>
+        <w:rPr>
+          <w:rFonts w:hint="eastAsia"/>
+        </w:rPr>
+        <w:t>agent</w:t>
+      </w:r>
+      <w:r>
+        <w:rPr>
+          <w:rFonts w:hint="eastAsia"/>
+        </w:rPr>
+        <w:t>状态失败，因此返回</w:t>
+      </w:r>
+      <w:r>
+        <w:rPr>
+          <w:rFonts w:hint="eastAsia"/>
+        </w:rPr>
+        <w:t>failed</w:t>
+      </w:r>
+      <w:r>
+        <w:rPr>
+          <w:rFonts w:hint="eastAsia"/>
+        </w:rPr>
+        <w:t>，并且无法检测到异常因素</w:t>
+      </w:r>
+      <w:r>
+        <w:rPr>
+          <w:rFonts w:hint="eastAsia"/>
+        </w:rPr>
+        <w:t>anomaly_detected</w:t>
+      </w:r>
+      <w:r>
+        <w:rPr>
+          <w:rFonts w:hint="eastAsia"/>
+        </w:rPr>
+        <w:t>返回</w:t>
+      </w:r>
+      <w:r>
+        <w:rPr>
+          <w:rFonts w:hint="eastAsia"/>
+        </w:rPr>
+        <w:t>None</w:t>
+      </w:r>
+      <w:r>
+        <w:rPr>
+          <w:rFonts w:hint="eastAsia"/>
+        </w:rPr>
+        <w:t>；</w:t>
+      </w:r>
+      <w:r>
+        <w:rPr>
+          <w:rFonts w:hint="eastAsia"/>
+        </w:rPr>
+        <w:t>sql</w:t>
+      </w:r>
+      <w:r>
+        <w:rPr>
+          <w:rFonts w:hint="eastAsia"/>
+        </w:rPr>
+        <w:t>第一次查询失败，不一定将整个子</w:t>
+      </w:r>
+      <w:r>
+        <w:rPr>
+          <w:rFonts w:hint="eastAsia"/>
+        </w:rPr>
+        <w:t>agent</w:t>
+      </w:r>
+      <w:r>
+        <w:rPr>
+          <w:rFonts w:hint="eastAsia"/>
+        </w:rPr>
+        <w:t>标记为</w:t>
+      </w:r>
+      <w:r>
+        <w:rPr>
+          <w:rFonts w:hint="eastAsia"/>
+        </w:rPr>
+        <w:t>failed</w:t>
+      </w:r>
+      <w:r>
+        <w:rPr>
+          <w:rFonts w:hint="eastAsia"/>
+        </w:rPr>
+        <w:t>，如果是可恢复的超时或参数错误，可以先重试或修正，只有当子</w:t>
+      </w:r>
+      <w:r>
+        <w:rPr>
+          <w:rFonts w:hint="eastAsia"/>
+        </w:rPr>
+        <w:t>Agent</w:t>
+      </w:r>
+      <w:r>
+        <w:rPr>
+          <w:rFonts w:hint="eastAsia"/>
+        </w:rPr>
+        <w:t>无法完成任务时，才返回最终的失败结果。</w:t>
+      </w:r>
+    </w:p>
+    <w:p>
+      <w:pPr>
+        <w:pStyle w:val="ListParagraph"/>
+        <w:numPr>
+          <w:ilvl w:val="0"/>
+          <w:numId w:val="7"/>
+        </w:numPr>
+      </w:pPr>
+      <w:r>
+        <w:rPr>
+          <w:rFonts w:hint="eastAsia"/>
+        </w:rPr>
+        <w:t>不能，</w:t>
+      </w:r>
+      <w:r>
+        <w:rPr>
+          <w:rFonts w:hint="eastAsia"/>
+        </w:rPr>
+        <w:t>status</w:t>
+      </w:r>
+      <w:r>
+        <w:rPr>
+          <w:rFonts w:hint="eastAsia"/>
+        </w:rPr>
+        <w:t>表示子</w:t>
+      </w:r>
+      <w:r>
+        <w:rPr>
+          <w:rFonts w:hint="eastAsia"/>
+        </w:rPr>
+        <w:t>agent</w:t>
+      </w:r>
+      <w:r>
+        <w:rPr>
+          <w:rFonts w:hint="eastAsia"/>
+        </w:rPr>
+        <w:t>整体的状态，</w:t>
+      </w:r>
+      <w:r>
+        <w:rPr>
+          <w:rFonts w:hint="eastAsia"/>
+        </w:rPr>
+        <w:t>anomaly_detected</w:t>
+      </w:r>
+      <w:r>
+        <w:rPr>
+          <w:rFonts w:hint="eastAsia"/>
+        </w:rPr>
+        <w:t>指示子</w:t>
+      </w:r>
+      <w:r>
+        <w:rPr>
+          <w:rFonts w:hint="eastAsia"/>
+        </w:rPr>
+        <w:t>agent</w:t>
+      </w:r>
+      <w:r>
+        <w:rPr>
+          <w:rFonts w:hint="eastAsia"/>
+        </w:rPr>
+        <w:t>中异常检测的状态，如果只保留</w:t>
+      </w:r>
+      <w:r>
+        <w:rPr>
+          <w:rFonts w:hint="eastAsia"/>
+        </w:rPr>
+        <w:t>status</w:t>
+      </w:r>
+      <w:r>
+        <w:rPr>
+          <w:rFonts w:hint="eastAsia"/>
+        </w:rPr>
+        <w:t>，状态就比较模糊，例如</w:t>
+      </w:r>
+      <w:r>
+        <w:rPr>
+          <w:rFonts w:hint="eastAsia"/>
+        </w:rPr>
+        <w:t>status</w:t>
+      </w:r>
+      <w:r>
+        <w:rPr>
+          <w:rFonts w:hint="eastAsia"/>
+        </w:rPr>
+        <w:t>显示</w:t>
+      </w:r>
+      <w:r>
+        <w:rPr>
+          <w:rFonts w:hint="eastAsia"/>
+        </w:rPr>
+        <w:t>failed</w:t>
+      </w:r>
+      <w:r>
+        <w:rPr>
+          <w:rFonts w:hint="eastAsia"/>
+        </w:rPr>
+        <w:t>，但是不知道是因为异常检测失败还是其他原因失败</w:t>
+      </w:r>
+      <w:r>
+        <w:rPr>
+          <w:rFonts w:hint="eastAsia"/>
+        </w:rPr>
+        <w:t xml:space="preserve">; </w:t>
+      </w:r>
+      <w:r>
+        <w:rPr>
+          <w:rFonts w:hint="eastAsia"/>
+          <w:b/>
+          <w:bCs/>
+        </w:rPr>
+        <w:t>status</w:t>
+      </w:r>
+      <w:r>
+        <w:rPr>
+          <w:rFonts w:hint="eastAsia"/>
+          <w:b/>
+          <w:bCs/>
+        </w:rPr>
+        <w:t>表示任务执行结果，</w:t>
+      </w:r>
+      <w:r>
+        <w:rPr>
+          <w:rFonts w:hint="eastAsia"/>
+          <w:b/>
+          <w:bCs/>
+        </w:rPr>
+        <w:t>anomaly_detected</w:t>
+      </w:r>
+      <w:r>
+        <w:rPr>
+          <w:rFonts w:hint="eastAsia"/>
+          <w:b/>
+          <w:bCs/>
+        </w:rPr>
+        <w:t>表示业务分析结论。</w:t>
+      </w:r>
+    </w:p>
+    <w:p>
+      <w:pPr>
+        <w:pStyle w:val="ListParagraph"/>
+        <w:numPr>
+          <w:ilvl w:val="0"/>
+          <w:numId w:val="7"/>
+        </w:numPr>
+      </w:pPr>
+      <w:r>
+        <w:rPr>
+          <w:rFonts w:hint="eastAsia"/>
+        </w:rPr>
+        <w:t>子图内部处理，因为</w:t>
+      </w:r>
+      <w:r>
+        <w:rPr>
+          <w:rFonts w:hint="eastAsia"/>
+        </w:rPr>
+        <w:t>possible_causes</w:t>
+      </w:r>
+      <w:r>
+        <w:rPr>
+          <w:rFonts w:hint="eastAsia"/>
+        </w:rPr>
+        <w:t>的错误是子图中发生的错误，因此直觉上我觉得首先在子图内部处理</w:t>
+      </w:r>
+    </w:p>
+    <w:p>
+      <w:pPr>
+        <w:pStyle w:val="ListParagraph"/>
+        <w:numPr>
+          <w:ilvl w:val="0"/>
+          <w:numId w:val="7"/>
+        </w:numPr>
+      </w:pPr>
+      <w:r>
+        <w:rPr>
+          <w:rFonts w:hint="eastAsia"/>
+        </w:rPr>
+        <w:t>不应该，这个例子中所有</w:t>
+      </w:r>
+      <w:r>
+        <w:rPr>
+          <w:rFonts w:hint="eastAsia"/>
+        </w:rPr>
+        <w:t>api</w:t>
+      </w:r>
+      <w:r>
+        <w:rPr>
+          <w:rFonts w:hint="eastAsia"/>
+        </w:rPr>
+        <w:t>的调用都在子图中进行，父图并不关心</w:t>
+      </w:r>
+      <w:r>
+        <w:rPr>
+          <w:rFonts w:hint="eastAsia"/>
+        </w:rPr>
+        <w:t>api_result</w:t>
+      </w:r>
+      <w:r>
+        <w:rPr>
+          <w:rFonts w:hint="eastAsia"/>
+        </w:rPr>
+        <w:t>的记录和内容</w:t>
+      </w:r>
+    </w:p>
+    <w:p>
+      <w:r>
+        <w:rPr>
+          <w:rFonts w:hint="eastAsia"/>
+        </w:rPr>
+        <w:t>第十九课：</w:t>
+      </w:r>
+    </w:p>
+    <w:p>
+      <w:pPr>
+        <w:pStyle w:val="NormalWeb"/>
+      </w:pPr>
+      <w:r>
+        <w:rPr>
+          <w:rFonts w:ascii="SimSun" w:eastAsia="SimSun" w:hAnsi="SimSun" w:cs="SimSun" w:hint="eastAsia"/>
+        </w:rPr>
+        <w:lastRenderedPageBreak/>
+        <w:t>待解决的问题：</w:t>
+      </w:r>
+      <w:r>
+        <w:rPr>
+          <w:rFonts w:ascii="SimSun" w:eastAsia="SimSun" w:hAnsi="SimSun" w:cs="SimSun" w:hint="eastAsia"/>
+        </w:rPr>
+        <w:t>用户要求查询最近</w:t>
+      </w:r>
+      <w:r>
+        <w:t xml:space="preserve"> 7 </w:t>
+      </w:r>
+      <w:r>
+        <w:rPr>
+          <w:rFonts w:ascii="SimSun" w:eastAsia="SimSun" w:hAnsi="SimSun" w:cs="SimSun" w:hint="eastAsia"/>
+        </w:rPr>
+        <w:t>天的</w:t>
+      </w:r>
+      <w:r>
+        <w:t xml:space="preserve"> API </w:t>
+      </w:r>
+      <w:r>
+        <w:rPr>
+          <w:rFonts w:ascii="SimSun" w:eastAsia="SimSun" w:hAnsi="SimSun" w:cs="SimSun" w:hint="eastAsia"/>
+        </w:rPr>
+        <w:t>调用趋势。如果</w:t>
+      </w:r>
+      <w:r>
+        <w:t xml:space="preserve"> SQL </w:t>
+      </w:r>
+      <w:r>
+        <w:rPr>
+          <w:rFonts w:ascii="SimSun" w:eastAsia="SimSun" w:hAnsi="SimSun" w:cs="SimSun" w:hint="eastAsia"/>
+        </w:rPr>
+        <w:t>查询失败、</w:t>
+      </w:r>
+      <w:r>
+        <w:t xml:space="preserve">LLM </w:t>
+      </w:r>
+      <w:r>
+        <w:rPr>
+          <w:rFonts w:ascii="SimSun" w:eastAsia="SimSun" w:hAnsi="SimSun" w:cs="SimSun" w:hint="eastAsia"/>
+        </w:rPr>
+        <w:t>输出了错误</w:t>
+      </w:r>
+      <w:r>
+        <w:t xml:space="preserve"> JSON</w:t>
+      </w:r>
+      <w:r>
+        <w:rPr>
+          <w:rFonts w:ascii="SimSun" w:eastAsia="SimSun" w:hAnsi="SimSun" w:cs="SimSun" w:hint="eastAsia"/>
+        </w:rPr>
+        <w:t>，或者</w:t>
+      </w:r>
+      <w:r>
+        <w:t xml:space="preserve"> Agent </w:t>
+      </w:r>
+      <w:r>
+        <w:rPr>
+          <w:rFonts w:ascii="SimSun" w:eastAsia="SimSun" w:hAnsi="SimSun" w:cs="SimSun" w:hint="eastAsia"/>
+        </w:rPr>
+        <w:t>反复调用同一个工具，你的整个多</w:t>
+      </w:r>
+      <w:r>
+        <w:t xml:space="preserve"> Agent </w:t>
+      </w:r>
+      <w:r>
+        <w:rPr>
+          <w:rFonts w:ascii="SimSun" w:eastAsia="SimSun" w:hAnsi="SimSun" w:cs="SimSun" w:hint="eastAsia"/>
+        </w:rPr>
+        <w:t>系统应该怎么处理？</w:t>
+      </w:r>
+    </w:p>
+    <w:p>
+      <w:pPr>
+        <w:rPr>
+          <w:rFonts w:hint="eastAsia"/>
+        </w:rPr>
+      </w:pPr>
+    </w:p>
+    <w:p>
+      <w:pPr>
+        <w:rPr>
+          <w:rFonts w:hint="eastAsia"/>
+        </w:rPr>
+      </w:pPr>
+      <w:r>
+        <w:rPr>
+          <w:rFonts w:hint="eastAsia"/>
+        </w:rPr>
+        <w:t xml:space="preserve">      (1)</w:t>
+      </w:r>
+    </w:p>
     <w:sectPr>
       <w:pgSz w:w="12240" w:h="15840"/>
       <w:pgMar w:top="1440" w:right="1440" w:bottom="1440" w:left="1440" w:header="708" w:footer="708" w:gutter="0"/>
@@ -4424,6 +5530,96 @@
     </w:lvl>
   </w:abstractNum>
   <w:abstractNum w:abstractNumId="1" w15:restartNumberingAfterBreak="0">
+    <w:nsid w:val="3CBB1FB0"/>
+    <w:multiLevelType w:val="hybridMultilevel"/>
+    <w:tmpl w:val="165899D6"/>
+    <w:lvl w:ilvl="0" w:tplc="BDB2DE70">
+      <w:start w:val="1"/>
+      <w:numFmt w:val="decimal"/>
+      <w:lvlText w:val="(%1)"/>
+      <w:lvlJc w:val="left"/>
+      <w:pPr>
+        <w:ind w:left="720" w:hanging="360"/>
+      </w:pPr>
+      <w:rPr>
+        <w:rFonts w:asciiTheme="minorHAnsi" w:hAnsiTheme="minorHAnsi" w:cstheme="minorBidi" w:hint="default"/>
+        <w:sz w:val="24"/>
+      </w:rPr>
+    </w:lvl>
+    <w:lvl w:ilvl="1" w:tplc="04090019" w:tentative="1">
+      <w:start w:val="1"/>
+      <w:numFmt w:val="lowerLetter"/>
+      <w:lvlText w:val="%2."/>
+      <w:lvlJc w:val="left"/>
+      <w:pPr>
+        <w:ind w:left="1440" w:hanging="360"/>
+      </w:pPr>
+    </w:lvl>
+    <w:lvl w:ilvl="2" w:tplc="0409001B" w:tentative="1">
+      <w:start w:val="1"/>
+      <w:numFmt w:val="lowerRoman"/>
+      <w:lvlText w:val="%3."/>
+      <w:lvlJc w:val="right"/>
+      <w:pPr>
+        <w:ind w:left="2160" w:hanging="180"/>
+      </w:pPr>
+    </w:lvl>
+    <w:lvl w:ilvl="3" w:tplc="0409000F" w:tentative="1">
+      <w:start w:val="1"/>
+      <w:numFmt w:val="decimal"/>
+      <w:lvlText w:val="%4."/>
+      <w:lvlJc w:val="left"/>
+      <w:pPr>
+        <w:ind w:left="2880" w:hanging="360"/>
+      </w:pPr>
+    </w:lvl>
+    <w:lvl w:ilvl="4" w:tplc="04090019" w:tentative="1">
+      <w:start w:val="1"/>
+      <w:numFmt w:val="lowerLetter"/>
+      <w:lvlText w:val="%5."/>
+      <w:lvlJc w:val="left"/>
+      <w:pPr>
+        <w:ind w:left="3600" w:hanging="360"/>
+      </w:pPr>
+    </w:lvl>
+    <w:lvl w:ilvl="5" w:tplc="0409001B" w:tentative="1">
+      <w:start w:val="1"/>
+      <w:numFmt w:val="lowerRoman"/>
+      <w:lvlText w:val="%6."/>
+      <w:lvlJc w:val="right"/>
+      <w:pPr>
+        <w:ind w:left="4320" w:hanging="180"/>
+      </w:pPr>
+    </w:lvl>
+    <w:lvl w:ilvl="6" w:tplc="0409000F" w:tentative="1">
+      <w:start w:val="1"/>
+      <w:numFmt w:val="decimal"/>
+      <w:lvlText w:val="%7."/>
+      <w:lvlJc w:val="left"/>
+      <w:pPr>
+        <w:ind w:left="5040" w:hanging="360"/>
+      </w:pPr>
+    </w:lvl>
+    <w:lvl w:ilvl="7" w:tplc="04090019" w:tentative="1">
+      <w:start w:val="1"/>
+      <w:numFmt w:val="lowerLetter"/>
+      <w:lvlText w:val="%8."/>
+      <w:lvlJc w:val="left"/>
+      <w:pPr>
+        <w:ind w:left="5760" w:hanging="360"/>
+      </w:pPr>
+    </w:lvl>
+    <w:lvl w:ilvl="8" w:tplc="0409001B" w:tentative="1">
+      <w:start w:val="1"/>
+      <w:numFmt w:val="lowerRoman"/>
+      <w:lvlText w:val="%9."/>
+      <w:lvlJc w:val="right"/>
+      <w:pPr>
+        <w:ind w:left="6480" w:hanging="180"/>
+      </w:pPr>
+    </w:lvl>
+  </w:abstractNum>
+  <w:abstractNum w:abstractNumId="2" w15:restartNumberingAfterBreak="0">
     <w:nsid w:val="3CD1689B"/>
     <w:multiLevelType w:val="hybridMultilevel"/>
     <w:tmpl w:val="56463592"/>
@@ -4512,7 +5708,7 @@
       </w:pPr>
     </w:lvl>
   </w:abstractNum>
-  <w:abstractNum w:abstractNumId="2" w15:restartNumberingAfterBreak="0">
+  <w:abstractNum w:abstractNumId="3" w15:restartNumberingAfterBreak="0">
     <w:nsid w:val="421F71C3"/>
     <w:multiLevelType w:val="hybridMultilevel"/>
     <w:tmpl w:val="45B0DC04"/>
@@ -4601,7 +5797,7 @@
       </w:pPr>
     </w:lvl>
   </w:abstractNum>
-  <w:abstractNum w:abstractNumId="3" w15:restartNumberingAfterBreak="0">
+  <w:abstractNum w:abstractNumId="4" w15:restartNumberingAfterBreak="0">
     <w:nsid w:val="52C461F9"/>
     <w:multiLevelType w:val="hybridMultilevel"/>
     <w:tmpl w:val="0D7481E8"/>
@@ -4690,17 +5886,17 @@
       </w:pPr>
     </w:lvl>
   </w:abstractNum>
-  <w:abstractNum w:abstractNumId="4" w15:restartNumberingAfterBreak="0">
-    <w:nsid w:val="7E055483"/>
+  <w:abstractNum w:abstractNumId="5" w15:restartNumberingAfterBreak="0">
+    <w:nsid w:val="73497A13"/>
     <w:multiLevelType w:val="hybridMultilevel"/>
-    <w:tmpl w:val="B3229DB8"/>
-    <w:lvl w:ilvl="0" w:tplc="A1DE4DCA">
+    <w:tmpl w:val="4CD86FB6"/>
+    <w:lvl w:ilvl="0" w:tplc="F8822964">
       <w:start w:val="1"/>
       <w:numFmt w:val="decimal"/>
-      <w:lvlText w:val="（%1）"/>
+      <w:lvlText w:val="(%1)"/>
       <w:lvlJc w:val="left"/>
       <w:pPr>
-        <w:ind w:left="1080" w:hanging="720"/>
+        <w:ind w:left="720" w:hanging="360"/>
       </w:pPr>
       <w:rPr>
         <w:rFonts w:hint="default"/>
@@ -4779,20 +5975,115 @@
       </w:pPr>
     </w:lvl>
   </w:abstractNum>
+  <w:abstractNum w:abstractNumId="6" w15:restartNumberingAfterBreak="0">
+    <w:nsid w:val="7E055483"/>
+    <w:multiLevelType w:val="hybridMultilevel"/>
+    <w:tmpl w:val="B3229DB8"/>
+    <w:lvl w:ilvl="0" w:tplc="A1DE4DCA">
+      <w:start w:val="1"/>
+      <w:numFmt w:val="decimal"/>
+      <w:lvlText w:val="（%1）"/>
+      <w:lvlJc w:val="left"/>
+      <w:pPr>
+        <w:ind w:left="1080" w:hanging="720"/>
+      </w:pPr>
+      <w:rPr>
+        <w:rFonts w:hint="default"/>
+      </w:rPr>
+    </w:lvl>
+    <w:lvl w:ilvl="1" w:tplc="04090019" w:tentative="1">
+      <w:start w:val="1"/>
+      <w:numFmt w:val="lowerLetter"/>
+      <w:lvlText w:val="%2."/>
+      <w:lvlJc w:val="left"/>
+      <w:pPr>
+        <w:ind w:left="1440" w:hanging="360"/>
+      </w:pPr>
+    </w:lvl>
+    <w:lvl w:ilvl="2" w:tplc="0409001B" w:tentative="1">
+      <w:start w:val="1"/>
+      <w:numFmt w:val="lowerRoman"/>
+      <w:lvlText w:val="%3."/>
+      <w:lvlJc w:val="right"/>
+      <w:pPr>
+        <w:ind w:left="2160" w:hanging="180"/>
+      </w:pPr>
+    </w:lvl>
+    <w:lvl w:ilvl="3" w:tplc="0409000F" w:tentative="1">
+      <w:start w:val="1"/>
+      <w:numFmt w:val="decimal"/>
+      <w:lvlText w:val="%4."/>
+      <w:lvlJc w:val="left"/>
+      <w:pPr>
+        <w:ind w:left="2880" w:hanging="360"/>
+      </w:pPr>
+    </w:lvl>
+    <w:lvl w:ilvl="4" w:tplc="04090019" w:tentative="1">
+      <w:start w:val="1"/>
+      <w:numFmt w:val="lowerLetter"/>
+      <w:lvlText w:val="%5."/>
+      <w:lvlJc w:val="left"/>
+      <w:pPr>
+        <w:ind w:left="3600" w:hanging="360"/>
+      </w:pPr>
+    </w:lvl>
+    <w:lvl w:ilvl="5" w:tplc="0409001B" w:tentative="1">
+      <w:start w:val="1"/>
+      <w:numFmt w:val="lowerRoman"/>
+      <w:lvlText w:val="%6."/>
+      <w:lvlJc w:val="right"/>
+      <w:pPr>
+        <w:ind w:left="4320" w:hanging="180"/>
+      </w:pPr>
+    </w:lvl>
+    <w:lvl w:ilvl="6" w:tplc="0409000F" w:tentative="1">
+      <w:start w:val="1"/>
+      <w:numFmt w:val="decimal"/>
+      <w:lvlText w:val="%7."/>
+      <w:lvlJc w:val="left"/>
+      <w:pPr>
+        <w:ind w:left="5040" w:hanging="360"/>
+      </w:pPr>
+    </w:lvl>
+    <w:lvl w:ilvl="7" w:tplc="04090019" w:tentative="1">
+      <w:start w:val="1"/>
+      <w:numFmt w:val="lowerLetter"/>
+      <w:lvlText w:val="%8."/>
+      <w:lvlJc w:val="left"/>
+      <w:pPr>
+        <w:ind w:left="5760" w:hanging="360"/>
+      </w:pPr>
+    </w:lvl>
+    <w:lvl w:ilvl="8" w:tplc="0409001B" w:tentative="1">
+      <w:start w:val="1"/>
+      <w:numFmt w:val="lowerRoman"/>
+      <w:lvlText w:val="%9."/>
+      <w:lvlJc w:val="right"/>
+      <w:pPr>
+        <w:ind w:left="6480" w:hanging="180"/>
+      </w:pPr>
+    </w:lvl>
+  </w:abstractNum>
   <w:num w:numId="1" w16cid:durableId="206189966">
-    <w:abstractNumId w:val="3"/>
+    <w:abstractNumId w:val="4"/>
   </w:num>
   <w:num w:numId="2" w16cid:durableId="1237786314">
     <w:abstractNumId w:val="0"/>
   </w:num>
   <w:num w:numId="3" w16cid:durableId="31077529">
+    <w:abstractNumId w:val="3"/>
+  </w:num>
+  <w:num w:numId="4" w16cid:durableId="494956119">
     <w:abstractNumId w:val="2"/>
   </w:num>
-  <w:num w:numId="4" w16cid:durableId="494956119">
+  <w:num w:numId="5" w16cid:durableId="931207271">
+    <w:abstractNumId w:val="6"/>
+  </w:num>
+  <w:num w:numId="6" w16cid:durableId="1851066940">
     <w:abstractNumId w:val="1"/>
   </w:num>
-  <w:num w:numId="5" w16cid:durableId="931207271">
-    <w:abstractNumId w:val="4"/>
+  <w:num w:numId="7" w16cid:durableId="1413353839">
+    <w:abstractNumId w:val="5"/>
   </w:num>
 </w:numbering>
 </file>
@@ -5779,6 +7070,22 @@
       <w:szCs w:val="20"/>
     </w:rPr>
   </w:style>
+  <w:style w:type="paragraph" w:styleId="NormalWeb">
+    <w:name w:val="Normal (Web)"/>
+    <w:basedOn w:val="Normal"/>
+    <w:uiPriority w:val="99"/>
+    <w:semiHidden/>
+    <w:unhideWhenUsed/>
+    <w:rsid w:val="0068495E"/>
+    <w:pPr>
+      <w:spacing w:before="100" w:beforeAutospacing="1" w:after="100" w:afterAutospacing="1" w:line="240" w:lineRule="auto"/>
+    </w:pPr>
+    <w:rPr>
+      <w:rFonts w:ascii="Times New Roman" w:eastAsia="Times New Roman" w:hAnsi="Times New Roman" w:cs="Times New Roman"/>
+      <w:kern w:val="0"/>
+      <w14:ligatures w14:val="none"/>
+    </w:rPr>
+  </w:style>
 </w:styles>
 </file>
 

</xml_diff>

<commit_message>
learn part of ai agent project method
</commit_message>
<xml_diff>
--- a/interview/招聘调研报告/ChatGPT专题培训内容.docx
+++ b/interview/招聘调研报告/ChatGPT专题培训内容.docx
@@ -3067,11 +3067,6 @@
       </w:r>
     </w:p>
     <w:p>
-      <w:pPr>
-        <w:rPr>
-          <w:rFonts w:hint="eastAsia"/>
-        </w:rPr>
-      </w:pPr>
       <w:r>
         <w:tab/>
       </w:r>
@@ -3101,11 +3096,6 @@
       </w:r>
     </w:p>
     <w:p>
-      <w:pPr>
-        <w:rPr>
-          <w:rFonts w:hint="eastAsia"/>
-        </w:rPr>
-      </w:pPr>
       <w:r>
         <w:tab/>
       </w:r>
@@ -3271,11 +3261,6 @@
       </w:r>
     </w:p>
     <w:p>
-      <w:pPr>
-        <w:rPr>
-          <w:rFonts w:hint="eastAsia"/>
-        </w:rPr>
-      </w:pPr>
       <w:r>
         <w:tab/>
       </w:r>
@@ -3340,7 +3325,7 @@
         </w:tabs>
         <w:spacing w:after="0" w:line="240" w:lineRule="auto"/>
         <w:rPr>
-          <w:rFonts w:ascii="Courier New" w:eastAsia="Times New Roman" w:hAnsi="Courier New" w:cs="Courier New" w:hint="eastAsia"/>
+          <w:rFonts w:ascii="Courier New" w:eastAsia="Times New Roman" w:hAnsi="Courier New" w:cs="Courier New"/>
           <w:kern w:val="0"/>
           <w:sz w:val="20"/>
           <w:szCs w:val="20"/>
@@ -3410,7 +3395,7 @@
         </w:tabs>
         <w:spacing w:after="0" w:line="240" w:lineRule="auto"/>
         <w:rPr>
-          <w:rFonts w:ascii="Courier New" w:eastAsia="Times New Roman" w:hAnsi="Courier New" w:cs="Courier New" w:hint="eastAsia"/>
+          <w:rFonts w:ascii="Courier New" w:eastAsia="Times New Roman" w:hAnsi="Courier New" w:cs="Courier New"/>
           <w:kern w:val="0"/>
           <w:sz w:val="20"/>
           <w:szCs w:val="20"/>
@@ -3500,7 +3485,7 @@
         </w:tabs>
         <w:spacing w:after="0" w:line="240" w:lineRule="auto"/>
         <w:rPr>
-          <w:rFonts w:ascii="Courier New" w:eastAsia="Times New Roman" w:hAnsi="Courier New" w:cs="Courier New" w:hint="eastAsia"/>
+          <w:rFonts w:ascii="Courier New" w:eastAsia="Times New Roman" w:hAnsi="Courier New" w:cs="Courier New"/>
           <w:kern w:val="0"/>
           <w:sz w:val="20"/>
           <w:szCs w:val="20"/>
@@ -3570,7 +3555,7 @@
         </w:tabs>
         <w:spacing w:after="0" w:line="240" w:lineRule="auto"/>
         <w:rPr>
-          <w:rFonts w:ascii="SimSun" w:eastAsia="SimSun" w:hAnsi="SimSun" w:cs="SimSun" w:hint="eastAsia"/>
+          <w:rFonts w:ascii="SimSun" w:eastAsia="SimSun" w:hAnsi="SimSun" w:cs="SimSun"/>
           <w:kern w:val="0"/>
           <w:sz w:val="20"/>
           <w:szCs w:val="20"/>
@@ -3680,7 +3665,7 @@
         </w:tabs>
         <w:spacing w:after="0" w:line="240" w:lineRule="auto"/>
         <w:rPr>
-          <w:rFonts w:ascii="SimSun" w:eastAsia="SimSun" w:hAnsi="SimSun" w:cs="SimSun" w:hint="eastAsia"/>
+          <w:rFonts w:ascii="SimSun" w:eastAsia="SimSun" w:hAnsi="SimSun" w:cs="SimSun"/>
           <w:kern w:val="0"/>
           <w:sz w:val="20"/>
           <w:szCs w:val="20"/>
@@ -3740,52 +3725,42 @@
         </w:tabs>
         <w:spacing w:after="0" w:line="240" w:lineRule="auto"/>
         <w:rPr>
+          <w:rFonts w:ascii="SimSun" w:eastAsia="SimSun" w:hAnsi="SimSun" w:cs="SimSun"/>
+          <w:kern w:val="0"/>
+          <w:sz w:val="20"/>
+          <w:szCs w:val="20"/>
+          <w14:ligatures w14:val="none"/>
+        </w:rPr>
+      </w:pPr>
+      <w:r>
+        <w:rPr>
+          <w:rFonts w:ascii="Cambria Math" w:eastAsia="Times New Roman" w:hAnsi="Cambria Math" w:cs="Cambria Math"/>
+          <w:kern w:val="0"/>
+          <w:sz w:val="20"/>
+          <w:szCs w:val="20"/>
+          <w14:ligatures w14:val="none"/>
+        </w:rPr>
+        <w:t>⑦</w:t>
+      </w:r>
+      <w:r>
+        <w:rPr>
+          <w:rFonts w:ascii="Courier New" w:eastAsia="Times New Roman" w:hAnsi="Courier New" w:cs="Courier New"/>
+          <w:kern w:val="0"/>
+          <w:sz w:val="20"/>
+          <w:szCs w:val="20"/>
+          <w14:ligatures w14:val="none"/>
+        </w:rPr>
+        <w:t xml:space="preserve"> Send</w:t>
+      </w:r>
+      <w:r>
+        <w:rPr>
           <w:rFonts w:ascii="SimSun" w:eastAsia="SimSun" w:hAnsi="SimSun" w:cs="SimSun" w:hint="eastAsia"/>
           <w:kern w:val="0"/>
           <w:sz w:val="20"/>
           <w:szCs w:val="20"/>
           <w14:ligatures w14:val="none"/>
         </w:rPr>
-      </w:pPr>
-      <w:r>
-        <w:rPr>
-          <w:rFonts w:ascii="Cambria Math" w:eastAsia="Times New Roman" w:hAnsi="Cambria Math" w:cs="Cambria Math"/>
-          <w:kern w:val="0"/>
-          <w:sz w:val="20"/>
-          <w:szCs w:val="20"/>
-          <w14:ligatures w14:val="none"/>
-        </w:rPr>
-        <w:t>⑦</w:t>
-      </w:r>
-      <w:r>
-        <w:rPr>
-          <w:rFonts w:ascii="Courier New" w:eastAsia="Times New Roman" w:hAnsi="Courier New" w:cs="Courier New"/>
-          <w:kern w:val="0"/>
-          <w:sz w:val="20"/>
-          <w:szCs w:val="20"/>
-          <w14:ligatures w14:val="none"/>
-        </w:rPr>
-        <w:t xml:space="preserve"> Send</w:t>
-      </w:r>
-      <w:r>
-        <w:rPr>
-          <w:rFonts w:ascii="SimSun" w:eastAsia="SimSun" w:hAnsi="SimSun" w:cs="SimSun" w:hint="eastAsia"/>
-          <w:kern w:val="0"/>
-          <w:sz w:val="20"/>
-          <w:szCs w:val="20"/>
-          <w14:ligatures w14:val="none"/>
-        </w:rPr>
-        <w:t>：</w:t>
-      </w:r>
-      <w:r>
-        <w:rPr>
-          <w:rFonts w:ascii="SimSun" w:eastAsia="SimSun" w:hAnsi="SimSun" w:cs="SimSun" w:hint="eastAsia"/>
-          <w:kern w:val="0"/>
-          <w:sz w:val="20"/>
-          <w:szCs w:val="20"/>
-          <w14:ligatures w14:val="none"/>
-        </w:rPr>
-        <w:t>不用， 没有拆分不同任务给不同Agent</w:t>
+        <w:t>：不用， 没有拆分不同任务给不同Agent</w:t>
       </w:r>
     </w:p>
     <w:p>
@@ -3810,7 +3785,7 @@
         </w:tabs>
         <w:spacing w:after="0" w:line="240" w:lineRule="auto"/>
         <w:rPr>
-          <w:rFonts w:ascii="SimSun" w:eastAsia="SimSun" w:hAnsi="SimSun" w:cs="SimSun" w:hint="eastAsia"/>
+          <w:rFonts w:ascii="SimSun" w:eastAsia="SimSun" w:hAnsi="SimSun" w:cs="SimSun"/>
           <w:kern w:val="0"/>
           <w:sz w:val="20"/>
           <w:szCs w:val="20"/>
@@ -3870,7 +3845,7 @@
         </w:tabs>
         <w:spacing w:after="0" w:line="240" w:lineRule="auto"/>
         <w:rPr>
-          <w:rFonts w:ascii="SimSun" w:eastAsia="SimSun" w:hAnsi="SimSun" w:cs="SimSun" w:hint="eastAsia"/>
+          <w:rFonts w:ascii="SimSun" w:eastAsia="SimSun" w:hAnsi="SimSun" w:cs="SimSun"/>
           <w:kern w:val="0"/>
           <w:sz w:val="20"/>
           <w:szCs w:val="20"/>
@@ -4024,7 +3999,6 @@
           <w:kern w:val="0"/>
           <w:sz w:val="20"/>
           <w:szCs w:val="20"/>
-          <w:lang w:val="en-US"/>
           <w14:ligatures w14:val="none"/>
         </w:rPr>
       </w:pPr>
@@ -4075,7 +4049,6 @@
           <w:kern w:val="0"/>
           <w:sz w:val="20"/>
           <w:szCs w:val="20"/>
-          <w:lang w:val="en-US"/>
           <w14:ligatures w14:val="none"/>
         </w:rPr>
       </w:pPr>
@@ -4085,7 +4058,6 @@
           <w:kern w:val="0"/>
           <w:sz w:val="20"/>
           <w:szCs w:val="20"/>
-          <w:lang w:val="en-US"/>
           <w14:ligatures w14:val="none"/>
         </w:rPr>
         <w:tab/>
@@ -4117,7 +4089,6 @@
           <w:kern w:val="0"/>
           <w:sz w:val="20"/>
           <w:szCs w:val="20"/>
-          <w:lang w:val="en-US"/>
           <w14:ligatures w14:val="none"/>
         </w:rPr>
       </w:pPr>
@@ -4127,82 +4098,9 @@
           <w:kern w:val="0"/>
           <w:sz w:val="20"/>
           <w:szCs w:val="20"/>
-          <w:lang w:val="en-US"/>
           <w14:ligatures w14:val="none"/>
         </w:rPr>
-        <w:t>(1).设计解耦，</w:t>
-      </w:r>
-      <w:proofErr w:type="spellStart"/>
-      <w:r>
-        <w:rPr>
-          <w:rFonts w:ascii="SimSun" w:eastAsia="SimSun" w:hAnsi="SimSun" w:cs="SimSun" w:hint="eastAsia"/>
-          <w:kern w:val="0"/>
-          <w:sz w:val="20"/>
-          <w:szCs w:val="20"/>
-          <w:lang w:val="en-US"/>
-          <w14:ligatures w14:val="none"/>
-        </w:rPr>
-        <w:t>history_result</w:t>
-      </w:r>
-      <w:proofErr w:type="spellEnd"/>
-      <w:r>
-        <w:rPr>
-          <w:rFonts w:ascii="SimSun" w:eastAsia="SimSun" w:hAnsi="SimSun" w:cs="SimSun" w:hint="eastAsia"/>
-          <w:kern w:val="0"/>
-          <w:sz w:val="20"/>
-          <w:szCs w:val="20"/>
-          <w:lang w:val="en-US"/>
-          <w14:ligatures w14:val="none"/>
-        </w:rPr>
-        <w:t>和</w:t>
-      </w:r>
-      <w:proofErr w:type="spellStart"/>
-      <w:r>
-        <w:rPr>
-          <w:rFonts w:ascii="SimSun" w:eastAsia="SimSun" w:hAnsi="SimSun" w:cs="SimSun" w:hint="eastAsia"/>
-          <w:kern w:val="0"/>
-          <w:sz w:val="20"/>
-          <w:szCs w:val="20"/>
-          <w:lang w:val="en-US"/>
-          <w14:ligatures w14:val="none"/>
-        </w:rPr>
-        <w:t>rag_result</w:t>
-      </w:r>
-      <w:proofErr w:type="spellEnd"/>
-      <w:r>
-        <w:rPr>
-          <w:rFonts w:ascii="SimSun" w:eastAsia="SimSun" w:hAnsi="SimSun" w:cs="SimSun" w:hint="eastAsia"/>
-          <w:kern w:val="0"/>
-          <w:sz w:val="20"/>
-          <w:szCs w:val="20"/>
-          <w:lang w:val="en-US"/>
-          <w14:ligatures w14:val="none"/>
-        </w:rPr>
-        <w:t>是子图运行过程中间产生的内容，仅子图自己用，所以不需要给父图；但是</w:t>
-      </w:r>
-      <w:proofErr w:type="spellStart"/>
-      <w:r>
-        <w:rPr>
-          <w:rFonts w:ascii="SimSun" w:eastAsia="SimSun" w:hAnsi="SimSun" w:cs="SimSun" w:hint="eastAsia"/>
-          <w:kern w:val="0"/>
-          <w:sz w:val="20"/>
-          <w:szCs w:val="20"/>
-          <w:lang w:val="en-US"/>
-          <w14:ligatures w14:val="none"/>
-        </w:rPr>
-        <w:t>possible_causes</w:t>
-      </w:r>
-      <w:proofErr w:type="spellEnd"/>
-      <w:r>
-        <w:rPr>
-          <w:rFonts w:ascii="SimSun" w:eastAsia="SimSun" w:hAnsi="SimSun" w:cs="SimSun" w:hint="eastAsia"/>
-          <w:kern w:val="0"/>
-          <w:sz w:val="20"/>
-          <w:szCs w:val="20"/>
-          <w:lang w:val="en-US"/>
-          <w14:ligatures w14:val="none"/>
-        </w:rPr>
-        <w:t>是父图在写报告中需要用到的内容，因此选择接收</w:t>
+        <w:t>(1).设计解耦，history_result和rag_result是子图运行过程中间产生的内容，仅子图自己用，所以不需要给父图；但是possible_causes是父图在写报告中需要用到的内容，因此选择接收</w:t>
       </w:r>
     </w:p>
     <w:p>
@@ -4227,7 +4125,7 @@
         </w:tabs>
         <w:spacing w:after="0" w:line="240" w:lineRule="auto"/>
         <w:rPr>
-          <w:rFonts w:ascii="SimSun" w:eastAsia="SimSun" w:hAnsi="SimSun" w:cs="SimSun" w:hint="eastAsia"/>
+          <w:rFonts w:ascii="SimSun" w:eastAsia="SimSun" w:hAnsi="SimSun" w:cs="SimSun"/>
           <w:kern w:val="0"/>
           <w:sz w:val="20"/>
           <w:szCs w:val="20"/>
@@ -4304,6 +4202,16 @@
         </w:tabs>
         <w:spacing w:after="0" w:line="240" w:lineRule="auto"/>
         <w:rPr>
+          <w:rFonts w:ascii="SimSun" w:eastAsia="SimSun" w:hAnsi="SimSun" w:cs="SimSun"/>
+          <w:kern w:val="0"/>
+          <w:sz w:val="20"/>
+          <w:szCs w:val="20"/>
+          <w:lang w:val="en-US"/>
+          <w14:ligatures w14:val="none"/>
+        </w:rPr>
+      </w:pPr>
+      <w:r>
+        <w:rPr>
           <w:rFonts w:ascii="SimSun" w:eastAsia="SimSun" w:hAnsi="SimSun" w:cs="SimSun" w:hint="eastAsia"/>
           <w:kern w:val="0"/>
           <w:sz w:val="20"/>
@@ -4311,7 +4219,21 @@
           <w:lang w:val="en-US"/>
           <w14:ligatures w14:val="none"/>
         </w:rPr>
-      </w:pPr>
+        <w:t>(3).替换</w:t>
+      </w:r>
+      <w:proofErr w:type="spellStart"/>
+      <w:r>
+        <w:rPr>
+          <w:rFonts w:ascii="SimSun" w:eastAsia="SimSun" w:hAnsi="SimSun" w:cs="SimSun"/>
+          <w:kern w:val="0"/>
+          <w:sz w:val="20"/>
+          <w:szCs w:val="20"/>
+          <w:lang w:val="en-US"/>
+          <w14:ligatures w14:val="none"/>
+        </w:rPr>
+        <w:t>analyze_causes</w:t>
+      </w:r>
+      <w:proofErr w:type="spellEnd"/>
       <w:r>
         <w:rPr>
           <w:rFonts w:ascii="SimSun" w:eastAsia="SimSun" w:hAnsi="SimSun" w:cs="SimSun" w:hint="eastAsia"/>
@@ -4321,39 +4243,12 @@
           <w:lang w:val="en-US"/>
           <w14:ligatures w14:val="none"/>
         </w:rPr>
-        <w:t>(3).替换</w:t>
-      </w:r>
-      <w:proofErr w:type="spellStart"/>
-      <w:r>
-        <w:rPr>
-          <w:rFonts w:ascii="SimSun" w:eastAsia="SimSun" w:hAnsi="SimSun" w:cs="SimSun"/>
-          <w:kern w:val="0"/>
-          <w:sz w:val="20"/>
-          <w:szCs w:val="20"/>
-          <w:lang w:val="en-US"/>
-          <w14:ligatures w14:val="none"/>
-        </w:rPr>
-        <w:t>analyze_causes</w:t>
-      </w:r>
-      <w:proofErr w:type="spellEnd"/>
-      <w:r>
-        <w:rPr>
-          <w:rFonts w:ascii="SimSun" w:eastAsia="SimSun" w:hAnsi="SimSun" w:cs="SimSun" w:hint="eastAsia"/>
-          <w:kern w:val="0"/>
-          <w:sz w:val="20"/>
-          <w:szCs w:val="20"/>
-          <w:lang w:val="en-US"/>
-          <w14:ligatures w14:val="none"/>
-        </w:rPr>
         <w:t>的实现，父图不需要重写</w:t>
       </w:r>
     </w:p>
     <w:p>
       <w:pPr>
         <w:ind w:left="720" w:hanging="720"/>
-        <w:rPr>
-          <w:rFonts w:hint="eastAsia"/>
-        </w:rPr>
       </w:pPr>
     </w:p>
     <w:p>
@@ -4470,7 +4365,6 @@
           <w:numId w:val="6"/>
         </w:numPr>
         <w:rPr>
-          <w:rFonts w:hint="eastAsia"/>
           <w:strike/>
         </w:rPr>
       </w:pPr>
@@ -4802,11 +4696,6 @@
       </w:r>
     </w:p>
     <w:p>
-      <w:pPr>
-        <w:rPr>
-          <w:rFonts w:hint="eastAsia"/>
-        </w:rPr>
-      </w:pPr>
       <w:r>
         <w:rPr>
           <w:rFonts w:hint="eastAsia"/>
@@ -4899,7 +4788,6 @@
     <w:p>
       <w:pPr>
         <w:rPr>
-          <w:rFonts w:hint="eastAsia"/>
           <w:lang w:val="en-US"/>
         </w:rPr>
       </w:pPr>
@@ -4976,9 +4864,6 @@
           <w:ilvl w:val="0"/>
           <w:numId w:val="7"/>
         </w:numPr>
-        <w:rPr>
-          <w:rFonts w:hint="eastAsia"/>
-        </w:rPr>
       </w:pPr>
       <w:r>
         <w:rPr>
@@ -5336,31 +5221,325 @@
           <w:rFonts w:ascii="SimSun" w:eastAsia="SimSun" w:hAnsi="SimSun" w:cs="SimSun" w:hint="eastAsia"/>
         </w:rPr>
         <w:lastRenderedPageBreak/>
-        <w:t>待解决的问题：</w:t>
+        <w:t>待解决的问题：用户要求查询最近</w:t>
+      </w:r>
+      <w:r>
+        <w:t xml:space="preserve"> 7 </w:t>
       </w:r>
       <w:r>
         <w:rPr>
           <w:rFonts w:ascii="SimSun" w:eastAsia="SimSun" w:hAnsi="SimSun" w:cs="SimSun" w:hint="eastAsia"/>
         </w:rPr>
-        <w:t>用户要求查询最近</w:t>
-      </w:r>
-      <w:r>
-        <w:t xml:space="preserve"> 7 </w:t>
+        <w:t>天的</w:t>
+      </w:r>
+      <w:r>
+        <w:t xml:space="preserve"> API </w:t>
       </w:r>
       <w:r>
         <w:rPr>
           <w:rFonts w:ascii="SimSun" w:eastAsia="SimSun" w:hAnsi="SimSun" w:cs="SimSun" w:hint="eastAsia"/>
         </w:rPr>
-        <w:t>天的</w:t>
-      </w:r>
-      <w:r>
-        <w:t xml:space="preserve"> API </w:t>
+        <w:t>调用趋势。如果</w:t>
+      </w:r>
+      <w:r>
+        <w:t xml:space="preserve"> SQL </w:t>
       </w:r>
       <w:r>
         <w:rPr>
           <w:rFonts w:ascii="SimSun" w:eastAsia="SimSun" w:hAnsi="SimSun" w:cs="SimSun" w:hint="eastAsia"/>
         </w:rPr>
-        <w:t>调用趋势。如果</w:t>
+        <w:t>查询失败、</w:t>
+      </w:r>
+      <w:r>
+        <w:t xml:space="preserve">LLM </w:t>
+      </w:r>
+      <w:r>
+        <w:rPr>
+          <w:rFonts w:ascii="SimSun" w:eastAsia="SimSun" w:hAnsi="SimSun" w:cs="SimSun" w:hint="eastAsia"/>
+        </w:rPr>
+        <w:t>输出了错误</w:t>
+      </w:r>
+      <w:r>
+        <w:t xml:space="preserve"> JSON</w:t>
+      </w:r>
+      <w:r>
+        <w:rPr>
+          <w:rFonts w:ascii="SimSun" w:eastAsia="SimSun" w:hAnsi="SimSun" w:cs="SimSun" w:hint="eastAsia"/>
+        </w:rPr>
+        <w:t>，或者</w:t>
+      </w:r>
+      <w:r>
+        <w:t xml:space="preserve"> Agent </w:t>
+      </w:r>
+      <w:r>
+        <w:rPr>
+          <w:rFonts w:ascii="SimSun" w:eastAsia="SimSun" w:hAnsi="SimSun" w:cs="SimSun" w:hint="eastAsia"/>
+        </w:rPr>
+        <w:t>反复调用同一个工具，你的整个多</w:t>
+      </w:r>
+      <w:r>
+        <w:t xml:space="preserve"> Agent </w:t>
+      </w:r>
+      <w:r>
+        <w:rPr>
+          <w:rFonts w:ascii="SimSun" w:eastAsia="SimSun" w:hAnsi="SimSun" w:cs="SimSun" w:hint="eastAsia"/>
+        </w:rPr>
+        <w:t>系统应该怎么处理？</w:t>
+      </w:r>
+    </w:p>
+    <w:p/>
+    <w:p>
+      <w:pPr>
+        <w:pStyle w:val="ListParagraph"/>
+        <w:numPr>
+          <w:ilvl w:val="0"/>
+          <w:numId w:val="8"/>
+        </w:numPr>
+      </w:pPr>
+      <w:r>
+        <w:rPr>
+          <w:rFonts w:hint="eastAsia"/>
+        </w:rPr>
+        <w:t>不知道</w:t>
+      </w:r>
+    </w:p>
+    <w:p>
+      <w:pPr>
+        <w:pStyle w:val="ListParagraph"/>
+        <w:numPr>
+          <w:ilvl w:val="0"/>
+          <w:numId w:val="8"/>
+        </w:numPr>
+      </w:pPr>
+      <w:r>
+        <w:rPr>
+          <w:rFonts w:hint="eastAsia"/>
+        </w:rPr>
+        <w:t>不知道</w:t>
+      </w:r>
+    </w:p>
+    <w:p>
+      <w:pPr>
+        <w:pStyle w:val="ListParagraph"/>
+        <w:numPr>
+          <w:ilvl w:val="0"/>
+          <w:numId w:val="8"/>
+        </w:numPr>
+      </w:pPr>
+      <w:r>
+        <w:rPr>
+          <w:rFonts w:hint="eastAsia"/>
+        </w:rPr>
+        <w:t>因为默认会传</w:t>
+      </w:r>
+      <w:r>
+        <w:rPr>
+          <w:rFonts w:hint="eastAsia"/>
+        </w:rPr>
+        <w:t>list</w:t>
+      </w:r>
+      <w:r>
+        <w:rPr>
+          <w:rFonts w:hint="eastAsia"/>
+        </w:rPr>
+        <w:t>给这个字段；不知道</w:t>
+      </w:r>
+    </w:p>
+    <w:p>
+      <w:pPr>
+        <w:pStyle w:val="ListParagraph"/>
+        <w:numPr>
+          <w:ilvl w:val="0"/>
+          <w:numId w:val="8"/>
+        </w:numPr>
+      </w:pPr>
+      <w:r>
+        <w:rPr>
+          <w:rFonts w:hint="eastAsia"/>
+        </w:rPr>
+        <w:t>直觉上我觉得不符合异常处理的目的，出了意料之外的异常。</w:t>
+      </w:r>
+    </w:p>
+    <w:p>
+      <w:pPr>
+        <w:pStyle w:val="ListParagraph"/>
+        <w:numPr>
+          <w:ilvl w:val="0"/>
+          <w:numId w:val="8"/>
+        </w:numPr>
+      </w:pPr>
+      <w:r>
+        <w:rPr>
+          <w:rFonts w:hint="eastAsia"/>
+        </w:rPr>
+        <w:t>不知道</w:t>
+      </w:r>
+    </w:p>
+    <w:p/>
+    <w:p>
+      <w:pPr>
+        <w:pStyle w:val="NormalWeb"/>
+      </w:pPr>
+      <w:r>
+        <w:rPr>
+          <w:rFonts w:ascii="SimSun" w:eastAsia="SimSun" w:hAnsi="SimSun" w:cs="SimSun" w:hint="eastAsia"/>
+        </w:rPr>
+        <w:t>第</w:t>
+      </w:r>
+      <w:r>
+        <w:t xml:space="preserve"> 1 </w:t>
+      </w:r>
+      <w:r>
+        <w:rPr>
+          <w:rFonts w:ascii="SimSun" w:eastAsia="SimSun" w:hAnsi="SimSun" w:cs="SimSun" w:hint="eastAsia"/>
+        </w:rPr>
+        <w:t>题：</w:t>
+      </w:r>
+      <w:r>
+        <w:t xml:space="preserve"> </w:t>
+      </w:r>
+      <w:r>
+        <w:rPr>
+          <w:rStyle w:val="HTMLCode"/>
+        </w:rPr>
+        <w:t>run_api_usage</w:t>
+      </w:r>
+      <w:r>
+        <w:t xml:space="preserve"> </w:t>
+      </w:r>
+      <w:r>
+        <w:rPr>
+          <w:rFonts w:ascii="SimSun" w:eastAsia="SimSun" w:hAnsi="SimSun" w:cs="SimSun" w:hint="eastAsia"/>
+        </w:rPr>
+        <w:t>中为什么要自己构造</w:t>
+      </w:r>
+      <w:r>
+        <w:t xml:space="preserve"> </w:t>
+      </w:r>
+      <w:r>
+        <w:rPr>
+          <w:rStyle w:val="HTMLCode"/>
+        </w:rPr>
+        <w:t>child_input</w:t>
+      </w:r>
+      <w:r>
+        <w:rPr>
+          <w:rFonts w:ascii="SimSun" w:eastAsia="SimSun" w:hAnsi="SimSun" w:cs="SimSun" w:hint="eastAsia"/>
+        </w:rPr>
+        <w:t>，而不直接写成</w:t>
+      </w:r>
+      <w:r>
+        <w:t xml:space="preserve"> </w:t>
+      </w:r>
+      <w:r>
+        <w:rPr>
+          <w:rStyle w:val="HTMLCode"/>
+        </w:rPr>
+        <w:t>api_usage_graph.invoke(state, context=runtime.context)</w:t>
+      </w:r>
+      <w:r>
+        <w:rPr>
+          <w:rFonts w:ascii="SimSun" w:eastAsia="SimSun" w:hAnsi="SimSun" w:cs="SimSun" w:hint="eastAsia"/>
+        </w:rPr>
+        <w:t>？什么情况下直接传整个</w:t>
+      </w:r>
+      <w:r>
+        <w:t xml:space="preserve"> </w:t>
+      </w:r>
+      <w:r>
+        <w:rPr>
+          <w:rStyle w:val="HTMLCode"/>
+        </w:rPr>
+        <w:t>state</w:t>
+      </w:r>
+      <w:r>
+        <w:t xml:space="preserve"> </w:t>
+      </w:r>
+      <w:r>
+        <w:rPr>
+          <w:rFonts w:ascii="SimSun" w:eastAsia="SimSun" w:hAnsi="SimSun" w:cs="SimSun" w:hint="eastAsia"/>
+        </w:rPr>
+        <w:t>可能导致接口变得脆弱？</w:t>
+      </w:r>
+    </w:p>
+    <w:p>
+      <w:pPr>
+        <w:pStyle w:val="NormalWeb"/>
+      </w:pPr>
+      <w:r>
+        <w:rPr>
+          <w:rFonts w:ascii="SimSun" w:eastAsia="SimSun" w:hAnsi="SimSun" w:cs="SimSun" w:hint="eastAsia"/>
+        </w:rPr>
+        <w:t>第</w:t>
+      </w:r>
+      <w:r>
+        <w:t xml:space="preserve"> 2 </w:t>
+      </w:r>
+      <w:r>
+        <w:rPr>
+          <w:rFonts w:ascii="SimSun" w:eastAsia="SimSun" w:hAnsi="SimSun" w:cs="SimSun" w:hint="eastAsia"/>
+        </w:rPr>
+        <w:t>题：</w:t>
+      </w:r>
+      <w:r>
+        <w:t xml:space="preserve"> </w:t>
+      </w:r>
+      <w:r>
+        <w:rPr>
+          <w:rFonts w:ascii="SimSun" w:eastAsia="SimSun" w:hAnsi="SimSun" w:cs="SimSun" w:hint="eastAsia"/>
+        </w:rPr>
+        <w:t>子图内部</w:t>
+      </w:r>
+      <w:r>
+        <w:t xml:space="preserve"> </w:t>
+      </w:r>
+      <w:r>
+        <w:rPr>
+          <w:rStyle w:val="HTMLCode"/>
+        </w:rPr>
+        <w:t>api_result</w:t>
+      </w:r>
+      <w:r>
+        <w:t xml:space="preserve"> </w:t>
+      </w:r>
+      <w:r>
+        <w:rPr>
+          <w:rFonts w:ascii="SimSun" w:eastAsia="SimSun" w:hAnsi="SimSun" w:cs="SimSun" w:hint="eastAsia"/>
+        </w:rPr>
+        <w:t>有几百条原始记录，但</w:t>
+      </w:r>
+      <w:r>
+        <w:t xml:space="preserve"> </w:t>
+      </w:r>
+      <w:r>
+        <w:rPr>
+          <w:rStyle w:val="HTMLCode"/>
+        </w:rPr>
+        <w:t>APIUsageOutput</w:t>
+      </w:r>
+      <w:r>
+        <w:t xml:space="preserve"> </w:t>
+      </w:r>
+      <w:r>
+        <w:rPr>
+          <w:rFonts w:ascii="SimSun" w:eastAsia="SimSun" w:hAnsi="SimSun" w:cs="SimSun" w:hint="eastAsia"/>
+        </w:rPr>
+        <w:t>只暴露</w:t>
+      </w:r>
+      <w:r>
+        <w:t xml:space="preserve"> </w:t>
+      </w:r>
+      <w:r>
+        <w:rPr>
+          <w:rStyle w:val="HTMLCode"/>
+        </w:rPr>
+        <w:t>api_usage_report</w:t>
+      </w:r>
+      <w:r>
+        <w:rPr>
+          <w:rFonts w:ascii="SimSun" w:eastAsia="SimSun" w:hAnsi="SimSun" w:cs="SimSun" w:hint="eastAsia"/>
+        </w:rPr>
+        <w:t>。假如你以后将</w:t>
       </w:r>
       <w:r>
         <w:t xml:space="preserve"> SQL </w:t>
@@ -5369,63 +5548,219 @@
         <w:rPr>
           <w:rFonts w:ascii="SimSun" w:eastAsia="SimSun" w:hAnsi="SimSun" w:cs="SimSun" w:hint="eastAsia"/>
         </w:rPr>
-        <w:t>查询失败、</w:t>
-      </w:r>
-      <w:r>
-        <w:t xml:space="preserve">LLM </w:t>
-      </w:r>
+        <w:t>查询替换成数据仓库查询，为什么父图通常不需要跟着修改？</w:t>
+      </w:r>
+    </w:p>
+    <w:p>
+      <w:pPr>
+        <w:pStyle w:val="NormalWeb"/>
+        <w:rPr>
+          <w:rFonts w:hint="eastAsia"/>
+        </w:rPr>
+      </w:pPr>
       <w:r>
         <w:rPr>
           <w:rFonts w:ascii="SimSun" w:eastAsia="SimSun" w:hAnsi="SimSun" w:cs="SimSun" w:hint="eastAsia"/>
         </w:rPr>
-        <w:t>输出了错误</w:t>
-      </w:r>
-      <w:r>
-        <w:t xml:space="preserve"> JSON</w:t>
+        <w:t>第</w:t>
+      </w:r>
+      <w:r>
+        <w:t xml:space="preserve"> 3 </w:t>
       </w:r>
       <w:r>
         <w:rPr>
           <w:rFonts w:ascii="SimSun" w:eastAsia="SimSun" w:hAnsi="SimSun" w:cs="SimSun" w:hint="eastAsia"/>
         </w:rPr>
-        <w:t>，或者</w:t>
-      </w:r>
-      <w:r>
-        <w:t xml:space="preserve"> Agent </w:t>
+        <w:t>题：</w:t>
+      </w:r>
+      <w:r>
+        <w:t xml:space="preserve"> </w:t>
       </w:r>
       <w:r>
         <w:rPr>
           <w:rFonts w:ascii="SimSun" w:eastAsia="SimSun" w:hAnsi="SimSun" w:cs="SimSun" w:hint="eastAsia"/>
         </w:rPr>
-        <w:t>反复调用同一个工具，你的整个多</w:t>
-      </w:r>
-      <w:r>
-        <w:t xml:space="preserve"> Agent </w:t>
+        <w:t>假如</w:t>
+      </w:r>
+      <w:r>
+        <w:t xml:space="preserve"> </w:t>
+      </w:r>
+      <w:r>
+        <w:rPr>
+          <w:rStyle w:val="HTMLCode"/>
+        </w:rPr>
+        <w:t>api_usage_graph.invoke(...)</w:t>
+      </w:r>
+      <w:r>
+        <w:t xml:space="preserve"> </w:t>
       </w:r>
       <w:r>
         <w:rPr>
           <w:rFonts w:ascii="SimSun" w:eastAsia="SimSun" w:hAnsi="SimSun" w:cs="SimSun" w:hint="eastAsia"/>
         </w:rPr>
-        <w:t>系统应该怎么处理？</w:t>
-      </w:r>
-    </w:p>
-    <w:p>
-      <w:pPr>
-        <w:rPr>
-          <w:rFonts w:hint="eastAsia"/>
-        </w:rPr>
-      </w:pPr>
-    </w:p>
-    <w:p>
-      <w:pPr>
-        <w:rPr>
-          <w:rFonts w:hint="eastAsia"/>
-        </w:rPr>
-      </w:pPr>
-      <w:r>
-        <w:rPr>
-          <w:rFonts w:hint="eastAsia"/>
-        </w:rPr>
-        <w:t xml:space="preserve">      (1)</w:t>
+        <w:t>因为子图的程序错误而直接抛出异常，没有返回</w:t>
+      </w:r>
+      <w:r>
+        <w:t xml:space="preserve"> </w:t>
+      </w:r>
+      <w:r>
+        <w:rPr>
+          <w:rStyle w:val="HTMLCode"/>
+        </w:rPr>
+        <w:t>child_result</w:t>
+      </w:r>
+      <w:r>
+        <w:rPr>
+          <w:rFonts w:ascii="SimSun" w:eastAsia="SimSun" w:hAnsi="SimSun" w:cs="SimSun" w:hint="eastAsia"/>
+        </w:rPr>
+        <w:t>，那么父图中的</w:t>
+      </w:r>
+      <w:r>
+        <w:t xml:space="preserve"> </w:t>
+      </w:r>
+      <w:r>
+        <w:rPr>
+          <w:rStyle w:val="HTMLCode"/>
+        </w:rPr>
+        <w:t>APIUsageReport.model_validate(...)</w:t>
+      </w:r>
+      <w:r>
+        <w:t xml:space="preserve"> </w:t>
+      </w:r>
+      <w:r>
+        <w:rPr>
+          <w:rFonts w:ascii="SimSun" w:eastAsia="SimSun" w:hAnsi="SimSun" w:cs="SimSun" w:hint="eastAsia"/>
+        </w:rPr>
+        <w:t>会不会自动把这个异常转换成</w:t>
+      </w:r>
+      <w:r>
+        <w:t xml:space="preserve"> </w:t>
+      </w:r>
+      <w:r>
+        <w:rPr>
+          <w:rStyle w:val="HTMLCode"/>
+        </w:rPr>
+        <w:t>status="failed"</w:t>
+      </w:r>
+      <w:r>
+        <w:rPr>
+          <w:rFonts w:ascii="SimSun" w:eastAsia="SimSun" w:hAnsi="SimSun" w:cs="SimSun" w:hint="eastAsia"/>
+        </w:rPr>
+        <w:t>？请解释执行顺序。</w:t>
+      </w:r>
+    </w:p>
+    <w:p>
+      <w:pPr>
+        <w:pStyle w:val="ListParagraph"/>
+        <w:numPr>
+          <w:ilvl w:val="0"/>
+          <w:numId w:val="9"/>
+        </w:numPr>
+      </w:pPr>
+      <w:r>
+        <w:rPr>
+          <w:rFonts w:hint="eastAsia"/>
+        </w:rPr>
+        <w:t>大模型看到太多信息后发散注意力，因此</w:t>
+      </w:r>
+      <w:r>
+        <w:rPr>
+          <w:rFonts w:hint="eastAsia"/>
+        </w:rPr>
+        <w:t>sub-agent</w:t>
+      </w:r>
+      <w:r>
+        <w:rPr>
+          <w:rFonts w:hint="eastAsia"/>
+        </w:rPr>
+        <w:t>需要哪些信息就将哪些信息传递给</w:t>
+      </w:r>
+      <w:r>
+        <w:rPr>
+          <w:rFonts w:hint="eastAsia"/>
+        </w:rPr>
+        <w:t>sub-agent</w:t>
+      </w:r>
+    </w:p>
+    <w:p>
+      <w:pPr>
+        <w:pStyle w:val="ListParagraph"/>
+        <w:numPr>
+          <w:ilvl w:val="0"/>
+          <w:numId w:val="9"/>
+        </w:numPr>
+      </w:pPr>
+      <w:r>
+        <w:rPr>
+          <w:rFonts w:hint="eastAsia"/>
+        </w:rPr>
+        <w:t>因为父图接收的数据契约还是</w:t>
+      </w:r>
+      <w:r>
+        <w:rPr>
+          <w:rFonts w:hint="eastAsia"/>
+        </w:rPr>
+        <w:t>ApiUsageReport</w:t>
+      </w:r>
+      <w:r>
+        <w:rPr>
+          <w:rFonts w:hint="eastAsia"/>
+        </w:rPr>
+        <w:t>的结构</w:t>
+      </w:r>
+    </w:p>
+    <w:p>
+      <w:pPr>
+        <w:pStyle w:val="ListParagraph"/>
+        <w:numPr>
+          <w:ilvl w:val="0"/>
+          <w:numId w:val="9"/>
+        </w:numPr>
+        <w:rPr>
+          <w:rFonts w:hint="eastAsia"/>
+        </w:rPr>
+      </w:pPr>
+      <w:r>
+        <w:rPr>
+          <w:rFonts w:hint="eastAsia"/>
+        </w:rPr>
+        <w:t>不会，</w:t>
+      </w:r>
+      <w:r>
+        <w:rPr>
+          <w:rFonts w:hint="eastAsia"/>
+        </w:rPr>
+        <w:t>status</w:t>
+      </w:r>
+      <w:r>
+        <w:rPr>
+          <w:rFonts w:hint="eastAsia"/>
+        </w:rPr>
+        <w:t>都在子图的</w:t>
+      </w:r>
+      <w:r>
+        <w:rPr>
+          <w:rFonts w:hint="eastAsia"/>
+        </w:rPr>
+        <w:t>analyze_usage</w:t>
+      </w:r>
+      <w:r>
+        <w:rPr>
+          <w:rFonts w:hint="eastAsia"/>
+        </w:rPr>
+        <w:t>中定义，父图中的</w:t>
+      </w:r>
+      <w:r>
+        <w:rPr>
+          <w:rFonts w:hint="eastAsia"/>
+        </w:rPr>
+        <w:t>model_validate</w:t>
+      </w:r>
+      <w:r>
+        <w:rPr>
+          <w:rFonts w:hint="eastAsia"/>
+        </w:rPr>
+        <w:t>只校验数据是否符合数据契约</w:t>
       </w:r>
     </w:p>
     <w:sectPr>
@@ -5441,6 +5776,95 @@
 <file path=word/numbering.xml><?xml version="1.0" encoding="utf-8"?>
 <w:numbering xmlns:wpc="http://schemas.microsoft.com/office/word/2010/wordprocessingCanvas" xmlns:cx="http://schemas.microsoft.com/office/drawing/2014/chartex" xmlns:cx1="http://schemas.microsoft.com/office/drawing/2015/9/8/chartex" xmlns:cx2="http://schemas.microsoft.com/office/drawing/2015/10/21/chartex" xmlns:cx3="http://schemas.microsoft.com/office/drawing/2016/5/9/chartex" xmlns:cx4="http://schemas.microsoft.com/office/drawing/2016/5/10/chartex" xmlns:cx5="http://schemas.microsoft.com/office/drawing/2016/5/11/chartex" xmlns:cx6="http://schemas.microsoft.com/office/drawing/2016/5/12/chartex" xmlns:cx7="http://schemas.microsoft.com/office/drawing/2016/5/13/chartex" xmlns:cx8="http://schemas.microsoft.com/office/drawing/2016/5/14/chartex" xmlns:mc="http://schemas.openxmlformats.org/markup-compatibility/2006" xmlns:m="http://schemas.openxmlformats.org/officeDocument/2006/math" xmlns:aink="http://schemas.microsoft.com/office/drawing/2016/ink" xmlns:am3d="http://schemas.microsoft.com/office/drawing/2017/model3d" xmlns:oel="http://schemas.microsoft.com/office/2019/extlst" xmlns:r="http://schemas.openxmlformats.org/officeDocument/2006/relationships" xmlns:wp14="http://schemas.microsoft.com/office/word/2010/wordprocessingDrawing" xmlns:wp="http://schemas.openxmlformats.org/drawingml/2006/wordprocessingDrawing" xmlns:wpg="http://schemas.microsoft.com/office/word/2010/wordprocessingGroup" xmlns:wpi="http://schemas.microsoft.com/office/word/2010/wordprocessingInk" xmlns:wps="http://schemas.microsoft.com/office/word/2010/wordprocessingShape" xmlns:o="urn:schemas-microsoft-com:office:office" xmlns:v="urn:schemas-microsoft-com:vml" xmlns:w10="urn:schemas-microsoft-com:office:word" xmlns:w="http://schemas.openxmlformats.org/wordprocessingml/2006/main" xmlns:w14="http://schemas.microsoft.com/office/word/2010/wordml" xmlns:w15="http://schemas.microsoft.com/office/word/2012/wordml" xmlns:w16cex="http://schemas.microsoft.com/office/word/2018/wordml/cex" xmlns:w16cid="http://schemas.microsoft.com/office/word/2016/wordml/cid" xmlns:w16="http://schemas.microsoft.com/office/word/2018/wordml" xmlns:w16sdtdh="http://schemas.microsoft.com/office/word/2020/wordml/sdtdatahash" xmlns:w16sdtfl="http://schemas.microsoft.com/office/word/2024/wordml/sdtformatlock" xmlns:w16se="http://schemas.microsoft.com/office/word/2015/wordml/symex" xmlns:w16du="http://schemas.microsoft.com/office/word/2023/wordml/word16du" xmlns:wne="http://schemas.microsoft.com/office/word/2006/wordml" mc:Ignorable="w14 w15 w16se w16cid w16 w16cex w16sdtdh w16sdtfl w16du wp14">
   <w:abstractNum w:abstractNumId="0" w15:restartNumberingAfterBreak="0">
+    <w:nsid w:val="0E6E4549"/>
+    <w:multiLevelType w:val="hybridMultilevel"/>
+    <w:tmpl w:val="E2E64F7C"/>
+    <w:lvl w:ilvl="0" w:tplc="CBAAC2D4">
+      <w:start w:val="1"/>
+      <w:numFmt w:val="decimal"/>
+      <w:lvlText w:val="(%1)"/>
+      <w:lvlJc w:val="left"/>
+      <w:pPr>
+        <w:ind w:left="680" w:hanging="360"/>
+      </w:pPr>
+      <w:rPr>
+        <w:rFonts w:hint="default"/>
+      </w:rPr>
+    </w:lvl>
+    <w:lvl w:ilvl="1" w:tplc="04090019" w:tentative="1">
+      <w:start w:val="1"/>
+      <w:numFmt w:val="lowerLetter"/>
+      <w:lvlText w:val="%2."/>
+      <w:lvlJc w:val="left"/>
+      <w:pPr>
+        <w:ind w:left="1400" w:hanging="360"/>
+      </w:pPr>
+    </w:lvl>
+    <w:lvl w:ilvl="2" w:tplc="0409001B" w:tentative="1">
+      <w:start w:val="1"/>
+      <w:numFmt w:val="lowerRoman"/>
+      <w:lvlText w:val="%3."/>
+      <w:lvlJc w:val="right"/>
+      <w:pPr>
+        <w:ind w:left="2120" w:hanging="180"/>
+      </w:pPr>
+    </w:lvl>
+    <w:lvl w:ilvl="3" w:tplc="0409000F" w:tentative="1">
+      <w:start w:val="1"/>
+      <w:numFmt w:val="decimal"/>
+      <w:lvlText w:val="%4."/>
+      <w:lvlJc w:val="left"/>
+      <w:pPr>
+        <w:ind w:left="2840" w:hanging="360"/>
+      </w:pPr>
+    </w:lvl>
+    <w:lvl w:ilvl="4" w:tplc="04090019" w:tentative="1">
+      <w:start w:val="1"/>
+      <w:numFmt w:val="lowerLetter"/>
+      <w:lvlText w:val="%5."/>
+      <w:lvlJc w:val="left"/>
+      <w:pPr>
+        <w:ind w:left="3560" w:hanging="360"/>
+      </w:pPr>
+    </w:lvl>
+    <w:lvl w:ilvl="5" w:tplc="0409001B" w:tentative="1">
+      <w:start w:val="1"/>
+      <w:numFmt w:val="lowerRoman"/>
+      <w:lvlText w:val="%6."/>
+      <w:lvlJc w:val="right"/>
+      <w:pPr>
+        <w:ind w:left="4280" w:hanging="180"/>
+      </w:pPr>
+    </w:lvl>
+    <w:lvl w:ilvl="6" w:tplc="0409000F" w:tentative="1">
+      <w:start w:val="1"/>
+      <w:numFmt w:val="decimal"/>
+      <w:lvlText w:val="%7."/>
+      <w:lvlJc w:val="left"/>
+      <w:pPr>
+        <w:ind w:left="5000" w:hanging="360"/>
+      </w:pPr>
+    </w:lvl>
+    <w:lvl w:ilvl="7" w:tplc="04090019" w:tentative="1">
+      <w:start w:val="1"/>
+      <w:numFmt w:val="lowerLetter"/>
+      <w:lvlText w:val="%8."/>
+      <w:lvlJc w:val="left"/>
+      <w:pPr>
+        <w:ind w:left="5720" w:hanging="360"/>
+      </w:pPr>
+    </w:lvl>
+    <w:lvl w:ilvl="8" w:tplc="0409001B" w:tentative="1">
+      <w:start w:val="1"/>
+      <w:numFmt w:val="lowerRoman"/>
+      <w:lvlText w:val="%9."/>
+      <w:lvlJc w:val="right"/>
+      <w:pPr>
+        <w:ind w:left="6440" w:hanging="180"/>
+      </w:pPr>
+    </w:lvl>
+  </w:abstractNum>
+  <w:abstractNum w:abstractNumId="1" w15:restartNumberingAfterBreak="0">
     <w:nsid w:val="203F3BAF"/>
     <w:multiLevelType w:val="hybridMultilevel"/>
     <w:tmpl w:val="8A1491EA"/>
@@ -5529,7 +5953,7 @@
       </w:pPr>
     </w:lvl>
   </w:abstractNum>
-  <w:abstractNum w:abstractNumId="1" w15:restartNumberingAfterBreak="0">
+  <w:abstractNum w:abstractNumId="2" w15:restartNumberingAfterBreak="0">
     <w:nsid w:val="3CBB1FB0"/>
     <w:multiLevelType w:val="hybridMultilevel"/>
     <w:tmpl w:val="165899D6"/>
@@ -5619,7 +6043,7 @@
       </w:pPr>
     </w:lvl>
   </w:abstractNum>
-  <w:abstractNum w:abstractNumId="2" w15:restartNumberingAfterBreak="0">
+  <w:abstractNum w:abstractNumId="3" w15:restartNumberingAfterBreak="0">
     <w:nsid w:val="3CD1689B"/>
     <w:multiLevelType w:val="hybridMultilevel"/>
     <w:tmpl w:val="56463592"/>
@@ -5708,7 +6132,7 @@
       </w:pPr>
     </w:lvl>
   </w:abstractNum>
-  <w:abstractNum w:abstractNumId="3" w15:restartNumberingAfterBreak="0">
+  <w:abstractNum w:abstractNumId="4" w15:restartNumberingAfterBreak="0">
     <w:nsid w:val="421F71C3"/>
     <w:multiLevelType w:val="hybridMultilevel"/>
     <w:tmpl w:val="45B0DC04"/>
@@ -5797,7 +6221,7 @@
       </w:pPr>
     </w:lvl>
   </w:abstractNum>
-  <w:abstractNum w:abstractNumId="4" w15:restartNumberingAfterBreak="0">
+  <w:abstractNum w:abstractNumId="5" w15:restartNumberingAfterBreak="0">
     <w:nsid w:val="52C461F9"/>
     <w:multiLevelType w:val="hybridMultilevel"/>
     <w:tmpl w:val="0D7481E8"/>
@@ -5886,7 +6310,96 @@
       </w:pPr>
     </w:lvl>
   </w:abstractNum>
-  <w:abstractNum w:abstractNumId="5" w15:restartNumberingAfterBreak="0">
+  <w:abstractNum w:abstractNumId="6" w15:restartNumberingAfterBreak="0">
+    <w:nsid w:val="59C100E7"/>
+    <w:multiLevelType w:val="hybridMultilevel"/>
+    <w:tmpl w:val="A92EDAA4"/>
+    <w:lvl w:ilvl="0" w:tplc="0CC2AF1E">
+      <w:start w:val="1"/>
+      <w:numFmt w:val="decimal"/>
+      <w:lvlText w:val="（%1）"/>
+      <w:lvlJc w:val="left"/>
+      <w:pPr>
+        <w:ind w:left="1080" w:hanging="720"/>
+      </w:pPr>
+      <w:rPr>
+        <w:rFonts w:hint="default"/>
+      </w:rPr>
+    </w:lvl>
+    <w:lvl w:ilvl="1" w:tplc="04090019" w:tentative="1">
+      <w:start w:val="1"/>
+      <w:numFmt w:val="lowerLetter"/>
+      <w:lvlText w:val="%2."/>
+      <w:lvlJc w:val="left"/>
+      <w:pPr>
+        <w:ind w:left="1440" w:hanging="360"/>
+      </w:pPr>
+    </w:lvl>
+    <w:lvl w:ilvl="2" w:tplc="0409001B" w:tentative="1">
+      <w:start w:val="1"/>
+      <w:numFmt w:val="lowerRoman"/>
+      <w:lvlText w:val="%3."/>
+      <w:lvlJc w:val="right"/>
+      <w:pPr>
+        <w:ind w:left="2160" w:hanging="180"/>
+      </w:pPr>
+    </w:lvl>
+    <w:lvl w:ilvl="3" w:tplc="0409000F" w:tentative="1">
+      <w:start w:val="1"/>
+      <w:numFmt w:val="decimal"/>
+      <w:lvlText w:val="%4."/>
+      <w:lvlJc w:val="left"/>
+      <w:pPr>
+        <w:ind w:left="2880" w:hanging="360"/>
+      </w:pPr>
+    </w:lvl>
+    <w:lvl w:ilvl="4" w:tplc="04090019" w:tentative="1">
+      <w:start w:val="1"/>
+      <w:numFmt w:val="lowerLetter"/>
+      <w:lvlText w:val="%5."/>
+      <w:lvlJc w:val="left"/>
+      <w:pPr>
+        <w:ind w:left="3600" w:hanging="360"/>
+      </w:pPr>
+    </w:lvl>
+    <w:lvl w:ilvl="5" w:tplc="0409001B" w:tentative="1">
+      <w:start w:val="1"/>
+      <w:numFmt w:val="lowerRoman"/>
+      <w:lvlText w:val="%6."/>
+      <w:lvlJc w:val="right"/>
+      <w:pPr>
+        <w:ind w:left="4320" w:hanging="180"/>
+      </w:pPr>
+    </w:lvl>
+    <w:lvl w:ilvl="6" w:tplc="0409000F" w:tentative="1">
+      <w:start w:val="1"/>
+      <w:numFmt w:val="decimal"/>
+      <w:lvlText w:val="%7."/>
+      <w:lvlJc w:val="left"/>
+      <w:pPr>
+        <w:ind w:left="5040" w:hanging="360"/>
+      </w:pPr>
+    </w:lvl>
+    <w:lvl w:ilvl="7" w:tplc="04090019" w:tentative="1">
+      <w:start w:val="1"/>
+      <w:numFmt w:val="lowerLetter"/>
+      <w:lvlText w:val="%8."/>
+      <w:lvlJc w:val="left"/>
+      <w:pPr>
+        <w:ind w:left="5760" w:hanging="360"/>
+      </w:pPr>
+    </w:lvl>
+    <w:lvl w:ilvl="8" w:tplc="0409001B" w:tentative="1">
+      <w:start w:val="1"/>
+      <w:numFmt w:val="lowerRoman"/>
+      <w:lvlText w:val="%9."/>
+      <w:lvlJc w:val="right"/>
+      <w:pPr>
+        <w:ind w:left="6480" w:hanging="180"/>
+      </w:pPr>
+    </w:lvl>
+  </w:abstractNum>
+  <w:abstractNum w:abstractNumId="7" w15:restartNumberingAfterBreak="0">
     <w:nsid w:val="73497A13"/>
     <w:multiLevelType w:val="hybridMultilevel"/>
     <w:tmpl w:val="4CD86FB6"/>
@@ -5975,7 +6488,7 @@
       </w:pPr>
     </w:lvl>
   </w:abstractNum>
-  <w:abstractNum w:abstractNumId="6" w15:restartNumberingAfterBreak="0">
+  <w:abstractNum w:abstractNumId="8" w15:restartNumberingAfterBreak="0">
     <w:nsid w:val="7E055483"/>
     <w:multiLevelType w:val="hybridMultilevel"/>
     <w:tmpl w:val="B3229DB8"/>
@@ -6065,25 +6578,31 @@
     </w:lvl>
   </w:abstractNum>
   <w:num w:numId="1" w16cid:durableId="206189966">
+    <w:abstractNumId w:val="5"/>
+  </w:num>
+  <w:num w:numId="2" w16cid:durableId="1237786314">
+    <w:abstractNumId w:val="1"/>
+  </w:num>
+  <w:num w:numId="3" w16cid:durableId="31077529">
     <w:abstractNumId w:val="4"/>
   </w:num>
-  <w:num w:numId="2" w16cid:durableId="1237786314">
+  <w:num w:numId="4" w16cid:durableId="494956119">
+    <w:abstractNumId w:val="3"/>
+  </w:num>
+  <w:num w:numId="5" w16cid:durableId="931207271">
+    <w:abstractNumId w:val="8"/>
+  </w:num>
+  <w:num w:numId="6" w16cid:durableId="1851066940">
+    <w:abstractNumId w:val="2"/>
+  </w:num>
+  <w:num w:numId="7" w16cid:durableId="1413353839">
+    <w:abstractNumId w:val="7"/>
+  </w:num>
+  <w:num w:numId="8" w16cid:durableId="391971975">
     <w:abstractNumId w:val="0"/>
   </w:num>
-  <w:num w:numId="3" w16cid:durableId="31077529">
-    <w:abstractNumId w:val="3"/>
-  </w:num>
-  <w:num w:numId="4" w16cid:durableId="494956119">
-    <w:abstractNumId w:val="2"/>
-  </w:num>
-  <w:num w:numId="5" w16cid:durableId="931207271">
+  <w:num w:numId="9" w16cid:durableId="1827936080">
     <w:abstractNumId w:val="6"/>
-  </w:num>
-  <w:num w:numId="6" w16cid:durableId="1851066940">
-    <w:abstractNumId w:val="1"/>
-  </w:num>
-  <w:num w:numId="7" w16cid:durableId="1413353839">
-    <w:abstractNumId w:val="5"/>
   </w:num>
 </w:numbering>
 </file>
@@ -7074,7 +7593,6 @@
     <w:name w:val="Normal (Web)"/>
     <w:basedOn w:val="Normal"/>
     <w:uiPriority w:val="99"/>
-    <w:semiHidden/>
     <w:unhideWhenUsed/>
     <w:rsid w:val="0068495E"/>
     <w:pPr>

</xml_diff>